<commit_message>
GitHub release prep: data/ and src/ audit (Parts D-F)
- data/: 14 dataset folders sorted into public citation READMEs,
  internal notes preserved separately, raw data gitignored throughout
- src/: load-bearing allowlist built from the paper's own citations,
  verified via MATLAB dependency scan, applied to .gitignore
- docs/, tool/, JenDiversion/, results/, figures/ excluded (internal
  notes, separate repo, private correspondence, concluded side-work
  outputs, regeneratable outputs respectively)
- Root-level internal planning docs (CLAUDE.md etc.) added to the
  existing exclusion list
- baselineShp6_*.mat restored (confirmed needed, not disposable)
- Full remote-diff audit confirms nothing lost by treating local as
  canonical -- see docs/TODO_GitHubReleasePrep_v002.md Part F
</commit_message>
<xml_diff>
--- a/prereg_v101.docx
+++ b/prereg_v101.docx
@@ -1,6 +1,6 @@
 
 <file path=word/document.xml><?xml version="1.0" encoding="utf-8"?>
-<w:document xmlns:wpc="http://schemas.microsoft.com/office/word/2010/wordprocessingCanvas" xmlns:cx="http://schemas.microsoft.com/office/drawing/2014/chartex" xmlns:cx1="http://schemas.microsoft.com/office/drawing/2015/9/8/chartex" xmlns:cx2="http://schemas.microsoft.com/office/drawing/2015/10/21/chartex" xmlns:cx3="http://schemas.microsoft.com/office/drawing/2016/5/9/chartex" xmlns:cx4="http://schemas.microsoft.com/office/drawing/2016/5/10/chartex" xmlns:cx5="http://schemas.microsoft.com/office/drawing/2016/5/11/chartex" xmlns:cx6="http://schemas.microsoft.com/office/drawing/2016/5/12/chartex" xmlns:cx7="http://schemas.microsoft.com/office/drawing/2016/5/13/chartex" xmlns:cx8="http://schemas.microsoft.com/office/drawing/2016/5/14/chartex" xmlns:mc="http://schemas.openxmlformats.org/markup-compatibility/2006" xmlns:aink="http://schemas.microsoft.com/office/drawing/2016/ink" xmlns:am3d="http://schemas.microsoft.com/office/drawing/2017/model3d" xmlns:o="urn:schemas-microsoft-com:office:office" xmlns:oel="http://schemas.microsoft.com/office/2019/extlst" xmlns:r="http://schemas.openxmlformats.org/officeDocument/2006/relationships" xmlns:m="http://schemas.openxmlformats.org/officeDocument/2006/math" xmlns:v="urn:schemas-microsoft-com:vml" xmlns:wp14="http://schemas.microsoft.com/office/word/2010/wordprocessingDrawing" xmlns:wp="http://schemas.openxmlformats.org/drawingml/2006/wordprocessingDrawing" xmlns:w10="urn:schemas-microsoft-com:office:word" xmlns:w="http://schemas.openxmlformats.org/wordprocessingml/2006/main" xmlns:w14="http://schemas.microsoft.com/office/word/2010/wordml" xmlns:w15="http://schemas.microsoft.com/office/word/2012/wordml" xmlns:w16cex="http://schemas.microsoft.com/office/word/2018/wordml/cex" xmlns:w16cid="http://schemas.microsoft.com/office/word/2016/wordml/cid" xmlns:w16="http://schemas.microsoft.com/office/word/2018/wordml" xmlns:w16du="http://schemas.microsoft.com/office/word/2023/wordml/word16du" xmlns:w16sdtdh="http://schemas.microsoft.com/office/word/2020/wordml/sdtdatahash" xmlns:w16se="http://schemas.microsoft.com/office/word/2015/wordml/symex" xmlns:wpg="http://schemas.microsoft.com/office/word/2010/wordprocessingGroup" xmlns:wpi="http://schemas.microsoft.com/office/word/2010/wordprocessingInk" xmlns:wne="http://schemas.microsoft.com/office/word/2006/wordml" xmlns:wps="http://schemas.microsoft.com/office/word/2010/wordprocessingShape" mc:Ignorable="w14 w15 w16se w16cid w16 w16cex w16sdtdh w16du wp14">
+<w:document xmlns:wpc="http://schemas.microsoft.com/office/word/2010/wordprocessingCanvas" xmlns:cx="http://schemas.microsoft.com/office/drawing/2014/chartex" xmlns:cx1="http://schemas.microsoft.com/office/drawing/2015/9/8/chartex" xmlns:cx2="http://schemas.microsoft.com/office/drawing/2015/10/21/chartex" xmlns:cx3="http://schemas.microsoft.com/office/drawing/2016/5/9/chartex" xmlns:cx4="http://schemas.microsoft.com/office/drawing/2016/5/10/chartex" xmlns:cx5="http://schemas.microsoft.com/office/drawing/2016/5/11/chartex" xmlns:cx6="http://schemas.microsoft.com/office/drawing/2016/5/12/chartex" xmlns:cx7="http://schemas.microsoft.com/office/drawing/2016/5/13/chartex" xmlns:cx8="http://schemas.microsoft.com/office/drawing/2016/5/14/chartex" xmlns:mc="http://schemas.openxmlformats.org/markup-compatibility/2006" xmlns:aink="http://schemas.microsoft.com/office/drawing/2016/ink" xmlns:am3d="http://schemas.microsoft.com/office/drawing/2017/model3d" xmlns:o="urn:schemas-microsoft-com:office:office" xmlns:oel="http://schemas.microsoft.com/office/2019/extlst" xmlns:r="http://schemas.openxmlformats.org/officeDocument/2006/relationships" xmlns:m="http://schemas.openxmlformats.org/officeDocument/2006/math" xmlns:v="urn:schemas-microsoft-com:vml" xmlns:wp14="http://schemas.microsoft.com/office/word/2010/wordprocessingDrawing" xmlns:wp="http://schemas.openxmlformats.org/drawingml/2006/wordprocessingDrawing" xmlns:w10="urn:schemas-microsoft-com:office:word" xmlns:w="http://schemas.openxmlformats.org/wordprocessingml/2006/main" xmlns:w14="http://schemas.microsoft.com/office/word/2010/wordml" xmlns:w15="http://schemas.microsoft.com/office/word/2012/wordml" xmlns:w16cex="http://schemas.microsoft.com/office/word/2018/wordml/cex" xmlns:w16cid="http://schemas.microsoft.com/office/word/2016/wordml/cid" xmlns:w16="http://schemas.microsoft.com/office/word/2018/wordml" xmlns:w16du="http://schemas.microsoft.com/office/word/2023/wordml/word16du" xmlns:w16sdtdh="http://schemas.microsoft.com/office/word/2020/wordml/sdtdatahash" xmlns:w16sdtfl="http://schemas.microsoft.com/office/word/2024/wordml/sdtformatlock" xmlns:w16se="http://schemas.microsoft.com/office/word/2015/wordml/symex" xmlns:wpg="http://schemas.microsoft.com/office/word/2010/wordprocessingGroup" xmlns:wpi="http://schemas.microsoft.com/office/word/2010/wordprocessingInk" xmlns:wne="http://schemas.microsoft.com/office/word/2006/wordml" xmlns:wps="http://schemas.microsoft.com/office/word/2010/wordprocessingShape" mc:Ignorable="w14 w15 w16se w16cid w16 w16cex w16sdtdh w16sdtfl w16du wp14">
   <w:background w:color="FFFFFF"/>
   <w:body>
     <w:p>
@@ -214,7 +214,26 @@
           <w:sz w:val="21"/>
           <w:szCs w:val="21"/>
         </w:rPr>
-        <w:t xml:space="preserve"> https://edata.bham.ac.uk </w:t>
+        <w:t xml:space="preserve"> </w:t>
+      </w:r>
+      <w:hyperlink r:id="rId10" w:history="1">
+        <w:r>
+          <w:rPr>
+            <w:rStyle w:val="Hyperlink"/>
+            <w:rFonts w:ascii="Helvetica" w:hAnsi="Helvetica" w:cs="Helvetica"/>
+            <w:sz w:val="21"/>
+            <w:szCs w:val="21"/>
+          </w:rPr>
+          <w:t>https://edata.bham.ac.uk</w:t>
+        </w:r>
+      </w:hyperlink>
+      <w:r>
+        <w:rPr>
+          <w:rFonts w:ascii="Helvetica" w:hAnsi="Helvetica" w:cs="Helvetica"/>
+          <w:sz w:val="21"/>
+          <w:szCs w:val="21"/>
+        </w:rPr>
+        <w:t xml:space="preserve"> </w:t>
       </w:r>
     </w:p>
     <w:p>
@@ -330,25 +349,7 @@
           <w:sz w:val="21"/>
           <w:szCs w:val="21"/>
         </w:rPr>
-        <w:t xml:space="preserve"> ≈ 1/3), is a </w:t>
-      </w:r>
-      <w:proofErr w:type="gramStart"/>
-      <w:r>
-        <w:rPr>
-          <w:rFonts w:ascii="Helvetica" w:hAnsi="Helvetica" w:cs="Helvetica"/>
-          <w:sz w:val="21"/>
-          <w:szCs w:val="21"/>
-        </w:rPr>
-        <w:t>purported kinematic</w:t>
-      </w:r>
-      <w:proofErr w:type="gramEnd"/>
-      <w:r>
-        <w:rPr>
-          <w:rFonts w:ascii="Helvetica" w:hAnsi="Helvetica" w:cs="Helvetica"/>
-          <w:sz w:val="21"/>
-          <w:szCs w:val="21"/>
-        </w:rPr>
-        <w:t xml:space="preserve"> invariance that may encode a fundamental principle governing biological movement. Fraser et al. (2025) demonstrated that conventional analytical protocols systematically bias </w:t>
+        <w:t xml:space="preserve"> ≈ 1/3), is a purported kinematic invariance that may encode a fundamental principle governing biological movement. Fraser et al. (2025) demonstrated that conventional analytical protocols systematically bias </w:t>
       </w:r>
       <w:r>
         <w:rPr>
@@ -504,61 +505,7 @@
           <w:sz w:val="21"/>
           <w:szCs w:val="21"/>
         </w:rPr>
-        <w:t xml:space="preserve">This characterisation framework </w:t>
-      </w:r>
-      <w:proofErr w:type="gramStart"/>
-      <w:r>
-        <w:rPr>
-          <w:rFonts w:ascii="Helvetica" w:hAnsi="Helvetica" w:cs="Helvetica"/>
-          <w:sz w:val="21"/>
-          <w:szCs w:val="21"/>
-        </w:rPr>
-        <w:t>is then empirically validated</w:t>
-      </w:r>
-      <w:proofErr w:type="gramEnd"/>
-      <w:r>
-        <w:rPr>
-          <w:rFonts w:ascii="Helvetica" w:hAnsi="Helvetica" w:cs="Helvetica"/>
-          <w:sz w:val="21"/>
-          <w:szCs w:val="21"/>
-        </w:rPr>
-        <w:t xml:space="preserve"> across diverse movement databases, spanning clinical populations, developmental trajectories, and species. By first characterising noise profiles in each database, and mapping them to simulation space, we generate predictions about the six pipelines' performance that can be </w:t>
-      </w:r>
-      <w:proofErr w:type="gramStart"/>
-      <w:r>
-        <w:rPr>
-          <w:rFonts w:ascii="Helvetica" w:hAnsi="Helvetica" w:cs="Helvetica"/>
-          <w:sz w:val="21"/>
-          <w:szCs w:val="21"/>
-        </w:rPr>
-        <w:t>tested</w:t>
-      </w:r>
-      <w:proofErr w:type="gramEnd"/>
-      <w:r>
-        <w:rPr>
-          <w:rFonts w:ascii="Helvetica" w:hAnsi="Helvetica" w:cs="Helvetica"/>
-          <w:sz w:val="21"/>
-          <w:szCs w:val="21"/>
-        </w:rPr>
-        <w:t xml:space="preserve"> against empirical observations. Framework validation occurs when predicted protocol performance matches empirically observed results, confirming that simulation-based characterisation accurately forecasts real-world protocol behaviour. Thereafter, choices of protocol for ensuing empirical studies may also </w:t>
-      </w:r>
-      <w:proofErr w:type="gramStart"/>
-      <w:r>
-        <w:rPr>
-          <w:rFonts w:ascii="Helvetica" w:hAnsi="Helvetica" w:cs="Helvetica"/>
-          <w:sz w:val="21"/>
-          <w:szCs w:val="21"/>
-        </w:rPr>
-        <w:t>be validated</w:t>
-      </w:r>
-      <w:proofErr w:type="gramEnd"/>
-      <w:r>
-        <w:rPr>
-          <w:rFonts w:ascii="Helvetica" w:hAnsi="Helvetica" w:cs="Helvetica"/>
-          <w:sz w:val="21"/>
-          <w:szCs w:val="21"/>
-        </w:rPr>
-        <w:t>.</w:t>
+        <w:t>This characterisation framework is then empirically validated across diverse movement databases, spanning clinical populations, developmental trajectories, and species. By first characterising noise profiles in each database, and mapping them to simulation space, we generate predictions about the six pipelines' performance that can be tested against empirical observations. Framework validation occurs when predicted protocol performance matches empirically observed results, confirming that simulation-based characterisation accurately forecasts real-world protocol behaviour. Thereafter, choices of protocol for ensuing empirical studies may also be validated.</w:t>
       </w:r>
     </w:p>
     <w:p>
@@ -745,25 +692,7 @@
           <w:sz w:val="21"/>
           <w:szCs w:val="21"/>
         </w:rPr>
-        <w:t xml:space="preserve"> (beta) approximates </w:t>
-      </w:r>
-      <w:proofErr w:type="gramStart"/>
-      <w:r>
-        <w:rPr>
-          <w:rFonts w:ascii="Helvetica" w:hAnsi="Helvetica" w:cs="Helvetica"/>
-          <w:sz w:val="21"/>
-          <w:szCs w:val="21"/>
-        </w:rPr>
-        <w:t>1/3</w:t>
-      </w:r>
-      <w:proofErr w:type="gramEnd"/>
-      <w:r>
-        <w:rPr>
-          <w:rFonts w:ascii="Helvetica" w:hAnsi="Helvetica" w:cs="Helvetica"/>
-          <w:sz w:val="21"/>
-          <w:szCs w:val="21"/>
-        </w:rPr>
-        <w:t>. This 'one-third power law' emerges across diverse motor behaviours - from eye saccades to drawing movements to bodily trajectories, and across species, suggesting a fundamental computational principle underlying motor control (Flash, 2021).</w:t>
+        <w:t xml:space="preserve"> (beta) approximates 1/3. This 'one-third power law' emerges across diverse motor behaviours - from eye saccades to drawing movements to bodily trajectories, and across species, suggesting a fundamental computational principle underlying motor control (Flash, 2021).</w:t>
       </w:r>
     </w:p>
     <w:p>
@@ -904,25 +833,7 @@
           <w:sz w:val="21"/>
           <w:szCs w:val="21"/>
         </w:rPr>
-        <w:t xml:space="preserve">) amplifies high-frequency noise. Since velocity and acceleration </w:t>
-      </w:r>
-      <w:proofErr w:type="gramStart"/>
-      <w:r>
-        <w:rPr>
-          <w:rFonts w:ascii="Helvetica" w:hAnsi="Helvetica" w:cs="Helvetica"/>
-          <w:sz w:val="21"/>
-          <w:szCs w:val="21"/>
-        </w:rPr>
-        <w:t>are needed</w:t>
-      </w:r>
-      <w:proofErr w:type="gramEnd"/>
-      <w:r>
-        <w:rPr>
-          <w:rFonts w:ascii="Helvetica" w:hAnsi="Helvetica" w:cs="Helvetica"/>
-          <w:sz w:val="21"/>
-          <w:szCs w:val="21"/>
-        </w:rPr>
-        <w:t xml:space="preserve"> to calculate curvature, two steps of differentiation are needed from position in any power law calculation. Maoz et al., (2005) noted noise creates artificial power law conformity of approximately one-third</w:t>
+        <w:t>) amplifies high-frequency noise. Since velocity and acceleration are needed to calculate curvature, two steps of differentiation are needed from position in any power law calculation. Maoz et al., (2005) noted noise creates artificial power law conformity of approximately one-third</w:t>
       </w:r>
     </w:p>
     <w:p>
@@ -987,25 +898,7 @@
           <w:sz w:val="21"/>
           <w:szCs w:val="21"/>
         </w:rPr>
-        <w:t xml:space="preserve">), </w:t>
-      </w:r>
-      <w:proofErr w:type="gramStart"/>
-      <w:r>
-        <w:rPr>
-          <w:rFonts w:ascii="Helvetica" w:hAnsi="Helvetica" w:cs="Helvetica"/>
-          <w:sz w:val="21"/>
-          <w:szCs w:val="21"/>
-        </w:rPr>
-        <w:t>ostensibly employed</w:t>
-      </w:r>
-      <w:proofErr w:type="gramEnd"/>
-      <w:r>
-        <w:rPr>
-          <w:rFonts w:ascii="Helvetica" w:hAnsi="Helvetica" w:cs="Helvetica"/>
-          <w:sz w:val="21"/>
-          <w:szCs w:val="21"/>
-        </w:rPr>
-        <w:t xml:space="preserve"> to address noise (either before or after differentiation), also alter the underlying signal's characteristics, which Schaal and Sternad (2001) noted tended to spurious one-third results</w:t>
+        <w:t>), ostensibly employed to address noise (either before or after differentiation), also alter the underlying signal's characteristics, which Schaal and Sternad (2001) noted tended to spurious one-third results</w:t>
       </w:r>
     </w:p>
     <w:p>
@@ -1123,7 +1016,7 @@
           <w:sz w:val="21"/>
           <w:szCs w:val="21"/>
         </w:rPr>
-        <w:t xml:space="preserve"> ≈ 1/3. Alternative approaches using Savitzky-Golay smoothing differentiators and nonlinear regression avoided this spurious confirmation. However, these demonstrations occurred under with biologically </w:t>
+        <w:t xml:space="preserve"> ≈ 1/3. Alternative </w:t>
       </w:r>
       <w:r>
         <w:rPr>
@@ -1132,7 +1025,7 @@
           <w:szCs w:val="21"/>
         </w:rPr>
         <w:lastRenderedPageBreak/>
-        <w:t xml:space="preserve">implausible </w:t>
+        <w:t xml:space="preserve">approaches using Savitzky-Golay smoothing differentiators and nonlinear regression avoided this spurious confirmation. However, these demonstrations occurred under with biologically implausible </w:t>
       </w:r>
       <w:r>
         <w:rPr>
@@ -1149,25 +1042,7 @@
           <w:sz w:val="21"/>
           <w:szCs w:val="21"/>
         </w:rPr>
-        <w:t xml:space="preserve"> = 0, admixed with white noise. For a protocol to be adequate it is not enough to merely avoid spurious </w:t>
-      </w:r>
-      <w:proofErr w:type="gramStart"/>
-      <w:r>
-        <w:rPr>
-          <w:rFonts w:ascii="Helvetica" w:hAnsi="Helvetica" w:cs="Helvetica"/>
-          <w:sz w:val="21"/>
-          <w:szCs w:val="21"/>
-        </w:rPr>
-        <w:t>1/3</w:t>
-      </w:r>
-      <w:proofErr w:type="gramEnd"/>
-      <w:r>
-        <w:rPr>
-          <w:rFonts w:ascii="Helvetica" w:hAnsi="Helvetica" w:cs="Helvetica"/>
-          <w:sz w:val="21"/>
-          <w:szCs w:val="21"/>
-        </w:rPr>
-        <w:t xml:space="preserve"> compliance under narrow test conditions, it must faithfully approximate the underlying generator </w:t>
+        <w:t xml:space="preserve"> = 0, admixed with white noise. For a protocol to be adequate it is not enough to merely avoid spurious 1/3 compliance under narrow test conditions, it must faithfully approximate the underlying generator </w:t>
       </w:r>
       <w:r>
         <w:rPr>
@@ -1201,25 +1076,7 @@
           <w:sz w:val="21"/>
           <w:szCs w:val="21"/>
         </w:rPr>
-        <w:t xml:space="preserve"> values and noise conditions </w:t>
-      </w:r>
-      <w:proofErr w:type="gramStart"/>
-      <w:r>
-        <w:rPr>
-          <w:rFonts w:ascii="Helvetica" w:hAnsi="Helvetica" w:cs="Helvetica"/>
-          <w:sz w:val="21"/>
-          <w:szCs w:val="21"/>
-        </w:rPr>
-        <w:t>is required</w:t>
-      </w:r>
-      <w:proofErr w:type="gramEnd"/>
-      <w:r>
-        <w:rPr>
-          <w:rFonts w:ascii="Helvetica" w:hAnsi="Helvetica" w:cs="Helvetica"/>
-          <w:sz w:val="21"/>
-          <w:szCs w:val="21"/>
-        </w:rPr>
-        <w:t xml:space="preserve"> to determine where approaches perform adequately i.e., where the calculated </w:t>
+        <w:t xml:space="preserve"> values and noise conditions is required to determine where approaches perform adequately i.e., where the calculated </w:t>
       </w:r>
       <w:r>
         <w:rPr>
@@ -1285,25 +1142,7 @@
           <w:sz w:val="21"/>
           <w:szCs w:val="21"/>
         </w:rPr>
-        <w:t xml:space="preserve">Recent research has added urgency to characterising analytical precision. Cook et al. (2026) and Fourie et al. (2024) independently documented that autistic individuals demonstrate subtle but consistent divergences from </w:t>
-      </w:r>
-      <w:proofErr w:type="gramStart"/>
-      <w:r>
-        <w:rPr>
-          <w:rFonts w:ascii="Helvetica" w:hAnsi="Helvetica" w:cs="Helvetica"/>
-          <w:sz w:val="21"/>
-          <w:szCs w:val="21"/>
-        </w:rPr>
-        <w:t>canonical</w:t>
-      </w:r>
-      <w:proofErr w:type="gramEnd"/>
-      <w:r>
-        <w:rPr>
-          <w:rFonts w:ascii="Helvetica" w:hAnsi="Helvetica" w:cs="Helvetica"/>
-          <w:sz w:val="21"/>
-          <w:szCs w:val="21"/>
-        </w:rPr>
-        <w:t xml:space="preserve"> power law values:</w:t>
+        <w:t>Recent research has added urgency to characterising analytical precision. Cook et al. (2026) and Fourie et al. (2024) independently documented that autistic individuals demonstrate subtle but consistent divergences from canonical power law values:</w:t>
       </w:r>
     </w:p>
     <w:p>
@@ -1520,43 +1359,7 @@
           <w:sz w:val="21"/>
           <w:szCs w:val="21"/>
         </w:rPr>
-        <w:t xml:space="preserve"> exponent can </w:t>
-      </w:r>
-      <w:proofErr w:type="gramStart"/>
-      <w:r>
-        <w:rPr>
-          <w:rFonts w:ascii="Helvetica" w:hAnsi="Helvetica" w:cs="Helvetica"/>
-          <w:sz w:val="21"/>
-          <w:szCs w:val="21"/>
-        </w:rPr>
-        <w:t>purportedly be</w:t>
-      </w:r>
-      <w:proofErr w:type="gramEnd"/>
-      <w:r>
-        <w:rPr>
-          <w:rFonts w:ascii="Helvetica" w:hAnsi="Helvetica" w:cs="Helvetica"/>
-          <w:sz w:val="21"/>
-          <w:szCs w:val="21"/>
-        </w:rPr>
-        <w:t xml:space="preserve"> extracted from any curved movement, regardless of scale (Huh &amp; Sejnowski, 2015). These divergences therefore offer potential non-invasive kinematic markers for neurodevelopmental conditions. However, detecting such subtle effects demands analytical precision. To define the required precision, we employ the Minimal Detectable Change (MDC) framework, where the Standard Error of Measurement (SEM) must be </w:t>
-      </w:r>
-      <w:proofErr w:type="gramStart"/>
-      <w:r>
-        <w:rPr>
-          <w:rFonts w:ascii="Helvetica" w:hAnsi="Helvetica" w:cs="Helvetica"/>
-          <w:sz w:val="21"/>
-          <w:szCs w:val="21"/>
-        </w:rPr>
-        <w:t>substantially smaller</w:t>
-      </w:r>
-      <w:proofErr w:type="gramEnd"/>
-      <w:r>
-        <w:rPr>
-          <w:rFonts w:ascii="Helvetica" w:hAnsi="Helvetica" w:cs="Helvetica"/>
-          <w:sz w:val="21"/>
-          <w:szCs w:val="21"/>
-        </w:rPr>
-        <w:t xml:space="preserve"> than the effect to be detected (Haley &amp; Fragala-Pinkham, 2006; Beckerman et al., 2001).</w:t>
+        <w:t xml:space="preserve"> exponent can purportedly be extracted from any curved movement, regardless of scale (Huh &amp; Sejnowski, 2015). These divergences therefore offer potential non-invasive kinematic markers for neurodevelopmental conditions. However, detecting such subtle effects demands analytical precision. To define the required precision, we employ the Minimal Detectable Change (MDC) framework, where the Standard Error of Measurement (SEM) must be substantially smaller than the effect to be detected (Haley &amp; Fragala-Pinkham, 2006; Beckerman et al., 2001).</w:t>
       </w:r>
     </w:p>
     <w:p>
@@ -1675,25 +1478,8 @@
           <w:sz w:val="21"/>
           <w:szCs w:val="21"/>
         </w:rPr>
-        <w:t xml:space="preserve">The power law links tangential velocity and curvature. Kinematic derivation methods transform sampled coordinates of drawing tasks into their derivatives. From position to velocity, to acceleration and in turn curvature, which can </w:t>
-      </w:r>
-      <w:proofErr w:type="gramStart"/>
-      <w:r>
-        <w:rPr>
-          <w:rFonts w:ascii="Helvetica" w:hAnsi="Helvetica" w:cs="Helvetica"/>
-          <w:sz w:val="21"/>
-          <w:szCs w:val="21"/>
-        </w:rPr>
-        <w:t>be calculated</w:t>
-      </w:r>
-      <w:proofErr w:type="gramEnd"/>
-      <w:r>
-        <w:rPr>
-          <w:rFonts w:ascii="Helvetica" w:hAnsi="Helvetica" w:cs="Helvetica"/>
-          <w:sz w:val="21"/>
-          <w:szCs w:val="21"/>
-        </w:rPr>
-        <w:t xml:space="preserve"> from velocity and acceleration. Inaccuracies here will undercut the ensuing regression stage.</w:t>
+        <w:lastRenderedPageBreak/>
+        <w:t>The power law links tangential velocity and curvature. Kinematic derivation methods transform sampled coordinates of drawing tasks into their derivatives. From position to velocity, to acceleration and in turn curvature, which can be calculated from velocity and acceleration. Inaccuracies here will undercut the ensuing regression stage.</w:t>
       </w:r>
     </w:p>
     <w:tbl>
@@ -1751,7 +1537,6 @@
                 <w:sz w:val="21"/>
                 <w:szCs w:val="21"/>
               </w:rPr>
-              <w:lastRenderedPageBreak/>
               <w:t>Code</w:t>
             </w:r>
           </w:p>
@@ -1942,23 +1727,13 @@
                 <w:szCs w:val="21"/>
               </w:rPr>
             </w:pPr>
-            <w:proofErr w:type="gramStart"/>
-            <w:r>
-              <w:rPr>
-                <w:rFonts w:ascii="Helvetica" w:eastAsia="Times New Roman" w:hAnsi="Helvetica" w:cs="Helvetica"/>
-                <w:sz w:val="21"/>
-                <w:szCs w:val="21"/>
-              </w:rPr>
-              <w:t>2nd</w:t>
-            </w:r>
-            <w:proofErr w:type="gramEnd"/>
-            <w:r>
-              <w:rPr>
-                <w:rFonts w:ascii="Helvetica" w:eastAsia="Times New Roman" w:hAnsi="Helvetica" w:cs="Helvetica"/>
-                <w:sz w:val="21"/>
-                <w:szCs w:val="21"/>
-              </w:rPr>
-              <w:t xml:space="preserve">-order low-pass filter (10 Hz cutoff) with zero-phase filtering (e.g. MATLAB's </w:t>
+            <w:r>
+              <w:rPr>
+                <w:rFonts w:ascii="Helvetica" w:eastAsia="Times New Roman" w:hAnsi="Helvetica" w:cs="Helvetica"/>
+                <w:sz w:val="21"/>
+                <w:szCs w:val="21"/>
+              </w:rPr>
+              <w:t xml:space="preserve">2nd-order low-pass filter (10 Hz cutoff) with zero-phase filtering (e.g. MATLAB's </w:t>
             </w:r>
             <w:r>
               <w:rPr>
@@ -2146,25 +1921,7 @@
           <w:sz w:val="21"/>
           <w:szCs w:val="21"/>
         </w:rPr>
-        <w:t xml:space="preserve">Kinematic variables </w:t>
-      </w:r>
-      <w:proofErr w:type="gramStart"/>
-      <w:r>
-        <w:rPr>
-          <w:rFonts w:ascii="Helvetica" w:hAnsi="Helvetica" w:cs="Helvetica"/>
-          <w:sz w:val="21"/>
-          <w:szCs w:val="21"/>
-        </w:rPr>
-        <w:t>are regressed</w:t>
-      </w:r>
-      <w:proofErr w:type="gramEnd"/>
-      <w:r>
-        <w:rPr>
-          <w:rFonts w:ascii="Helvetica" w:hAnsi="Helvetica" w:cs="Helvetica"/>
-          <w:sz w:val="21"/>
-          <w:szCs w:val="21"/>
-        </w:rPr>
-        <w:t xml:space="preserve"> in this stage. Power laws exhibit straight regression lines in the log projection, with a slope equal to the exponent of the relationship.</w:t>
+        <w:t>Kinematic variables are regressed in this stage. Power laws exhibit straight regression lines in the log projection, with a slope equal to the exponent of the relationship.</w:t>
       </w:r>
     </w:p>
     <w:tbl>
@@ -3409,6 +3166,7 @@
                 <w:sz w:val="21"/>
                 <w:szCs w:val="21"/>
               </w:rPr>
+              <w:lastRenderedPageBreak/>
               <w:t>BWFD-IRLS</w:t>
             </w:r>
           </w:p>
@@ -3803,7 +3561,6 @@
                 <w:sz w:val="21"/>
                 <w:szCs w:val="21"/>
               </w:rPr>
-              <w:lastRenderedPageBreak/>
               <w:t>SG-LMLS</w:t>
             </w:r>
           </w:p>
@@ -4473,25 +4230,7 @@
           <w:sz w:val="21"/>
           <w:szCs w:val="21"/>
         </w:rPr>
-        <w:t xml:space="preserve">, which pipeline achieves optimal performance? Do multiple pipelines exhibit equivalent performance in </w:t>
-      </w:r>
-      <w:proofErr w:type="gramStart"/>
-      <w:r>
-        <w:rPr>
-          <w:rFonts w:ascii="Helvetica" w:hAnsi="Helvetica" w:cs="Helvetica"/>
-          <w:sz w:val="21"/>
-          <w:szCs w:val="21"/>
-        </w:rPr>
-        <w:t>some</w:t>
-      </w:r>
-      <w:proofErr w:type="gramEnd"/>
-      <w:r>
-        <w:rPr>
-          <w:rFonts w:ascii="Helvetica" w:hAnsi="Helvetica" w:cs="Helvetica"/>
-          <w:sz w:val="21"/>
-          <w:szCs w:val="21"/>
-        </w:rPr>
-        <w:t xml:space="preserve"> regions?</w:t>
+        <w:t>, which pipeline achieves optimal performance? Do multiple pipelines exhibit equivalent performance in some regions?</w:t>
       </w:r>
     </w:p>
     <w:p>
@@ -4532,8 +4271,8 @@
         <w:tblLook w:val="04A0" w:firstRow="1" w:lastRow="0" w:firstColumn="1" w:lastColumn="0" w:noHBand="0" w:noVBand="1"/>
       </w:tblPr>
       <w:tblGrid>
-        <w:gridCol w:w="1204"/>
-        <w:gridCol w:w="7806"/>
+        <w:gridCol w:w="1200"/>
+        <w:gridCol w:w="7810"/>
       </w:tblGrid>
       <w:tr>
         <w:trPr>
@@ -4704,25 +4443,7 @@
                 <w:sz w:val="21"/>
                 <w:szCs w:val="21"/>
               </w:rPr>
-              <w:t xml:space="preserve">Power law exponent relating velocity to curvature; </w:t>
-            </w:r>
-            <w:proofErr w:type="gramStart"/>
-            <w:r>
-              <w:rPr>
-                <w:rFonts w:ascii="Helvetica" w:eastAsia="Times New Roman" w:hAnsi="Helvetica" w:cs="Helvetica"/>
-                <w:sz w:val="21"/>
-                <w:szCs w:val="21"/>
-              </w:rPr>
-              <w:t>canonical</w:t>
-            </w:r>
-            <w:proofErr w:type="gramEnd"/>
-            <w:r>
-              <w:rPr>
-                <w:rFonts w:ascii="Helvetica" w:eastAsia="Times New Roman" w:hAnsi="Helvetica" w:cs="Helvetica"/>
-                <w:sz w:val="21"/>
-                <w:szCs w:val="21"/>
-              </w:rPr>
-              <w:t xml:space="preserve"> value ≈ 1/3</w:t>
+              <w:t>Power law exponent relating velocity to curvature; canonical value ≈ 1/3</w:t>
             </w:r>
           </w:p>
         </w:tc>
@@ -4868,6 +4589,7 @@
                 <w:sz w:val="21"/>
                 <w:szCs w:val="21"/>
               </w:rPr>
+              <w:lastRenderedPageBreak/>
               <w:t>β</w:t>
             </w:r>
             <w:r>
@@ -5190,7 +4912,6 @@
                 <w:sz w:val="21"/>
                 <w:szCs w:val="21"/>
               </w:rPr>
-              <w:lastRenderedPageBreak/>
               <w:t>Δ</w:t>
             </w:r>
             <w:r>
@@ -5292,7 +5013,6 @@
               </w:rPr>
               <w:t>β</w:t>
             </w:r>
-            <w:proofErr w:type="gramStart"/>
             <w:r>
               <w:rPr>
                 <w:rFonts w:ascii="Helvetica" w:eastAsia="Times New Roman" w:hAnsi="Helvetica" w:cs="Helvetica"/>
@@ -5302,7 +5022,6 @@
               </w:rPr>
               <w:t>rec,P</w:t>
             </w:r>
-            <w:proofErr w:type="gramEnd"/>
             <w:r>
               <w:rPr>
                 <w:rFonts w:ascii="Helvetica" w:eastAsia="Times New Roman" w:hAnsi="Helvetica" w:cs="Helvetica"/>
@@ -5439,27 +5158,7 @@
                 <w:sz w:val="21"/>
                 <w:szCs w:val="21"/>
               </w:rPr>
-              <w:t xml:space="preserve"> across repeated measurements of identical conditions. Operationally in simulation: </w:t>
-            </w:r>
-            <w:proofErr w:type="gramStart"/>
-            <w:r>
-              <w:rPr>
-                <w:rStyle w:val="Emphasis"/>
-                <w:rFonts w:ascii="Helvetica" w:eastAsia="Times New Roman" w:hAnsi="Helvetica" w:cs="Helvetica"/>
-                <w:sz w:val="21"/>
-                <w:szCs w:val="21"/>
-              </w:rPr>
-              <w:t>SD(</w:t>
-            </w:r>
-            <w:proofErr w:type="gramEnd"/>
-            <w:r>
-              <w:rPr>
-                <w:rStyle w:val="Emphasis"/>
-                <w:rFonts w:ascii="Helvetica" w:eastAsia="Times New Roman" w:hAnsi="Helvetica" w:cs="Helvetica"/>
-                <w:sz w:val="21"/>
-                <w:szCs w:val="21"/>
-              </w:rPr>
-              <w:t>bias) = SD(β</w:t>
+              <w:t xml:space="preserve"> across repeated measurements of identical conditions. Operationally in simulation: SD(bias) = SD(β</w:t>
             </w:r>
             <w:r>
               <w:rPr>
@@ -6283,8 +5982,8 @@
         <w:tblLook w:val="04A0" w:firstRow="1" w:lastRow="0" w:firstColumn="1" w:lastColumn="0" w:noHBand="0" w:noVBand="1"/>
       </w:tblPr>
       <w:tblGrid>
-        <w:gridCol w:w="1302"/>
-        <w:gridCol w:w="7708"/>
+        <w:gridCol w:w="1299"/>
+        <w:gridCol w:w="7711"/>
       </w:tblGrid>
       <w:tr>
         <w:trPr>
@@ -6411,7 +6110,6 @@
               </w:rPr>
               <w:t>β</w:t>
             </w:r>
-            <w:proofErr w:type="gramStart"/>
             <w:r>
               <w:rPr>
                 <w:rStyle w:val="Strong"/>
@@ -6422,7 +6120,6 @@
               </w:rPr>
               <w:t>rec,P</w:t>
             </w:r>
-            <w:proofErr w:type="gramEnd"/>
           </w:p>
         </w:tc>
         <w:tc>
@@ -6601,7 +6298,6 @@
               </w:rPr>
               <w:t>β</w:t>
             </w:r>
-            <w:proofErr w:type="gramStart"/>
             <w:r>
               <w:rPr>
                 <w:rFonts w:ascii="Helvetica" w:eastAsia="Times New Roman" w:hAnsi="Helvetica" w:cs="Helvetica"/>
@@ -6611,7 +6307,6 @@
               </w:rPr>
               <w:t>rec,P</w:t>
             </w:r>
-            <w:proofErr w:type="gramEnd"/>
             <w:r>
               <w:rPr>
                 <w:rFonts w:ascii="Helvetica" w:eastAsia="Times New Roman" w:hAnsi="Helvetica" w:cs="Helvetica"/>
@@ -6907,25 +6602,7 @@
                 <w:sz w:val="21"/>
                 <w:szCs w:val="21"/>
               </w:rPr>
-              <w:t xml:space="preserve">Lin's Concordance Correlation </w:t>
-            </w:r>
-            <w:proofErr w:type="gramStart"/>
-            <w:r>
-              <w:rPr>
-                <w:rFonts w:ascii="Helvetica" w:eastAsia="Times New Roman" w:hAnsi="Helvetica" w:cs="Helvetica"/>
-                <w:sz w:val="21"/>
-                <w:szCs w:val="21"/>
-              </w:rPr>
-              <w:t>Coefficient;</w:t>
-            </w:r>
-            <w:proofErr w:type="gramEnd"/>
-            <w:r>
-              <w:rPr>
-                <w:rFonts w:ascii="Helvetica" w:eastAsia="Times New Roman" w:hAnsi="Helvetica" w:cs="Helvetica"/>
-                <w:sz w:val="21"/>
-                <w:szCs w:val="21"/>
-              </w:rPr>
-              <w:t xml:space="preserve"> measures agreement between predicted and observed values</w:t>
+              <w:t>Lin's Concordance Correlation Coefficient; measures agreement between predicted and observed values</w:t>
             </w:r>
           </w:p>
         </w:tc>
@@ -6999,6 +6676,7 @@
                 <w:sz w:val="21"/>
                 <w:szCs w:val="21"/>
               </w:rPr>
+              <w:lastRenderedPageBreak/>
               <w:t>Term</w:t>
             </w:r>
           </w:p>
@@ -7311,7 +6989,6 @@
                 <w:sz w:val="21"/>
                 <w:szCs w:val="21"/>
               </w:rPr>
-              <w:lastRenderedPageBreak/>
               <w:t>Regression method</w:t>
             </w:r>
           </w:p>
@@ -8097,25 +7774,7 @@
                 <w:sz w:val="21"/>
                 <w:szCs w:val="21"/>
               </w:rPr>
-              <w:t xml:space="preserve">Standardised mean difference effect size (Cohen, 1988); used here as an initial diagnostic threshold (d &gt; 0.5) for detecting systematic residual bias in Stage 2 residual pattern analysis. Has known limitations for hierarchical LMM structures where variance </w:t>
-            </w:r>
-            <w:proofErr w:type="gramStart"/>
-            <w:r>
-              <w:rPr>
-                <w:rFonts w:ascii="Helvetica" w:eastAsia="Times New Roman" w:hAnsi="Helvetica" w:cs="Helvetica"/>
-                <w:sz w:val="21"/>
-                <w:szCs w:val="21"/>
-              </w:rPr>
-              <w:t>is partitioned</w:t>
-            </w:r>
-            <w:proofErr w:type="gramEnd"/>
-            <w:r>
-              <w:rPr>
-                <w:rFonts w:ascii="Helvetica" w:eastAsia="Times New Roman" w:hAnsi="Helvetica" w:cs="Helvetica"/>
-                <w:sz w:val="21"/>
-                <w:szCs w:val="21"/>
-              </w:rPr>
-              <w:t xml:space="preserve"> across levels (Lorah, 2018; Meteyard &amp; Davies, 2020); alternative metrics are under consideration (see Section 6).</w:t>
+              <w:t>Standardised mean difference effect size (Cohen, 1988); used here as an initial diagnostic threshold (d &gt; 0.5) for detecting systematic residual bias in Stage 2 residual pattern analysis. Has known limitations for hierarchical LMM structures where variance is partitioned across levels (Lorah, 2018; Meteyard &amp; Davies, 2020); alternative metrics are under consideration (see Section 6).</w:t>
             </w:r>
           </w:p>
         </w:tc>
@@ -8192,25 +7851,7 @@
                 <w:sz w:val="21"/>
                 <w:szCs w:val="21"/>
               </w:rPr>
-              <w:t xml:space="preserve">Mean Absolute Error; </w:t>
-            </w:r>
-            <w:proofErr w:type="gramStart"/>
-            <w:r>
-              <w:rPr>
-                <w:rFonts w:ascii="Helvetica" w:eastAsia="Times New Roman" w:hAnsi="Helvetica" w:cs="Helvetica"/>
-                <w:sz w:val="21"/>
-                <w:szCs w:val="21"/>
-              </w:rPr>
-              <w:t>mean(</w:t>
-            </w:r>
-            <w:proofErr w:type="gramEnd"/>
-            <w:r>
-              <w:rPr>
-                <w:rFonts w:ascii="Helvetica" w:eastAsia="Times New Roman" w:hAnsi="Helvetica" w:cs="Helvetica"/>
-                <w:sz w:val="21"/>
-                <w:szCs w:val="21"/>
-              </w:rPr>
-              <w:t>|Δ</w:t>
+              <w:t>Mean Absolute Error; mean(|Δ</w:t>
             </w:r>
             <w:r>
               <w:rPr>
@@ -8525,6 +8166,7 @@
                 <w:sz w:val="21"/>
                 <w:szCs w:val="21"/>
               </w:rPr>
+              <w:lastRenderedPageBreak/>
               <w:t>RSA</w:t>
             </w:r>
           </w:p>
@@ -8562,25 +8204,7 @@
                 <w:sz w:val="21"/>
                 <w:szCs w:val="21"/>
               </w:rPr>
-              <w:t xml:space="preserve">Representational Similarity Analysis (Kriegeskorte et al., 2008); second-order validation method comparing the trial-by-trial dissimilarity structure of simulation predictions against empirical observations, revealing whether the topology of the parameter space </w:t>
-            </w:r>
-            <w:proofErr w:type="gramStart"/>
-            <w:r>
-              <w:rPr>
-                <w:rFonts w:ascii="Helvetica" w:eastAsia="Times New Roman" w:hAnsi="Helvetica" w:cs="Helvetica"/>
-                <w:sz w:val="21"/>
-                <w:szCs w:val="21"/>
-              </w:rPr>
-              <w:t>is correctly captured</w:t>
-            </w:r>
-            <w:proofErr w:type="gramEnd"/>
-            <w:r>
-              <w:rPr>
-                <w:rFonts w:ascii="Helvetica" w:eastAsia="Times New Roman" w:hAnsi="Helvetica" w:cs="Helvetica"/>
-                <w:sz w:val="21"/>
-                <w:szCs w:val="21"/>
-              </w:rPr>
-              <w:t>.</w:t>
+              <w:t>Representational Similarity Analysis (Kriegeskorte et al., 2008); second-order validation method comparing the trial-by-trial dissimilarity structure of simulation predictions against empirical observations, revealing whether the topology of the parameter space is correctly captured.</w:t>
             </w:r>
           </w:p>
         </w:tc>
@@ -8657,25 +8281,7 @@
                 <w:sz w:val="21"/>
                 <w:szCs w:val="21"/>
               </w:rPr>
-              <w:t xml:space="preserve">Representational Dissimilarity </w:t>
-            </w:r>
-            <w:proofErr w:type="gramStart"/>
-            <w:r>
-              <w:rPr>
-                <w:rFonts w:ascii="Helvetica" w:eastAsia="Times New Roman" w:hAnsi="Helvetica" w:cs="Helvetica"/>
-                <w:sz w:val="21"/>
-                <w:szCs w:val="21"/>
-              </w:rPr>
-              <w:t>Matrix;</w:t>
-            </w:r>
-            <w:proofErr w:type="gramEnd"/>
-            <w:r>
-              <w:rPr>
-                <w:rFonts w:ascii="Helvetica" w:eastAsia="Times New Roman" w:hAnsi="Helvetica" w:cs="Helvetica"/>
-                <w:sz w:val="21"/>
-                <w:szCs w:val="21"/>
-              </w:rPr>
-              <w:t xml:space="preserve"> the trial matrix of Euclidean distances between 15-element constellation vectors, computed separately for simulation and empirical data and compared via RSA.</w:t>
+              <w:t>Representational Dissimilarity Matrix; the trial matrix of Euclidean distances between 15-element constellation vectors, computed separately for simulation and empirical data and compared via RSA.</w:t>
             </w:r>
           </w:p>
         </w:tc>
@@ -8692,7 +8298,6 @@
         <w:rPr>
           <w:rFonts w:ascii="Helvetica" w:eastAsia="Times New Roman" w:hAnsi="Helvetica" w:cs="Helvetica"/>
         </w:rPr>
-        <w:lastRenderedPageBreak/>
         <w:t>3. Ground Truth Parameter Space</w:t>
       </w:r>
     </w:p>
@@ -8760,25 +8365,7 @@
           <w:sz w:val="21"/>
           <w:szCs w:val="21"/>
         </w:rPr>
-        <w:t xml:space="preserve">In this current project synthetic trajectories </w:t>
-      </w:r>
-      <w:proofErr w:type="gramStart"/>
-      <w:r>
-        <w:rPr>
-          <w:rFonts w:ascii="Helvetica" w:hAnsi="Helvetica" w:cs="Helvetica"/>
-          <w:sz w:val="21"/>
-          <w:szCs w:val="21"/>
-        </w:rPr>
-        <w:t>are generated</w:t>
-      </w:r>
-      <w:proofErr w:type="gramEnd"/>
-      <w:r>
-        <w:rPr>
-          <w:rFonts w:ascii="Helvetica" w:hAnsi="Helvetica" w:cs="Helvetica"/>
-          <w:sz w:val="21"/>
-          <w:szCs w:val="21"/>
-        </w:rPr>
-        <w:t>, and in turn examined, with the following parameters:</w:t>
+        <w:t>In this current project synthetic trajectories are generated, and in turn examined, with the following parameters:</w:t>
       </w:r>
     </w:p>
     <w:p>
@@ -8893,25 +8480,7 @@
           <w:sz w:val="21"/>
           <w:szCs w:val="21"/>
         </w:rPr>
-        <w:t xml:space="preserve">'s may </w:t>
-      </w:r>
-      <w:proofErr w:type="gramStart"/>
-      <w:r>
-        <w:rPr>
-          <w:rFonts w:ascii="Helvetica" w:hAnsi="Helvetica" w:cs="Helvetica"/>
-          <w:sz w:val="21"/>
-          <w:szCs w:val="21"/>
-        </w:rPr>
-        <w:t>be more reliably recovered</w:t>
-      </w:r>
-      <w:proofErr w:type="gramEnd"/>
-      <w:r>
-        <w:rPr>
-          <w:rFonts w:ascii="Helvetica" w:hAnsi="Helvetica" w:cs="Helvetica"/>
-          <w:sz w:val="21"/>
-          <w:szCs w:val="21"/>
-        </w:rPr>
-        <w:t xml:space="preserve"> empirically i.e., when ellipse tracing approximates or exceeds ~1Hz (Matić, 2022).</w:t>
+        <w:t>'s may be more reliably recovered empirically i.e., when ellipse tracing approximates or exceeds ~1Hz (Matić, 2022).</w:t>
       </w:r>
     </w:p>
     <w:p>
@@ -8942,25 +8511,7 @@
           <w:sz w:val="21"/>
           <w:szCs w:val="21"/>
         </w:rPr>
-        <w:t xml:space="preserve"> span from instrument precision (submillimetre) through average human motor variability for such tasks (&lt;4mm; Madirolas et al., 2022) to high measurement degradation (10mm). For computational </w:t>
-      </w:r>
-      <w:proofErr w:type="gramStart"/>
-      <w:r>
-        <w:rPr>
-          <w:rFonts w:ascii="Helvetica" w:hAnsi="Helvetica" w:cs="Helvetica"/>
-          <w:sz w:val="21"/>
-          <w:szCs w:val="21"/>
-        </w:rPr>
-        <w:t>tractability</w:t>
-      </w:r>
-      <w:proofErr w:type="gramEnd"/>
-      <w:r>
-        <w:rPr>
-          <w:rFonts w:ascii="Helvetica" w:hAnsi="Helvetica" w:cs="Helvetica"/>
-          <w:sz w:val="21"/>
-          <w:szCs w:val="21"/>
-        </w:rPr>
-        <w:t xml:space="preserve"> this wide range is sparse above 2mm. Noise is injected as per Maoz et al. (2005).</w:t>
+        <w:t xml:space="preserve"> span from instrument precision (submillimetre) through average human motor variability for such tasks (&lt;4mm; Madirolas et al., 2022) to high measurement degradation (10mm). For computational tractability this wide range is sparse above 2mm. Noise is injected as per Maoz et al. (2005).</w:t>
       </w:r>
     </w:p>
     <w:p>
@@ -8991,25 +8542,7 @@
           <w:sz w:val="21"/>
           <w:szCs w:val="21"/>
         </w:rPr>
-        <w:t xml:space="preserve"> range from the white noise of instrumentation to the presumed pink of biological motion. Red and black noise </w:t>
-      </w:r>
-      <w:proofErr w:type="gramStart"/>
-      <w:r>
-        <w:rPr>
-          <w:rFonts w:ascii="Helvetica" w:hAnsi="Helvetica" w:cs="Helvetica"/>
-          <w:sz w:val="21"/>
-          <w:szCs w:val="21"/>
-        </w:rPr>
-        <w:t>are also considered</w:t>
-      </w:r>
-      <w:proofErr w:type="gramEnd"/>
-      <w:r>
-        <w:rPr>
-          <w:rFonts w:ascii="Helvetica" w:hAnsi="Helvetica" w:cs="Helvetica"/>
-          <w:sz w:val="21"/>
-          <w:szCs w:val="21"/>
-        </w:rPr>
-        <w:t>, as after finite differences differentiation these noises are transformed into white and pink (e.g., black noise admixed x coordinates give rise to pink noise contamination in x-direction velocities). Noise generation employs the fractional differencing approach of Xu (2019) for accurate 1/</w:t>
+        <w:t xml:space="preserve"> range from the white noise of instrumentation to the presumed pink of biological motion. Red and black noise are also considered, as after finite differences differentiation these noises are transformed into white and pink (e.g., black noise admixed x coordinates give rise to pink noise contamination in x-direction velocities). Noise generation employs the fractional differencing approach of Xu (2019) for accurate 1/</w:t>
       </w:r>
       <w:r>
         <w:rPr>
@@ -9176,10 +8709,10 @@
         <w:tblLook w:val="04A0" w:firstRow="1" w:lastRow="0" w:firstColumn="1" w:lastColumn="0" w:noHBand="0" w:noVBand="1"/>
       </w:tblPr>
       <w:tblGrid>
-        <w:gridCol w:w="1876"/>
-        <w:gridCol w:w="1848"/>
+        <w:gridCol w:w="1878"/>
+        <w:gridCol w:w="1847"/>
         <w:gridCol w:w="997"/>
-        <w:gridCol w:w="4289"/>
+        <w:gridCol w:w="4288"/>
       </w:tblGrid>
       <w:tr>
         <w:trPr>
@@ -9222,6 +8755,7 @@
                 <w:sz w:val="21"/>
                 <w:szCs w:val="21"/>
               </w:rPr>
+              <w:lastRenderedPageBreak/>
               <w:t>Parameter</w:t>
             </w:r>
           </w:p>
@@ -9654,18 +9188,8 @@
                 <w:sz w:val="21"/>
                 <w:szCs w:val="21"/>
               </w:rPr>
-              <w:t xml:space="preserve">Empirical range from Huh &amp; Sejnowski (2015) extended to include </w:t>
-            </w:r>
-            <w:proofErr w:type="gramStart"/>
-            <w:r>
-              <w:rPr>
-                <w:rFonts w:ascii="Helvetica" w:eastAsia="Times New Roman" w:hAnsi="Helvetica" w:cs="Helvetica"/>
-                <w:sz w:val="21"/>
-                <w:szCs w:val="21"/>
-              </w:rPr>
-              <w:t>0</w:t>
-            </w:r>
-            <w:proofErr w:type="gramEnd"/>
+              <w:t>Empirical range from Huh &amp; Sejnowski (2015) extended to include 0</w:t>
+            </w:r>
           </w:p>
         </w:tc>
       </w:tr>
@@ -9734,23 +9258,13 @@
                 <w:szCs w:val="21"/>
               </w:rPr>
             </w:pPr>
-            <w:proofErr w:type="gramStart"/>
-            <w:r>
-              <w:rPr>
-                <w:rFonts w:ascii="Helvetica" w:eastAsia="Times New Roman" w:hAnsi="Helvetica" w:cs="Helvetica"/>
-                <w:sz w:val="21"/>
-                <w:szCs w:val="21"/>
-              </w:rPr>
-              <w:t>exp(</w:t>
-            </w:r>
-            <w:proofErr w:type="gramEnd"/>
-            <w:r>
-              <w:rPr>
-                <w:rFonts w:ascii="Helvetica" w:eastAsia="Times New Roman" w:hAnsi="Helvetica" w:cs="Helvetica"/>
-                <w:sz w:val="21"/>
-                <w:szCs w:val="21"/>
-              </w:rPr>
-              <w:t>4.5) to exp(5.8)</w:t>
+            <w:r>
+              <w:rPr>
+                <w:rFonts w:ascii="Helvetica" w:eastAsia="Times New Roman" w:hAnsi="Helvetica" w:cs="Helvetica"/>
+                <w:sz w:val="21"/>
+                <w:szCs w:val="21"/>
+              </w:rPr>
+              <w:t>exp(4.5) to exp(5.8)</w:t>
             </w:r>
           </w:p>
         </w:tc>
@@ -10115,7 +9629,6 @@
                 <w:sz w:val="21"/>
                 <w:szCs w:val="21"/>
               </w:rPr>
-              <w:lastRenderedPageBreak/>
               <w:t>Noise Magnitude (</w:t>
             </w:r>
             <w:r>
@@ -10971,23 +10484,13 @@
                 <w:szCs w:val="21"/>
               </w:rPr>
             </w:pPr>
-            <w:proofErr w:type="gramStart"/>
-            <w:r>
-              <w:rPr>
-                <w:rFonts w:ascii="Helvetica" w:eastAsia="Times New Roman" w:hAnsi="Helvetica" w:cs="Helvetica"/>
-                <w:sz w:val="21"/>
-                <w:szCs w:val="21"/>
-              </w:rPr>
-              <w:t>5</w:t>
-            </w:r>
-            <w:proofErr w:type="gramEnd"/>
-            <w:r>
-              <w:rPr>
-                <w:rFonts w:ascii="Helvetica" w:eastAsia="Times New Roman" w:hAnsi="Helvetica" w:cs="Helvetica"/>
-                <w:sz w:val="21"/>
-                <w:szCs w:val="21"/>
-              </w:rPr>
-              <w:t xml:space="preserve"> per condition</w:t>
+            <w:r>
+              <w:rPr>
+                <w:rFonts w:ascii="Helvetica" w:eastAsia="Times New Roman" w:hAnsi="Helvetica" w:cs="Helvetica"/>
+                <w:sz w:val="21"/>
+                <w:szCs w:val="21"/>
+              </w:rPr>
+              <w:t>5 per condition</w:t>
             </w:r>
           </w:p>
         </w:tc>
@@ -11132,25 +10635,7 @@
           <w:sz w:val="21"/>
           <w:szCs w:val="21"/>
         </w:rPr>
-        <w:t xml:space="preserve">To confidently detect effects, the precision of any method must at least be commensurate with, or indeed exceed, the magnitude of the effect. In motor assessment and rehabilitation research, this principle is formalised through the MDC framework: measurement error must be </w:t>
-      </w:r>
-      <w:proofErr w:type="gramStart"/>
-      <w:r>
-        <w:rPr>
-          <w:rFonts w:ascii="Helvetica" w:hAnsi="Helvetica" w:cs="Helvetica"/>
-          <w:sz w:val="21"/>
-          <w:szCs w:val="21"/>
-        </w:rPr>
-        <w:t>substantially smaller</w:t>
-      </w:r>
-      <w:proofErr w:type="gramEnd"/>
-      <w:r>
-        <w:rPr>
-          <w:rFonts w:ascii="Helvetica" w:hAnsi="Helvetica" w:cs="Helvetica"/>
-          <w:sz w:val="21"/>
-          <w:szCs w:val="21"/>
-        </w:rPr>
-        <w:t xml:space="preserve"> than the smallest real difference one wishes to detect (Haley &amp; Fragala-Pinkham, 2006; Beckerman et al., 2001). Specifically, the SEM must satisfy SEM &lt; MDC/2.77 for 95% confidence in detecting true change, where MDC represents the magnitude of change considered clinically or biologically meaningful.</w:t>
+        <w:t>To confidently detect effects, the precision of any method must at least be commensurate with, or indeed exceed, the magnitude of the effect. In motor assessment and rehabilitation research, this principle is formalised through the MDC framework: measurement error must be substantially smaller than the smallest real difference one wishes to detect (Haley &amp; Fragala-Pinkham, 2006; Beckerman et al., 2001). Specifically, the SEM must satisfy SEM &lt; MDC/2.77 for 95% confidence in detecting true change, where MDC represents the magnitude of change considered clinically or biologically meaningful.</w:t>
       </w:r>
     </w:p>
     <w:p>
@@ -11219,25 +10704,7 @@
           <w:sz w:val="21"/>
           <w:szCs w:val="21"/>
         </w:rPr>
-        <w:t xml:space="preserve"> values can deviate </w:t>
-      </w:r>
-      <w:proofErr w:type="gramStart"/>
-      <w:r>
-        <w:rPr>
-          <w:rFonts w:ascii="Helvetica" w:hAnsi="Helvetica" w:cs="Helvetica"/>
-          <w:sz w:val="21"/>
-          <w:szCs w:val="21"/>
-        </w:rPr>
-        <w:t>substantially from</w:t>
-      </w:r>
-      <w:proofErr w:type="gramEnd"/>
-      <w:r>
-        <w:rPr>
-          <w:rFonts w:ascii="Helvetica" w:hAnsi="Helvetica" w:cs="Helvetica"/>
-          <w:sz w:val="21"/>
-          <w:szCs w:val="21"/>
-        </w:rPr>
-        <w:t xml:space="preserve"> the underlying generator, with BWFD-OLS systematically compressing estimates toward ~1/3 in the presence of noise. This suggests reported clinical divergences may underestimate true biological variation. Therefore, using |Δ</w:t>
+        <w:t xml:space="preserve"> values can deviate substantially from the underlying generator, with BWFD-OLS systematically compressing estimates toward ~1/3 in the presence of noise. This suggests reported clinical divergences may underestimate true biological variation. Therefore, using |Δ</w:t>
       </w:r>
       <w:r>
         <w:rPr>
@@ -11272,25 +10739,8 @@
           <w:sz w:val="21"/>
           <w:szCs w:val="21"/>
         </w:rPr>
-        <w:t xml:space="preserve">Systematic assessment of analytical pipelines will therefore adopt SEM &lt; 0.011 as the adequacy criterion: methods and parameter combinations where the standard error of measurement SEM = </w:t>
-      </w:r>
-      <w:proofErr w:type="gramStart"/>
-      <w:r>
-        <w:rPr>
-          <w:rFonts w:ascii="Helvetica" w:hAnsi="Helvetica" w:cs="Helvetica"/>
-          <w:sz w:val="21"/>
-          <w:szCs w:val="21"/>
-        </w:rPr>
-        <w:t>SD(</w:t>
-      </w:r>
-      <w:proofErr w:type="gramEnd"/>
-      <w:r>
-        <w:rPr>
-          <w:rFonts w:ascii="Helvetica" w:hAnsi="Helvetica" w:cs="Helvetica"/>
-          <w:sz w:val="21"/>
-          <w:szCs w:val="21"/>
-        </w:rPr>
-        <w:t>bias) = SD(</w:t>
+        <w:lastRenderedPageBreak/>
+        <w:t>Systematic assessment of analytical pipelines will therefore adopt SEM &lt; 0.011 as the adequacy criterion: methods and parameter combinations where the standard error of measurement SEM = SD(bias) = SD(</w:t>
       </w:r>
       <w:r>
         <w:rPr>
@@ -11334,25 +10784,7 @@
           <w:sz w:val="21"/>
           <w:szCs w:val="21"/>
         </w:rPr>
-        <w:t xml:space="preserve">) exceeds 0.011 across the 5 repetitions will be considered incapable of accurately recovering the clinical differences reported in the literature. This criterion directly </w:t>
-      </w:r>
-      <w:proofErr w:type="gramStart"/>
-      <w:r>
-        <w:rPr>
-          <w:rFonts w:ascii="Helvetica" w:hAnsi="Helvetica" w:cs="Helvetica"/>
-          <w:sz w:val="21"/>
-          <w:szCs w:val="21"/>
-        </w:rPr>
-        <w:t>tests</w:t>
-      </w:r>
-      <w:proofErr w:type="gramEnd"/>
-      <w:r>
-        <w:rPr>
-          <w:rFonts w:ascii="Helvetica" w:hAnsi="Helvetica" w:cs="Helvetica"/>
-          <w:sz w:val="21"/>
-          <w:szCs w:val="21"/>
-        </w:rPr>
-        <w:t xml:space="preserve"> whether noise-induced measurement error remains within acceptable limits defined by the MDC framework.</w:t>
+        <w:t>) exceeds 0.011 across the 5 repetitions will be considered incapable of accurately recovering the clinical differences reported in the literature. This criterion directly tests whether noise-induced measurement error remains within acceptable limits defined by the MDC framework.</w:t>
       </w:r>
     </w:p>
     <w:p>
@@ -11431,7 +10863,6 @@
           <w:sz w:val="21"/>
           <w:szCs w:val="21"/>
         </w:rPr>
-        <w:lastRenderedPageBreak/>
         <w:t>Systematic bias (rather than random error) is the dominant source of deviation, which can be characterised and corrected</w:t>
       </w:r>
     </w:p>
@@ -11450,25 +10881,7 @@
           <w:sz w:val="21"/>
           <w:szCs w:val="21"/>
         </w:rPr>
-        <w:t xml:space="preserve">Therefore, additional measurement error boundaries will </w:t>
-      </w:r>
-      <w:proofErr w:type="gramStart"/>
-      <w:r>
-        <w:rPr>
-          <w:rFonts w:ascii="Helvetica" w:hAnsi="Helvetica" w:cs="Helvetica"/>
-          <w:sz w:val="21"/>
-          <w:szCs w:val="21"/>
-        </w:rPr>
-        <w:t>be empirically derived</w:t>
-      </w:r>
-      <w:proofErr w:type="gramEnd"/>
-      <w:r>
-        <w:rPr>
-          <w:rFonts w:ascii="Helvetica" w:hAnsi="Helvetica" w:cs="Helvetica"/>
-          <w:sz w:val="21"/>
-          <w:szCs w:val="21"/>
-        </w:rPr>
-        <w:t xml:space="preserve"> through bootstrap confidence interval analysis and cross-validation performance assessment across the 14.7M parameter combinations, characterising both the systematic bias and random measurement error (SEM) of each pipeline across biologically plausible parameter space.</w:t>
+        <w:t>Therefore, additional measurement error boundaries will be empirically derived through bootstrap confidence interval analysis and cross-validation performance assessment across the 14.7M parameter combinations, characterising both the systematic bias and random measurement error (SEM) of each pipeline across biologically plausible parameter space.</w:t>
       </w:r>
     </w:p>
     <w:p>
@@ -11526,18 +10939,8 @@
           <w:sz w:val="21"/>
           <w:szCs w:val="21"/>
         </w:rPr>
-        <w:t xml:space="preserve"> Does mean(bias) = </w:t>
-      </w:r>
-      <w:proofErr w:type="gramStart"/>
-      <w:r>
-        <w:rPr>
-          <w:rFonts w:ascii="Helvetica" w:hAnsi="Helvetica" w:cs="Helvetica"/>
-          <w:sz w:val="21"/>
-          <w:szCs w:val="21"/>
-        </w:rPr>
-        <w:t>mean(</w:t>
-      </w:r>
-      <w:proofErr w:type="gramEnd"/>
+        <w:t xml:space="preserve"> Does mean(bias) = mean(</w:t>
+      </w:r>
       <w:r>
         <w:rPr>
           <w:rFonts w:ascii="Helvetica" w:hAnsi="Helvetica" w:cs="Helvetica"/>
@@ -11580,25 +10983,7 @@
           <w:sz w:val="21"/>
           <w:szCs w:val="21"/>
         </w:rPr>
-        <w:t>) deviate from zero? This tests Fraser et al.'s (2025) finding that BWFD-OLS compresses toward ~1/</w:t>
-      </w:r>
-      <w:proofErr w:type="gramStart"/>
-      <w:r>
-        <w:rPr>
-          <w:rFonts w:ascii="Helvetica" w:hAnsi="Helvetica" w:cs="Helvetica"/>
-          <w:sz w:val="21"/>
-          <w:szCs w:val="21"/>
-        </w:rPr>
-        <w:t>3, and</w:t>
-      </w:r>
-      <w:proofErr w:type="gramEnd"/>
-      <w:r>
-        <w:rPr>
-          <w:rFonts w:ascii="Helvetica" w:hAnsi="Helvetica" w:cs="Helvetica"/>
-          <w:sz w:val="21"/>
-          <w:szCs w:val="21"/>
-        </w:rPr>
-        <w:t xml:space="preserve"> is evaluated via the Stage 1 LMM fixed effects.</w:t>
+        <w:t>) deviate from zero? This tests Fraser et al.'s (2025) finding that BWFD-OLS compresses toward ~1/3, and is evaluated via the Stage 1 LMM fixed effects.</w:t>
       </w:r>
     </w:p>
     <w:p>
@@ -11629,43 +11014,7 @@
           <w:sz w:val="21"/>
           <w:szCs w:val="21"/>
         </w:rPr>
-        <w:t xml:space="preserve"> Does </w:t>
-      </w:r>
-      <w:proofErr w:type="gramStart"/>
-      <w:r>
-        <w:rPr>
-          <w:rFonts w:ascii="Helvetica" w:hAnsi="Helvetica" w:cs="Helvetica"/>
-          <w:sz w:val="21"/>
-          <w:szCs w:val="21"/>
-        </w:rPr>
-        <w:t>SD(</w:t>
-      </w:r>
-      <w:proofErr w:type="gramEnd"/>
-      <w:r>
-        <w:rPr>
-          <w:rFonts w:ascii="Helvetica" w:hAnsi="Helvetica" w:cs="Helvetica"/>
-          <w:sz w:val="21"/>
-          <w:szCs w:val="21"/>
-        </w:rPr>
-        <w:t xml:space="preserve">bias) across the 5 repetitions exceed 0.011? This </w:t>
-      </w:r>
-      <w:proofErr w:type="gramStart"/>
-      <w:r>
-        <w:rPr>
-          <w:rFonts w:ascii="Helvetica" w:hAnsi="Helvetica" w:cs="Helvetica"/>
-          <w:sz w:val="21"/>
-          <w:szCs w:val="21"/>
-        </w:rPr>
-        <w:t>tests</w:t>
-      </w:r>
-      <w:proofErr w:type="gramEnd"/>
-      <w:r>
-        <w:rPr>
-          <w:rFonts w:ascii="Helvetica" w:hAnsi="Helvetica" w:cs="Helvetica"/>
-          <w:sz w:val="21"/>
-          <w:szCs w:val="21"/>
-        </w:rPr>
-        <w:t xml:space="preserve"> noise robustness and determines whether pipelines achieve the measurement precision required by the MDC framework.</w:t>
+        <w:t xml:space="preserve"> Does SD(bias) across the 5 repetitions exceed 0.011? This tests noise robustness and determines whether pipelines achieve the measurement precision required by the MDC framework.</w:t>
       </w:r>
     </w:p>
     <w:p>
@@ -11714,25 +11063,7 @@
           <w:sz w:val="21"/>
           <w:szCs w:val="21"/>
         </w:rPr>
-        <w:t xml:space="preserve"> Systematic error that could potentially </w:t>
-      </w:r>
-      <w:proofErr w:type="gramStart"/>
-      <w:r>
-        <w:rPr>
-          <w:rFonts w:ascii="Helvetica" w:hAnsi="Helvetica" w:cs="Helvetica"/>
-          <w:sz w:val="21"/>
-          <w:szCs w:val="21"/>
-        </w:rPr>
-        <w:t>be corrected</w:t>
-      </w:r>
-      <w:proofErr w:type="gramEnd"/>
-      <w:r>
-        <w:rPr>
-          <w:rFonts w:ascii="Helvetica" w:hAnsi="Helvetica" w:cs="Helvetica"/>
-          <w:sz w:val="21"/>
-          <w:szCs w:val="21"/>
-        </w:rPr>
-        <w:t xml:space="preserve"> if well-characterised</w:t>
+        <w:t xml:space="preserve"> Systematic error that could potentially be corrected if well-characterised</w:t>
       </w:r>
     </w:p>
     <w:p>
@@ -11855,25 +11186,7 @@
           <w:sz w:val="21"/>
           <w:szCs w:val="21"/>
         </w:rPr>
-        <w:t xml:space="preserve">. This analysis will </w:t>
-      </w:r>
-      <w:proofErr w:type="gramStart"/>
-      <w:r>
-        <w:rPr>
-          <w:rFonts w:ascii="Helvetica" w:hAnsi="Helvetica" w:cs="Helvetica"/>
-          <w:sz w:val="21"/>
-          <w:szCs w:val="21"/>
-        </w:rPr>
-        <w:t>be conducted</w:t>
-      </w:r>
-      <w:proofErr w:type="gramEnd"/>
-      <w:r>
-        <w:rPr>
-          <w:rFonts w:ascii="Helvetica" w:hAnsi="Helvetica" w:cs="Helvetica"/>
-          <w:sz w:val="21"/>
-          <w:szCs w:val="21"/>
-        </w:rPr>
-        <w:t xml:space="preserve"> conditional on adequate </w:t>
+        <w:t xml:space="preserve">. This analysis will be conducted conditional on adequate </w:t>
       </w:r>
       <w:r>
         <w:rPr>
@@ -11936,61 +11249,16 @@
           <w:sz w:val="21"/>
           <w:szCs w:val="21"/>
         </w:rPr>
-        <w:t xml:space="preserve">Prior to simulating ground truth trajectories, the computational tractability of such a large parameter space has </w:t>
-      </w:r>
-      <w:proofErr w:type="gramStart"/>
-      <w:r>
-        <w:rPr>
-          <w:rFonts w:ascii="Helvetica" w:hAnsi="Helvetica" w:cs="Helvetica"/>
-          <w:sz w:val="21"/>
-          <w:szCs w:val="21"/>
-        </w:rPr>
-        <w:t>been comprehensively validated</w:t>
-      </w:r>
-      <w:proofErr w:type="gramEnd"/>
-      <w:r>
-        <w:rPr>
-          <w:rFonts w:ascii="Helvetica" w:hAnsi="Helvetica" w:cs="Helvetica"/>
-          <w:sz w:val="21"/>
-          <w:szCs w:val="21"/>
-        </w:rPr>
-        <w:t xml:space="preserve"> through our 4-stage framework. The seven-way factorial mixed-effects model (see Section 5 below) with full interaction structure and random intercepts for parameter combinations has </w:t>
-      </w:r>
-      <w:proofErr w:type="gramStart"/>
-      <w:r>
-        <w:rPr>
-          <w:rFonts w:ascii="Helvetica" w:hAnsi="Helvetica" w:cs="Helvetica"/>
-          <w:sz w:val="21"/>
-          <w:szCs w:val="21"/>
-        </w:rPr>
-        <w:t>been demonstrated</w:t>
-      </w:r>
-      <w:proofErr w:type="gramEnd"/>
-      <w:r>
-        <w:rPr>
-          <w:rFonts w:ascii="Helvetica" w:hAnsi="Helvetica" w:cs="Helvetica"/>
-          <w:sz w:val="21"/>
-          <w:szCs w:val="21"/>
-        </w:rPr>
-        <w:t xml:space="preserve"> to converge with test data. However, convergence </w:t>
-      </w:r>
-      <w:proofErr w:type="gramStart"/>
-      <w:r>
-        <w:rPr>
-          <w:rFonts w:ascii="Helvetica" w:hAnsi="Helvetica" w:cs="Helvetica"/>
-          <w:sz w:val="21"/>
-          <w:szCs w:val="21"/>
-        </w:rPr>
-        <w:t>is not guaranteed</w:t>
-      </w:r>
-      <w:proofErr w:type="gramEnd"/>
-      <w:r>
-        <w:rPr>
-          <w:rFonts w:ascii="Helvetica" w:hAnsi="Helvetica" w:cs="Helvetica"/>
-          <w:sz w:val="21"/>
-          <w:szCs w:val="21"/>
-        </w:rPr>
-        <w:t xml:space="preserve"> given the scale of ground truth simulations. To address this potential issue, this framework has fall-back computational feasibility. We implement successively intensive computational tractability levels (1-9). Levels 1-8 employ minimal and then progressively larger subsets of the 14.7 million parameter space, culminating in the complete level 9. This will address the possibility that 14.7 million parameters overwhelm available compute. This subset framework additionally enables scalable replications, by allowing replications at differing tractability levels more commensurate with differing compute budgets, such as between desktop and cluster.</w:t>
+        <w:t xml:space="preserve">Prior to simulating ground truth trajectories, the computational tractability of such a large parameter space has been comprehensively validated through our 4-stage framework. The seven-way factorial mixed-effects model (see Section 5 below) with full interaction structure and random intercepts for parameter combinations has been demonstrated to converge with test data. However, convergence is not guaranteed given the scale of ground truth simulations. To </w:t>
+      </w:r>
+      <w:r>
+        <w:rPr>
+          <w:rFonts w:ascii="Helvetica" w:hAnsi="Helvetica" w:cs="Helvetica"/>
+          <w:sz w:val="21"/>
+          <w:szCs w:val="21"/>
+        </w:rPr>
+        <w:lastRenderedPageBreak/>
+        <w:t>address this potential issue, this framework has fall-back computational feasibility. We implement successively intensive computational tractability levels (1-9). Levels 1-8 employ minimal and then progressively larger subsets of the 14.7 million parameter space, culminating in the complete level 9. This will address the possibility that 14.7 million parameters overwhelm available compute. This subset framework additionally enables scalable replications, by allowing replications at differing tractability levels more commensurate with differing compute budgets, such as between desktop and cluster.</w:t>
       </w:r>
     </w:p>
     <w:p>
@@ -12071,7 +11339,6 @@
           <w:sz w:val="21"/>
           <w:szCs w:val="21"/>
         </w:rPr>
-        <w:lastRenderedPageBreak/>
         <w:t>Levels 4-6:</w:t>
       </w:r>
       <w:r>
@@ -12268,25 +11535,7 @@
           <w:sz w:val="21"/>
           <w:szCs w:val="21"/>
         </w:rPr>
-        <w:t xml:space="preserve"> recovery with SEM &lt; 0.011 for optimal conditions (white noise 0-0.1mm standard deviation), i.e., situations in which only instrument error </w:t>
-      </w:r>
-      <w:proofErr w:type="gramStart"/>
-      <w:r>
-        <w:rPr>
-          <w:rFonts w:ascii="Helvetica" w:hAnsi="Helvetica" w:cs="Helvetica"/>
-          <w:sz w:val="21"/>
-          <w:szCs w:val="21"/>
-        </w:rPr>
-        <w:t>is observed</w:t>
-      </w:r>
-      <w:proofErr w:type="gramEnd"/>
-      <w:r>
-        <w:rPr>
-          <w:rFonts w:ascii="Helvetica" w:hAnsi="Helvetica" w:cs="Helvetica"/>
-          <w:sz w:val="21"/>
-          <w:szCs w:val="21"/>
-        </w:rPr>
-        <w:t xml:space="preserve">. Failure in this zone will suggest investigated methods cannot accurately recover </w:t>
+        <w:t xml:space="preserve"> recovery with SEM &lt; 0.011 for optimal conditions (white noise 0-0.1mm standard deviation), i.e., situations in which only instrument error is observed. Failure in this zone will suggest investigated methods cannot accurately recover </w:t>
       </w:r>
       <w:r>
         <w:rPr>
@@ -12364,25 +11613,7 @@
           <w:sz w:val="21"/>
           <w:szCs w:val="21"/>
         </w:rPr>
-        <w:t xml:space="preserve"> can </w:t>
-      </w:r>
-      <w:proofErr w:type="gramStart"/>
-      <w:r>
-        <w:rPr>
-          <w:rFonts w:ascii="Helvetica" w:hAnsi="Helvetica" w:cs="Helvetica"/>
-          <w:sz w:val="21"/>
-          <w:szCs w:val="21"/>
-        </w:rPr>
-        <w:t>be recovered</w:t>
-      </w:r>
-      <w:proofErr w:type="gramEnd"/>
-      <w:r>
-        <w:rPr>
-          <w:rFonts w:ascii="Helvetica" w:hAnsi="Helvetica" w:cs="Helvetica"/>
-          <w:sz w:val="21"/>
-          <w:szCs w:val="21"/>
-        </w:rPr>
-        <w:t xml:space="preserve"> with adequate measurement precision (SEM &lt; 0.011).</w:t>
+        <w:t xml:space="preserve"> can be recovered with adequate measurement precision (SEM &lt; 0.011).</w:t>
       </w:r>
     </w:p>
     <w:p>
@@ -12512,6 +11743,7 @@
         <w:rPr>
           <w:rFonts w:ascii="Helvetica" w:eastAsia="Times New Roman" w:hAnsi="Helvetica" w:cs="Helvetica"/>
         </w:rPr>
+        <w:lastRenderedPageBreak/>
         <w:t>Stage 1: Global Interaction Modelling</w:t>
       </w:r>
     </w:p>
@@ -12945,7 +12177,6 @@
           <w:sz w:val="21"/>
           <w:szCs w:val="21"/>
         </w:rPr>
-        <w:lastRenderedPageBreak/>
         <w:t>Where VGF</w:t>
       </w:r>
       <w:r>
@@ -13032,25 +12263,7 @@
           <w:sz w:val="21"/>
           <w:szCs w:val="21"/>
         </w:rPr>
-        <w:t xml:space="preserve"> and VGF recovery accuracy. The random </w:t>
-      </w:r>
-      <w:proofErr w:type="gramStart"/>
-      <w:r>
-        <w:rPr>
-          <w:rFonts w:ascii="Helvetica" w:hAnsi="Helvetica" w:cs="Helvetica"/>
-          <w:sz w:val="21"/>
-          <w:szCs w:val="21"/>
-        </w:rPr>
-        <w:t>effects</w:t>
-      </w:r>
-      <w:proofErr w:type="gramEnd"/>
-      <w:r>
-        <w:rPr>
-          <w:rFonts w:ascii="Helvetica" w:hAnsi="Helvetica" w:cs="Helvetica"/>
-          <w:sz w:val="21"/>
-          <w:szCs w:val="21"/>
-        </w:rPr>
-        <w:t xml:space="preserve"> structure (1|combination) accounts for the five simulation repetitions per parameter combination, enabling direct estimation of the standard error of measurement (SEM) for each pipeline-parameter configuration. The fixed effects reveal which measurement conditions introduce systematic bias versus random error. The comprehensive 7-way interaction structure identifies the specific parameter combinations where pipelines fail to maintain adequate measurement precision for both primary and secondary estimands.</w:t>
+        <w:t xml:space="preserve"> and VGF recovery accuracy. The random effects structure (1|combination) accounts for the five simulation repetitions per parameter combination, enabling direct estimation of the standard error of measurement (SEM) for each pipeline-parameter configuration. The fixed effects reveal which measurement conditions introduce systematic bias versus random error. The comprehensive 7-way interaction structure identifies the specific parameter combinations where pipelines fail to maintain adequate measurement precision for both primary and secondary estimands.</w:t>
       </w:r>
     </w:p>
     <w:p>
@@ -13284,25 +12497,7 @@
           <w:sz w:val="21"/>
           <w:szCs w:val="21"/>
         </w:rPr>
-        <w:t xml:space="preserve"> Does the benefit of SG over BWFD depend on regression method choice? If significant, main effects are uninterpretable and simple effects </w:t>
-      </w:r>
-      <w:proofErr w:type="gramStart"/>
-      <w:r>
-        <w:rPr>
-          <w:rFonts w:ascii="Helvetica" w:hAnsi="Helvetica" w:cs="Helvetica"/>
-          <w:sz w:val="21"/>
-          <w:szCs w:val="21"/>
-        </w:rPr>
-        <w:t>are required</w:t>
-      </w:r>
-      <w:proofErr w:type="gramEnd"/>
-      <w:r>
-        <w:rPr>
-          <w:rFonts w:ascii="Helvetica" w:hAnsi="Helvetica" w:cs="Helvetica"/>
-          <w:sz w:val="21"/>
-          <w:szCs w:val="21"/>
-        </w:rPr>
-        <w:t>.</w:t>
+        <w:t xml:space="preserve"> Does the benefit of SG over BWFD depend on regression method choice? If significant, main effects are uninterpretable and simple effects are required.</w:t>
       </w:r>
     </w:p>
     <w:p>
@@ -13452,6 +12647,7 @@
           <w:sz w:val="21"/>
           <w:szCs w:val="21"/>
         </w:rPr>
+        <w:lastRenderedPageBreak/>
         <w:t>Simple Effects Analysis (Conditional on Significant Interactions)</w:t>
       </w:r>
     </w:p>
@@ -13542,16 +12738,7 @@
           <w:sz w:val="21"/>
           <w:szCs w:val="21"/>
         </w:rPr>
-        <w:t xml:space="preserve">This approach directly addresses the core research questions: "Can IRLS compensate for BWFD artefacts?" requires comparing BWFD-IRLS against BWFD-OLS (simple effect of regression </w:t>
-      </w:r>
-      <w:r>
-        <w:rPr>
-          <w:rFonts w:ascii="Helvetica" w:hAnsi="Helvetica" w:cs="Helvetica"/>
-          <w:sz w:val="21"/>
-          <w:szCs w:val="21"/>
-        </w:rPr>
-        <w:lastRenderedPageBreak/>
-        <w:t>within BWFD), whilst "Is SG sufficient even with OLS?" requires comparing SG-OLS against BWFD-OLS (simple effect of kinematic derivation within OLS).</w:t>
+        <w:t>This approach directly addresses the core research questions: "Can IRLS compensate for BWFD artefacts?" requires comparing BWFD-IRLS against BWFD-OLS (simple effect of regression within BWFD), whilst "Is SG sufficient even with OLS?" requires comparing SG-OLS against BWFD-OLS (simple effect of kinematic derivation within OLS).</w:t>
       </w:r>
     </w:p>
     <w:p>
@@ -13583,25 +12770,7 @@
           <w:sz w:val="21"/>
           <w:szCs w:val="21"/>
         </w:rPr>
-        <w:t xml:space="preserve">Stage 2 determines whether the global models adequately capture parameter recovery patterns or require conditional analysis for specific parameter regions. We anticipate the global model will not be adequate. The zones of inadequacy reveal where specific pipelines cannot </w:t>
-      </w:r>
-      <w:proofErr w:type="gramStart"/>
-      <w:r>
-        <w:rPr>
-          <w:rFonts w:ascii="Helvetica" w:hAnsi="Helvetica" w:cs="Helvetica"/>
-          <w:sz w:val="21"/>
-          <w:szCs w:val="21"/>
-        </w:rPr>
-        <w:t>be trusted</w:t>
-      </w:r>
-      <w:proofErr w:type="gramEnd"/>
-      <w:r>
-        <w:rPr>
-          <w:rFonts w:ascii="Helvetica" w:hAnsi="Helvetica" w:cs="Helvetica"/>
-          <w:sz w:val="21"/>
-          <w:szCs w:val="21"/>
-        </w:rPr>
-        <w:t xml:space="preserve"> to return results reflecting the underlying generator. Three empirical criteria identify model inadequacy:</w:t>
+        <w:t>Stage 2 determines whether the global models adequately capture parameter recovery patterns or require conditional analysis for specific parameter regions. We anticipate the global model will not be adequate. The zones of inadequacy reveal where specific pipelines cannot be trusted to return results reflecting the underlying generator. Three empirical criteria identify model inadequacy:</w:t>
       </w:r>
     </w:p>
     <w:p>
@@ -13628,25 +12797,7 @@
           <w:sz w:val="21"/>
           <w:szCs w:val="21"/>
         </w:rPr>
-        <w:t xml:space="preserve"> Bootstrap confidence intervals for fixed effect coefficients exceeding ±0.03 indicate that the model's parameter estimates are themselves uncertain at the scale of clinical significance. If a coefficient's 95% confidence interval spans the MDC (0.03), we cannot reliably interpret its contribution to bias prediction - the coefficient might </w:t>
-      </w:r>
-      <w:proofErr w:type="gramStart"/>
-      <w:r>
-        <w:rPr>
-          <w:rFonts w:ascii="Helvetica" w:hAnsi="Helvetica" w:cs="Helvetica"/>
-          <w:sz w:val="21"/>
-          <w:szCs w:val="21"/>
-        </w:rPr>
-        <w:t>plausibly be</w:t>
-      </w:r>
-      <w:proofErr w:type="gramEnd"/>
-      <w:r>
-        <w:rPr>
-          <w:rFonts w:ascii="Helvetica" w:hAnsi="Helvetica" w:cs="Helvetica"/>
-          <w:sz w:val="21"/>
-          <w:szCs w:val="21"/>
-        </w:rPr>
-        <w:t xml:space="preserve"> zero or twice its point estimate, undermining the model's utility for clinical applications (Cook et al., 2026; Fourie et al., 2024).</w:t>
+        <w:t xml:space="preserve"> Bootstrap confidence intervals for fixed effect coefficients exceeding ±0.03 indicate that the model's parameter estimates are themselves uncertain at the scale of clinical significance. If a coefficient's 95% confidence interval spans the MDC (0.03), we cannot reliably interpret its contribution to bias prediction - the coefficient might plausibly be zero or twice its point estimate, undermining the model's utility for clinical applications (Cook et al., 2026; Fourie et al., 2024).</w:t>
       </w:r>
     </w:p>
     <w:p>
@@ -13673,43 +12824,7 @@
           <w:sz w:val="21"/>
           <w:szCs w:val="21"/>
         </w:rPr>
-        <w:t xml:space="preserve"> Systematic deviations in residuals reveal parameter regions where the global models under- or over-predict recovery accuracy. Our initial approach, implemented in the current open-source repository associated with this preregistration, employs Cohen's d &gt; 0.5 for detecting systematic bias, consistent with the conservative medium effect size framework. This threshold </w:t>
-      </w:r>
-      <w:proofErr w:type="gramStart"/>
-      <w:r>
-        <w:rPr>
-          <w:rFonts w:ascii="Helvetica" w:hAnsi="Helvetica" w:cs="Helvetica"/>
-          <w:sz w:val="21"/>
-          <w:szCs w:val="21"/>
-        </w:rPr>
-        <w:t>was chosen</w:t>
-      </w:r>
-      <w:proofErr w:type="gramEnd"/>
-      <w:r>
-        <w:rPr>
-          <w:rFonts w:ascii="Helvetica" w:hAnsi="Helvetica" w:cs="Helvetica"/>
-          <w:sz w:val="21"/>
-          <w:szCs w:val="21"/>
-        </w:rPr>
-        <w:t xml:space="preserve"> for tractability validation using synthetic data during framework development (Weeks 1-2). However, Cohen's d has known limitations for complex LMM structures where variance </w:t>
-      </w:r>
-      <w:proofErr w:type="gramStart"/>
-      <w:r>
-        <w:rPr>
-          <w:rFonts w:ascii="Helvetica" w:hAnsi="Helvetica" w:cs="Helvetica"/>
-          <w:sz w:val="21"/>
-          <w:szCs w:val="21"/>
-        </w:rPr>
-        <w:t>is partitioned</w:t>
-      </w:r>
-      <w:proofErr w:type="gramEnd"/>
-      <w:r>
-        <w:rPr>
-          <w:rFonts w:ascii="Helvetica" w:hAnsi="Helvetica" w:cs="Helvetica"/>
-          <w:sz w:val="21"/>
-          <w:szCs w:val="21"/>
-        </w:rPr>
-        <w:t xml:space="preserve"> across hierarchical levels (Lorah, 2018; Meteyard &amp; Davies, 2020). We therefore anticipate exploring alternative metrics during analysis of the true simulation results, potentially including Nakagawa &amp; Schielzeth's (2013, 2017) marginal R² for variance explained by fixed effects, ΔR²</w:t>
+        <w:t xml:space="preserve"> Systematic deviations in residuals reveal parameter regions where the global models under- or over-predict recovery accuracy. Our initial approach, implemented in the current open-source repository associated with this preregistration, employs Cohen's d &gt; 0.5 for detecting systematic bias, consistent with the conservative medium effect size framework. This threshold was chosen for tractability validation using synthetic data during framework development (Weeks 1-2). However, Cohen's d has known limitations for complex LMM structures where variance is partitioned across hierarchical levels (Lorah, 2018; Meteyard &amp; Davies, 2020). We therefore anticipate exploring alternative metrics during analysis of the true simulation results, potentially including Nakagawa &amp; Schielzeth's (2013, 2017) marginal R² for variance explained by fixed effects, ΔR²</w:t>
       </w:r>
       <w:r>
         <w:rPr>
@@ -13744,25 +12859,7 @@
           <w:sz w:val="21"/>
           <w:szCs w:val="21"/>
         </w:rPr>
-        <w:t xml:space="preserve"> contrasts (Lenth, 2023). Visualisation combined with targeted contrasts will supplement the chosen metric regardless of approach. The specific combination will </w:t>
-      </w:r>
-      <w:proofErr w:type="gramStart"/>
-      <w:r>
-        <w:rPr>
-          <w:rFonts w:ascii="Helvetica" w:hAnsi="Helvetica" w:cs="Helvetica"/>
-          <w:sz w:val="21"/>
-          <w:szCs w:val="21"/>
-        </w:rPr>
-        <w:t>be documented</w:t>
-      </w:r>
-      <w:proofErr w:type="gramEnd"/>
-      <w:r>
-        <w:rPr>
-          <w:rFonts w:ascii="Helvetica" w:hAnsi="Helvetica" w:cs="Helvetica"/>
-          <w:sz w:val="21"/>
-          <w:szCs w:val="21"/>
-        </w:rPr>
-        <w:t xml:space="preserve"> with justification in supplementary materials.</w:t>
+        <w:t xml:space="preserve"> contrasts (Lenth, 2023). Visualisation combined with targeted contrasts will supplement the chosen metric regardless of approach. The specific combination will be documented with justification in supplementary materials.</w:t>
       </w:r>
     </w:p>
     <w:p>
@@ -13807,7 +12904,16 @@
           <w:sz w:val="21"/>
           <w:szCs w:val="21"/>
         </w:rPr>
-        <w:t>These three diagnostic criteria identify parameter regions where pipelines are likely to exhibit SEM ≥ 0.011, warranting conditional analysis. Regions failing any criterion proceed to Stage 3 conditional analysis. Regions meeting all criteria confirm global model adequacy for those measurement conditions.</w:t>
+        <w:t xml:space="preserve">These three diagnostic criteria identify parameter regions where pipelines are likely to exhibit SEM ≥ 0.011, warranting conditional analysis. Regions failing any criterion proceed to Stage 3 </w:t>
+      </w:r>
+      <w:r>
+        <w:rPr>
+          <w:rFonts w:ascii="Helvetica" w:hAnsi="Helvetica" w:cs="Helvetica"/>
+          <w:sz w:val="21"/>
+          <w:szCs w:val="21"/>
+        </w:rPr>
+        <w:lastRenderedPageBreak/>
+        <w:t>conditional analysis. Regions meeting all criteria confirm global model adequacy for those measurement conditions.</w:t>
       </w:r>
     </w:p>
     <w:p>
@@ -13889,7 +12995,6 @@
         <w:rPr>
           <w:rFonts w:ascii="Helvetica" w:eastAsia="Times New Roman" w:hAnsi="Helvetica" w:cs="Helvetica"/>
         </w:rPr>
-        <w:lastRenderedPageBreak/>
         <w:t>Stage 4: Integrated Assessment Framework</w:t>
       </w:r>
     </w:p>
@@ -14255,7 +13360,16 @@
           <w:sz w:val="21"/>
           <w:szCs w:val="21"/>
         </w:rPr>
-        <w:t xml:space="preserve"> The 0.011 threshold derives directly from the MDC framework (Section 3.2): SEM &lt; MDC/2.77 = 0.03/2.77 ≈ 0.011 for 95% confidence. The marginal zone upper bound of 0.020 corresponds to MDC/1.5, providing approximately 80% power to detect the 0.03 effect - still potentially useful for exploratory research but insufficient for definitive clinical applications.</w:t>
+        <w:t xml:space="preserve"> The 0.011 threshold derives directly from the MDC framework (Section 3.2): SEM &lt; MDC/2.77 = 0.03/2.77 ≈ 0.011 for 95% confidence. The marginal zone upper bound </w:t>
+      </w:r>
+      <w:r>
+        <w:rPr>
+          <w:rFonts w:ascii="Helvetica" w:hAnsi="Helvetica" w:cs="Helvetica"/>
+          <w:sz w:val="21"/>
+          <w:szCs w:val="21"/>
+        </w:rPr>
+        <w:lastRenderedPageBreak/>
+        <w:t>of 0.020 corresponds to MDC/1.5, providing approximately 80% power to detect the 0.03 effect - still potentially useful for exploratory research but insufficient for definitive clinical applications.</w:t>
       </w:r>
     </w:p>
     <w:p>
@@ -14499,12 +13613,10 @@
           <w:bdr w:val="none" w:sz="0" w:space="0" w:color="auto" w:frame="1"/>
         </w:rPr>
       </w:pPr>
-      <w:proofErr w:type="gramStart"/>
       <w:r>
         <w:rPr>
           <w:bdr w:val="none" w:sz="0" w:space="0" w:color="auto" w:frame="1"/>
         </w:rPr>
-        <w:lastRenderedPageBreak/>
         <w:t xml:space="preserve">│  </w:t>
       </w:r>
       <w:r>
@@ -14514,7 +13626,6 @@
         </w:rPr>
         <w:t>α</w:t>
       </w:r>
-      <w:proofErr w:type="gramEnd"/>
       <w:r>
         <w:rPr>
           <w:bdr w:val="none" w:sz="0" w:space="0" w:color="auto" w:frame="1"/>
@@ -14557,33 +13668,11 @@
           <w:bdr w:val="none" w:sz="0" w:space="0" w:color="auto" w:frame="1"/>
         </w:rPr>
       </w:pPr>
-      <w:proofErr w:type="gramStart"/>
       <w:r>
         <w:rPr>
           <w:bdr w:val="none" w:sz="0" w:space="0" w:color="auto" w:frame="1"/>
         </w:rPr>
-        <w:t>│  (</w:t>
-      </w:r>
-      <w:proofErr w:type="gramEnd"/>
-      <w:r>
-        <w:rPr>
-          <w:bdr w:val="none" w:sz="0" w:space="0" w:color="auto" w:frame="1"/>
-        </w:rPr>
-        <w:t>white) │ BWFD-IRLS ?  BWFD-</w:t>
-      </w:r>
-      <w:proofErr w:type="gramStart"/>
-      <w:r>
-        <w:rPr>
-          <w:bdr w:val="none" w:sz="0" w:space="0" w:color="auto" w:frame="1"/>
-        </w:rPr>
-        <w:t>LMLS ?</w:t>
-      </w:r>
-      <w:proofErr w:type="gramEnd"/>
-      <w:r>
-        <w:rPr>
-          <w:bdr w:val="none" w:sz="0" w:space="0" w:color="auto" w:frame="1"/>
-        </w:rPr>
-        <w:t xml:space="preserve">  BWFD-OLS </w:t>
+        <w:t xml:space="preserve">│  (white) │ BWFD-IRLS ?  BWFD-LMLS ?  BWFD-OLS </w:t>
       </w:r>
       <w:r>
         <w:rPr>
@@ -14624,7 +13713,6 @@
           <w:bdr w:val="none" w:sz="0" w:space="0" w:color="auto" w:frame="1"/>
         </w:rPr>
       </w:pPr>
-      <w:proofErr w:type="gramStart"/>
       <w:r>
         <w:rPr>
           <w:bdr w:val="none" w:sz="0" w:space="0" w:color="auto" w:frame="1"/>
@@ -14638,7 +13726,6 @@
         </w:rPr>
         <w:t>α</w:t>
       </w:r>
-      <w:proofErr w:type="gramEnd"/>
       <w:r>
         <w:rPr>
           <w:bdr w:val="none" w:sz="0" w:space="0" w:color="auto" w:frame="1"/>
@@ -14681,19 +13768,11 @@
           <w:bdr w:val="none" w:sz="0" w:space="0" w:color="auto" w:frame="1"/>
         </w:rPr>
       </w:pPr>
-      <w:proofErr w:type="gramStart"/>
       <w:r>
         <w:rPr>
           <w:bdr w:val="none" w:sz="0" w:space="0" w:color="auto" w:frame="1"/>
         </w:rPr>
-        <w:t>│  (</w:t>
-      </w:r>
-      <w:proofErr w:type="gramEnd"/>
-      <w:r>
-        <w:rPr>
-          <w:bdr w:val="none" w:sz="0" w:space="0" w:color="auto" w:frame="1"/>
-        </w:rPr>
-        <w:t>pink)  │ BWFD-IRLS ~  BWFD-LMLS ~  BWFD-OLS ~         │</w:t>
+        <w:t>│  (pink)  │ BWFD-IRLS ~  BWFD-LMLS ~  BWFD-OLS ~         │</w:t>
       </w:r>
     </w:p>
     <w:p>
@@ -14721,7 +13800,6 @@
           <w:bdr w:val="none" w:sz="0" w:space="0" w:color="auto" w:frame="1"/>
         </w:rPr>
       </w:pPr>
-      <w:proofErr w:type="gramStart"/>
       <w:r>
         <w:rPr>
           <w:bdr w:val="none" w:sz="0" w:space="0" w:color="auto" w:frame="1"/>
@@ -14735,7 +13813,6 @@
         </w:rPr>
         <w:t>α</w:t>
       </w:r>
-      <w:proofErr w:type="gramEnd"/>
       <w:r>
         <w:rPr>
           <w:bdr w:val="none" w:sz="0" w:space="0" w:color="auto" w:frame="1"/>
@@ -14752,19 +13829,11 @@
           <w:bdr w:val="none" w:sz="0" w:space="0" w:color="auto" w:frame="1"/>
         </w:rPr>
       </w:pPr>
-      <w:proofErr w:type="gramStart"/>
       <w:r>
         <w:rPr>
           <w:bdr w:val="none" w:sz="0" w:space="0" w:color="auto" w:frame="1"/>
         </w:rPr>
-        <w:t>│  (</w:t>
-      </w:r>
-      <w:proofErr w:type="gramEnd"/>
-      <w:r>
-        <w:rPr>
-          <w:bdr w:val="none" w:sz="0" w:space="0" w:color="auto" w:frame="1"/>
-        </w:rPr>
-        <w:t>red+)  │ BWFD methods may exhibit competence          │</w:t>
+        <w:t>│  (red+)  │ BWFD methods may exhibit competence          │</w:t>
       </w:r>
     </w:p>
     <w:p>
@@ -15074,25 +14143,7 @@
           <w:sz w:val="21"/>
           <w:szCs w:val="21"/>
         </w:rPr>
-        <w:t xml:space="preserve"> (i.e. white noise), which exhibit high frequency components that </w:t>
-      </w:r>
-      <w:proofErr w:type="gramStart"/>
-      <w:r>
-        <w:rPr>
-          <w:rFonts w:ascii="Helvetica" w:hAnsi="Helvetica" w:cs="Helvetica"/>
-          <w:sz w:val="21"/>
-          <w:szCs w:val="21"/>
-        </w:rPr>
-        <w:t>are amplified</w:t>
-      </w:r>
-      <w:proofErr w:type="gramEnd"/>
-      <w:r>
-        <w:rPr>
-          <w:rFonts w:ascii="Helvetica" w:hAnsi="Helvetica" w:cs="Helvetica"/>
-          <w:sz w:val="21"/>
-          <w:szCs w:val="21"/>
-        </w:rPr>
-        <w:t xml:space="preserve"> in successive finite differences differentiation steps</w:t>
+        <w:t xml:space="preserve"> (i.e. white noise), which exhibit high frequency components that are amplified in successive finite differences differentiation steps</w:t>
       </w:r>
     </w:p>
     <w:p>
@@ -15114,6 +14165,7 @@
           <w:sz w:val="21"/>
           <w:szCs w:val="21"/>
         </w:rPr>
+        <w:lastRenderedPageBreak/>
         <w:t xml:space="preserve">BWFD may achieve equivalent performance at high </w:t>
       </w:r>
       <w:r>
@@ -15131,18 +14183,8 @@
           <w:sz w:val="21"/>
           <w:szCs w:val="21"/>
         </w:rPr>
-        <w:t xml:space="preserve"> (red/black noise) where high-frequency content </w:t>
-      </w:r>
-      <w:proofErr w:type="gramStart"/>
-      <w:r>
-        <w:rPr>
-          <w:rFonts w:ascii="Helvetica" w:hAnsi="Helvetica" w:cs="Helvetica"/>
-          <w:sz w:val="21"/>
-          <w:szCs w:val="21"/>
-        </w:rPr>
-        <w:t>is suppressed</w:t>
-      </w:r>
-      <w:proofErr w:type="gramEnd"/>
+        <w:t xml:space="preserve"> (red/black noise) where high-frequency content is suppressed</w:t>
+      </w:r>
     </w:p>
     <w:p>
       <w:pPr>
@@ -15377,7 +14419,6 @@
         <w:rPr>
           <w:rFonts w:ascii="Helvetica" w:eastAsia="Times New Roman" w:hAnsi="Helvetica" w:cs="Helvetica"/>
         </w:rPr>
-        <w:lastRenderedPageBreak/>
         <w:t>7. Empirical Validation Across Movement Databases</w:t>
       </w:r>
     </w:p>
@@ -15396,25 +14437,7 @@
           <w:sz w:val="21"/>
           <w:szCs w:val="21"/>
         </w:rPr>
-        <w:t xml:space="preserve">An additional validation stage </w:t>
-      </w:r>
-      <w:proofErr w:type="gramStart"/>
-      <w:r>
-        <w:rPr>
-          <w:rFonts w:ascii="Helvetica" w:hAnsi="Helvetica" w:cs="Helvetica"/>
-          <w:sz w:val="21"/>
-          <w:szCs w:val="21"/>
-        </w:rPr>
-        <w:t>tests</w:t>
-      </w:r>
-      <w:proofErr w:type="gramEnd"/>
-      <w:r>
-        <w:rPr>
-          <w:rFonts w:ascii="Helvetica" w:hAnsi="Helvetica" w:cs="Helvetica"/>
-          <w:sz w:val="21"/>
-          <w:szCs w:val="21"/>
-        </w:rPr>
-        <w:t xml:space="preserve"> the characterisation framework developed in Stages 1-4 by testing whether simulation-based predictions accurately forecast pipeline performance in real-world movement data. This empirical validation requires no ground truth </w:t>
+        <w:t xml:space="preserve">An additional validation stage tests the characterisation framework developed in Stages 1-4 by testing whether simulation-based predictions accurately forecast pipeline performance in real-world movement data. This empirical validation requires no ground truth </w:t>
       </w:r>
       <w:r>
         <w:rPr>
@@ -15431,25 +14454,7 @@
           <w:sz w:val="21"/>
           <w:szCs w:val="21"/>
         </w:rPr>
-        <w:t xml:space="preserve"> values. Instead, we </w:t>
-      </w:r>
-      <w:proofErr w:type="gramStart"/>
-      <w:r>
-        <w:rPr>
-          <w:rFonts w:ascii="Helvetica" w:hAnsi="Helvetica" w:cs="Helvetica"/>
-          <w:sz w:val="21"/>
-          <w:szCs w:val="21"/>
-        </w:rPr>
-        <w:t>test</w:t>
-      </w:r>
-      <w:proofErr w:type="gramEnd"/>
-      <w:r>
-        <w:rPr>
-          <w:rFonts w:ascii="Helvetica" w:hAnsi="Helvetica" w:cs="Helvetica"/>
-          <w:sz w:val="21"/>
-          <w:szCs w:val="21"/>
-        </w:rPr>
-        <w:t xml:space="preserve"> whether the magnitude of divergence between pipelines in real data matches the divergence predicted by the simulation framework given each database's recovered noise characteristics.</w:t>
+        <w:t xml:space="preserve"> values. Instead, we test whether the magnitude of divergence between pipelines in real data matches the divergence predicted by the simulation framework given each database's recovered noise characteristics.</w:t>
       </w:r>
     </w:p>
     <w:p>
@@ -15609,7 +14614,6 @@
         </w:rPr>
         <w:t>β</w:t>
       </w:r>
-      <w:proofErr w:type="gramStart"/>
       <w:r>
         <w:rPr>
           <w:rFonts w:ascii="Helvetica" w:hAnsi="Helvetica" w:cs="Helvetica"/>
@@ -15619,7 +14623,6 @@
         </w:rPr>
         <w:t>rec,P</w:t>
       </w:r>
-      <w:proofErr w:type="gramEnd"/>
       <w:r>
         <w:rPr>
           <w:rStyle w:val="Emphasis"/>
@@ -15746,7 +14749,6 @@
         </w:rPr>
         <w:t>β</w:t>
       </w:r>
-      <w:proofErr w:type="gramStart"/>
       <w:r>
         <w:rPr>
           <w:rFonts w:ascii="Helvetica" w:hAnsi="Helvetica" w:cs="Helvetica"/>
@@ -15756,7 +14758,6 @@
         </w:rPr>
         <w:t>rec,P</w:t>
       </w:r>
-      <w:proofErr w:type="gramEnd"/>
       <w:r>
         <w:rPr>
           <w:rStyle w:val="Emphasis"/>
@@ -15981,25 +14982,7 @@
           <w:sz w:val="21"/>
           <w:szCs w:val="21"/>
         </w:rPr>
-        <w:t xml:space="preserve">), and test whether the full pattern, a constellation, of 15 pairwise comparisons </w:t>
-      </w:r>
-      <w:proofErr w:type="gramStart"/>
-      <w:r>
-        <w:rPr>
-          <w:rFonts w:ascii="Helvetica" w:hAnsi="Helvetica" w:cs="Helvetica"/>
-          <w:sz w:val="21"/>
-          <w:szCs w:val="21"/>
-        </w:rPr>
-        <w:t>matches</w:t>
-      </w:r>
-      <w:proofErr w:type="gramEnd"/>
-      <w:r>
-        <w:rPr>
-          <w:rFonts w:ascii="Helvetica" w:hAnsi="Helvetica" w:cs="Helvetica"/>
-          <w:sz w:val="21"/>
-          <w:szCs w:val="21"/>
-        </w:rPr>
-        <w:t xml:space="preserve"> between prediction and observation.</w:t>
+        <w:t>), and test whether the full pattern, a constellation, of 15 pairwise comparisons matches between prediction and observation.</w:t>
       </w:r>
     </w:p>
     <w:p>
@@ -16051,7 +15034,16 @@
           <w:sz w:val="21"/>
           <w:szCs w:val="21"/>
         </w:rPr>
-        <w:t>, VGF) characterisation meaningfully represents the data (see 7.3 Noise Characterisation Protocol). Results may reveal that only subsets of databases with consistent profiles can be adequately characterised by any examined pipeline.</w:t>
+        <w:t xml:space="preserve">, VGF) characterisation meaningfully represents the data (see 7.3 Noise </w:t>
+      </w:r>
+      <w:r>
+        <w:rPr>
+          <w:rFonts w:ascii="Helvetica" w:hAnsi="Helvetica" w:cs="Helvetica"/>
+          <w:sz w:val="21"/>
+          <w:szCs w:val="21"/>
+        </w:rPr>
+        <w:lastRenderedPageBreak/>
+        <w:t>Characterisation Protocol). Results may reveal that only subsets of databases with consistent profiles can be adequately characterised by any examined pipeline.</w:t>
       </w:r>
     </w:p>
     <w:p>
@@ -16173,25 +15165,7 @@
           <w:sz w:val="21"/>
           <w:szCs w:val="21"/>
         </w:rPr>
-        <w:t xml:space="preserve"> increases high frequency components </w:t>
-      </w:r>
-      <w:proofErr w:type="gramStart"/>
-      <w:r>
-        <w:rPr>
-          <w:rFonts w:ascii="Helvetica" w:hAnsi="Helvetica" w:cs="Helvetica"/>
-          <w:sz w:val="21"/>
-          <w:szCs w:val="21"/>
-        </w:rPr>
-        <w:t>are progressively reduced</w:t>
-      </w:r>
-      <w:proofErr w:type="gramEnd"/>
-      <w:r>
-        <w:rPr>
-          <w:rFonts w:ascii="Helvetica" w:hAnsi="Helvetica" w:cs="Helvetica"/>
-          <w:sz w:val="21"/>
-          <w:szCs w:val="21"/>
-        </w:rPr>
-        <w:t xml:space="preserve"> in power, such that black noise (</w:t>
+        <w:t xml:space="preserve"> increases high frequency components are progressively reduced in power, such that black noise (</w:t>
       </w:r>
       <w:r>
         <w:rPr>
@@ -16226,25 +15200,7 @@
           <w:sz w:val="21"/>
           <w:szCs w:val="21"/>
         </w:rPr>
-        <w:t xml:space="preserve">The role of sampling rate in pipeline performance remains theoretically ambiguous. Higher sampling rates may improve fidelity to the underlying generator through better temporal resolution and reduced aliasing or may increase effective noise by capturing more high-frequency noise components. The simulation framework will characterise this sampling rate × noise interaction, and empirical validation will </w:t>
-      </w:r>
-      <w:proofErr w:type="gramStart"/>
-      <w:r>
-        <w:rPr>
-          <w:rFonts w:ascii="Helvetica" w:hAnsi="Helvetica" w:cs="Helvetica"/>
-          <w:sz w:val="21"/>
-          <w:szCs w:val="21"/>
-        </w:rPr>
-        <w:t>test</w:t>
-      </w:r>
-      <w:proofErr w:type="gramEnd"/>
-      <w:r>
-        <w:rPr>
-          <w:rFonts w:ascii="Helvetica" w:hAnsi="Helvetica" w:cs="Helvetica"/>
-          <w:sz w:val="21"/>
-          <w:szCs w:val="21"/>
-        </w:rPr>
-        <w:t xml:space="preserve"> whether these characterisations generalise to real data.</w:t>
+        <w:t>The role of sampling rate in pipeline performance remains theoretically ambiguous. Higher sampling rates may improve fidelity to the underlying generator through better temporal resolution and reduced aliasing or may increase effective noise by capturing more high-frequency noise components. The simulation framework will characterise this sampling rate × noise interaction, and empirical validation will test whether these characterisations generalise to real data.</w:t>
       </w:r>
     </w:p>
     <w:p>
@@ -16416,7 +15372,6 @@
           <w:sz w:val="21"/>
           <w:szCs w:val="21"/>
         </w:rPr>
-        <w:lastRenderedPageBreak/>
         <w:t>Empirical test</w:t>
       </w:r>
       <w:r>
@@ -16975,6 +15930,7 @@
           <w:sz w:val="21"/>
           <w:szCs w:val="21"/>
         </w:rPr>
+        <w:lastRenderedPageBreak/>
         <w:t>Anticipated simulation prediction</w:t>
       </w:r>
       <w:r>
@@ -17721,7 +16677,6 @@
                 <w:sz w:val="21"/>
                 <w:szCs w:val="21"/>
               </w:rPr>
-              <w:lastRenderedPageBreak/>
               <w:t>Dhieb et al. 2022</w:t>
             </w:r>
           </w:p>
@@ -18468,25 +17423,7 @@
           <w:sz w:val="21"/>
           <w:szCs w:val="21"/>
         </w:rPr>
-        <w:t xml:space="preserve">For each trial </w:t>
-      </w:r>
-      <w:proofErr w:type="gramStart"/>
-      <w:r>
-        <w:rPr>
-          <w:rFonts w:ascii="Helvetica" w:hAnsi="Helvetica" w:cs="Helvetica"/>
-          <w:sz w:val="21"/>
-          <w:szCs w:val="21"/>
-        </w:rPr>
-        <w:t>in a given</w:t>
-      </w:r>
-      <w:proofErr w:type="gramEnd"/>
-      <w:r>
-        <w:rPr>
-          <w:rFonts w:ascii="Helvetica" w:hAnsi="Helvetica" w:cs="Helvetica"/>
-          <w:sz w:val="21"/>
-          <w:szCs w:val="21"/>
-        </w:rPr>
-        <w:t xml:space="preserve"> database, we calculate </w:t>
+        <w:t xml:space="preserve">For each trial in a given database, we calculate </w:t>
       </w:r>
       <w:r>
         <w:rPr>
@@ -18556,6 +17493,7 @@
           <w:sz w:val="21"/>
           <w:szCs w:val="21"/>
         </w:rPr>
+        <w:lastRenderedPageBreak/>
         <w:t>Power law calculation:</w:t>
       </w:r>
       <w:r>
@@ -19492,16 +18430,7 @@
           <w:sz w:val="21"/>
           <w:szCs w:val="21"/>
         </w:rPr>
-        <w:t xml:space="preserve">) provides superior variance reduction whilst maintaining spectral resolution compared to periodogram methods. This approach enables direct quantification of both noise </w:t>
-      </w:r>
-      <w:r>
-        <w:rPr>
-          <w:rFonts w:ascii="Helvetica" w:hAnsi="Helvetica" w:cs="Helvetica"/>
-          <w:sz w:val="21"/>
-          <w:szCs w:val="21"/>
-        </w:rPr>
-        <w:lastRenderedPageBreak/>
-        <w:t>colour (</w:t>
+        <w:t>) provides superior variance reduction whilst maintaining spectral resolution compared to periodogram methods. This approach enables direct quantification of both noise colour (</w:t>
       </w:r>
       <w:r>
         <w:rPr>
@@ -19665,25 +18594,7 @@
           <w:sz w:val="21"/>
           <w:szCs w:val="21"/>
         </w:rPr>
-        <w:t xml:space="preserve">: Mid-frequency range where spectral estimates are most </w:t>
-      </w:r>
-      <w:proofErr w:type="gramStart"/>
-      <w:r>
-        <w:rPr>
-          <w:rFonts w:ascii="Helvetica" w:hAnsi="Helvetica" w:cs="Helvetica"/>
-          <w:sz w:val="21"/>
-          <w:szCs w:val="21"/>
-        </w:rPr>
-        <w:t>reliable</w:t>
-      </w:r>
-      <w:proofErr w:type="gramEnd"/>
-      <w:r>
-        <w:rPr>
-          <w:rFonts w:ascii="Helvetica" w:hAnsi="Helvetica" w:cs="Helvetica"/>
-          <w:sz w:val="21"/>
-          <w:szCs w:val="21"/>
-        </w:rPr>
-        <w:t>, avoiding low-frequency edge effects and high-frequency aliasing zones. Specific bounds will be determined based on each database's sampling rate and movement characteristics.</w:t>
+        <w:t>: Mid-frequency range where spectral estimates are most reliable, avoiding low-frequency edge effects and high-frequency aliasing zones. Specific bounds will be determined based on each database's sampling rate and movement characteristics.</w:t>
       </w:r>
     </w:p>
     <w:p>
@@ -19742,25 +18653,7 @@
           <w:sz w:val="21"/>
           <w:szCs w:val="21"/>
         </w:rPr>
-        <w:t xml:space="preserve">Alternative spectral estimation approaches (e.g., Welch's method, parametric autoregressive models) may be employed for specific trials where multitaper assumptions </w:t>
-      </w:r>
-      <w:proofErr w:type="gramStart"/>
-      <w:r>
-        <w:rPr>
-          <w:rFonts w:ascii="Helvetica" w:hAnsi="Helvetica" w:cs="Helvetica"/>
-          <w:sz w:val="21"/>
-          <w:szCs w:val="21"/>
-        </w:rPr>
-        <w:t>are violated</w:t>
-      </w:r>
-      <w:proofErr w:type="gramEnd"/>
-      <w:r>
-        <w:rPr>
-          <w:rFonts w:ascii="Helvetica" w:hAnsi="Helvetica" w:cs="Helvetica"/>
-          <w:sz w:val="21"/>
-          <w:szCs w:val="21"/>
-        </w:rPr>
-        <w:t xml:space="preserve"> (e.g., short trajectories, and for potentially strongly non-stationary processes such as bee locomotion).</w:t>
+        <w:t>Alternative spectral estimation approaches (e.g., Welch's method, parametric autoregressive models) may be employed for specific trials where multitaper assumptions are violated (e.g., short trajectories, and for potentially strongly non-stationary processes such as bee locomotion).</w:t>
       </w:r>
     </w:p>
     <w:p>
@@ -19857,6 +18750,7 @@
           <w:sz w:val="21"/>
           <w:szCs w:val="21"/>
         </w:rPr>
+        <w:lastRenderedPageBreak/>
         <w:t>Methodological Transparency:</w:t>
       </w:r>
       <w:r>
@@ -19865,25 +18759,7 @@
           <w:sz w:val="21"/>
           <w:szCs w:val="21"/>
         </w:rPr>
-        <w:t xml:space="preserve"> Complete noise characterisation details, including any deviations from the preferred multitaper approach and their justifications, will </w:t>
-      </w:r>
-      <w:proofErr w:type="gramStart"/>
-      <w:r>
-        <w:rPr>
-          <w:rFonts w:ascii="Helvetica" w:hAnsi="Helvetica" w:cs="Helvetica"/>
-          <w:sz w:val="21"/>
-          <w:szCs w:val="21"/>
-        </w:rPr>
-        <w:t>be documented</w:t>
-      </w:r>
-      <w:proofErr w:type="gramEnd"/>
-      <w:r>
-        <w:rPr>
-          <w:rFonts w:ascii="Helvetica" w:hAnsi="Helvetica" w:cs="Helvetica"/>
-          <w:sz w:val="21"/>
-          <w:szCs w:val="21"/>
-        </w:rPr>
-        <w:t xml:space="preserve"> in database-specific appendices. This transparency enables assessment of whether characterisation quality affects validation outcomes and provides methodological context for interpreting results.</w:t>
+        <w:t xml:space="preserve"> Complete noise characterisation details, including any deviations from the preferred multitaper approach and their justifications, will be documented in database-specific appendices. This transparency enables assessment of whether characterisation quality affects validation outcomes and provides methodological context for interpreting results.</w:t>
       </w:r>
     </w:p>
     <w:p>
@@ -19975,25 +18851,7 @@
           <w:sz w:val="21"/>
           <w:szCs w:val="21"/>
         </w:rPr>
-        <w:t xml:space="preserve">, VGF) determined in Section 7.3 </w:t>
-      </w:r>
-      <w:proofErr w:type="gramStart"/>
-      <w:r>
-        <w:rPr>
-          <w:rFonts w:ascii="Helvetica" w:hAnsi="Helvetica" w:cs="Helvetica"/>
-          <w:sz w:val="21"/>
-          <w:szCs w:val="21"/>
-        </w:rPr>
-        <w:t>is used</w:t>
-      </w:r>
-      <w:proofErr w:type="gramEnd"/>
-      <w:r>
-        <w:rPr>
-          <w:rFonts w:ascii="Helvetica" w:hAnsi="Helvetica" w:cs="Helvetica"/>
-          <w:sz w:val="21"/>
-          <w:szCs w:val="21"/>
-        </w:rPr>
-        <w:t xml:space="preserve"> to query the Stage 1-4 models. We then contrast each pipeline, which for each pipeline pair (P, Q), this yields:</w:t>
+        <w:t>, VGF) determined in Section 7.3 is used to query the Stage 1-4 models. We then contrast each pipeline, which for each pipeline pair (P, Q), this yields:</w:t>
       </w:r>
     </w:p>
     <w:p>
@@ -20045,27 +18903,7 @@
           <w:sz w:val="21"/>
           <w:szCs w:val="21"/>
         </w:rPr>
-        <w:t>(</w:t>
-      </w:r>
-      <w:proofErr w:type="gramStart"/>
-      <w:r>
-        <w:rPr>
-          <w:rStyle w:val="Strong"/>
-          <w:rFonts w:ascii="Helvetica" w:hAnsi="Helvetica" w:cs="Helvetica"/>
-          <w:sz w:val="21"/>
-          <w:szCs w:val="21"/>
-        </w:rPr>
-        <w:t>P,Q</w:t>
-      </w:r>
-      <w:proofErr w:type="gramEnd"/>
-      <w:r>
-        <w:rPr>
-          <w:rStyle w:val="Strong"/>
-          <w:rFonts w:ascii="Helvetica" w:hAnsi="Helvetica" w:cs="Helvetica"/>
-          <w:sz w:val="21"/>
-          <w:szCs w:val="21"/>
-        </w:rPr>
-        <w:t>)</w:t>
+        <w:t>(P,Q)</w:t>
       </w:r>
       <w:r>
         <w:rPr>
@@ -20179,7 +19017,6 @@
         </w:rPr>
         <w:t>β</w:t>
       </w:r>
-      <w:proofErr w:type="gramStart"/>
       <w:r>
         <w:rPr>
           <w:rFonts w:ascii="Helvetica" w:hAnsi="Helvetica" w:cs="Helvetica"/>
@@ -20189,7 +19026,6 @@
         </w:rPr>
         <w:t>rec,P</w:t>
       </w:r>
-      <w:proofErr w:type="gramEnd"/>
       <w:r>
         <w:rPr>
           <w:rFonts w:ascii="Helvetica" w:hAnsi="Helvetica" w:cs="Helvetica"/>
@@ -20248,27 +19084,7 @@
           <w:sz w:val="21"/>
           <w:szCs w:val="21"/>
         </w:rPr>
-        <w:t>(</w:t>
-      </w:r>
-      <w:proofErr w:type="gramStart"/>
-      <w:r>
-        <w:rPr>
-          <w:rStyle w:val="Strong"/>
-          <w:rFonts w:ascii="Helvetica" w:hAnsi="Helvetica" w:cs="Helvetica"/>
-          <w:sz w:val="21"/>
-          <w:szCs w:val="21"/>
-        </w:rPr>
-        <w:t>P,Q</w:t>
-      </w:r>
-      <w:proofErr w:type="gramEnd"/>
-      <w:r>
-        <w:rPr>
-          <w:rStyle w:val="Strong"/>
-          <w:rFonts w:ascii="Helvetica" w:hAnsi="Helvetica" w:cs="Helvetica"/>
-          <w:sz w:val="21"/>
-          <w:szCs w:val="21"/>
-        </w:rPr>
-        <w:t>)</w:t>
+        <w:t>(P,Q)</w:t>
       </w:r>
       <w:r>
         <w:rPr>
@@ -20381,7 +19197,6 @@
         </w:rPr>
         <w:t>β</w:t>
       </w:r>
-      <w:proofErr w:type="gramStart"/>
       <w:r>
         <w:rPr>
           <w:rFonts w:ascii="Helvetica" w:hAnsi="Helvetica" w:cs="Helvetica"/>
@@ -20391,7 +19206,6 @@
         </w:rPr>
         <w:t>rec,P</w:t>
       </w:r>
-      <w:proofErr w:type="gramEnd"/>
       <w:r>
         <w:rPr>
           <w:rFonts w:ascii="Helvetica" w:hAnsi="Helvetica" w:cs="Helvetica"/>
@@ -20465,7 +19279,6 @@
           <w:sz w:val="21"/>
           <w:szCs w:val="21"/>
         </w:rPr>
-        <w:lastRenderedPageBreak/>
         <w:t>Framework Validation:</w:t>
       </w:r>
       <w:r>
@@ -20474,25 +19287,7 @@
           <w:sz w:val="21"/>
           <w:szCs w:val="21"/>
         </w:rPr>
-        <w:t xml:space="preserve"> The simulation framework </w:t>
-      </w:r>
-      <w:proofErr w:type="gramStart"/>
-      <w:r>
-        <w:rPr>
-          <w:rFonts w:ascii="Helvetica" w:hAnsi="Helvetica" w:cs="Helvetica"/>
-          <w:sz w:val="21"/>
-          <w:szCs w:val="21"/>
-        </w:rPr>
-        <w:t>is validated</w:t>
-      </w:r>
-      <w:proofErr w:type="gramEnd"/>
-      <w:r>
-        <w:rPr>
-          <w:rFonts w:ascii="Helvetica" w:hAnsi="Helvetica" w:cs="Helvetica"/>
-          <w:sz w:val="21"/>
-          <w:szCs w:val="21"/>
-        </w:rPr>
-        <w:t xml:space="preserve"> when the predicted constellation matches the observed constellation. The unknown true </w:t>
+        <w:t xml:space="preserve"> The simulation framework is validated when the predicted constellation matches the observed constellation. The unknown true </w:t>
       </w:r>
       <w:r>
         <w:rPr>
@@ -20681,25 +19476,7 @@
           <w:sz w:val="21"/>
           <w:szCs w:val="21"/>
         </w:rPr>
-        <w:t>(</w:t>
-      </w:r>
-      <w:proofErr w:type="gramStart"/>
-      <w:r>
-        <w:rPr>
-          <w:rFonts w:ascii="Helvetica" w:hAnsi="Helvetica" w:cs="Helvetica"/>
-          <w:sz w:val="21"/>
-          <w:szCs w:val="21"/>
-        </w:rPr>
-        <w:t>P,Q</w:t>
-      </w:r>
-      <w:proofErr w:type="gramEnd"/>
-      <w:r>
-        <w:rPr>
-          <w:rFonts w:ascii="Helvetica" w:hAnsi="Helvetica" w:cs="Helvetica"/>
-          <w:sz w:val="21"/>
-          <w:szCs w:val="21"/>
-        </w:rPr>
-        <w:t>) for each pipeline pair</w:t>
+        <w:t>(P,Q) for each pipeline pair</w:t>
       </w:r>
     </w:p>
     <w:p>
@@ -20820,6 +19597,7 @@
           <w:sz w:val="21"/>
           <w:szCs w:val="21"/>
         </w:rPr>
+        <w:lastRenderedPageBreak/>
         <w:t>Per-trial pairwise divergence</w:t>
       </w:r>
       <w:r>
@@ -20855,27 +19633,7 @@
           <w:sz w:val="21"/>
           <w:szCs w:val="21"/>
         </w:rPr>
-        <w:t>(</w:t>
-      </w:r>
-      <w:proofErr w:type="gramStart"/>
-      <w:r>
-        <w:rPr>
-          <w:rStyle w:val="Emphasis"/>
-          <w:rFonts w:ascii="Helvetica" w:hAnsi="Helvetica" w:cs="Helvetica"/>
-          <w:sz w:val="21"/>
-          <w:szCs w:val="21"/>
-        </w:rPr>
-        <w:t>P,Q</w:t>
-      </w:r>
-      <w:proofErr w:type="gramEnd"/>
-      <w:r>
-        <w:rPr>
-          <w:rStyle w:val="Emphasis"/>
-          <w:rFonts w:ascii="Helvetica" w:hAnsi="Helvetica" w:cs="Helvetica"/>
-          <w:sz w:val="21"/>
-          <w:szCs w:val="21"/>
-        </w:rPr>
-        <w:t>) = β</w:t>
+        <w:t>(P,Q) = β</w:t>
       </w:r>
       <w:r>
         <w:rPr>
@@ -20977,7 +19735,6 @@
         </w:rPr>
         <w:t>β</w:t>
       </w:r>
-      <w:proofErr w:type="gramStart"/>
       <w:r>
         <w:rPr>
           <w:rFonts w:ascii="Helvetica" w:hAnsi="Helvetica" w:cs="Helvetica"/>
@@ -20987,7 +19744,6 @@
         </w:rPr>
         <w:t>rec,P</w:t>
       </w:r>
-      <w:proofErr w:type="gramEnd"/>
       <w:r>
         <w:rPr>
           <w:rFonts w:ascii="Helvetica" w:hAnsi="Helvetica" w:cs="Helvetica"/>
@@ -21138,43 +19894,7 @@
           <w:sz w:val="21"/>
           <w:szCs w:val="21"/>
         </w:rPr>
-        <w:t xml:space="preserve">Lin's Concordance Correlation Coefficient (CCC; Lin, 1989) represents our current implementation for quantifying agreement between constellations of predicted and observed pairwise differences, with validated MATLAB code tested against R's </w:t>
-      </w:r>
-      <w:proofErr w:type="gramStart"/>
-      <w:r>
-        <w:rPr>
-          <w:rFonts w:ascii="Helvetica" w:hAnsi="Helvetica" w:cs="Helvetica"/>
-          <w:sz w:val="21"/>
-          <w:szCs w:val="21"/>
-        </w:rPr>
-        <w:t>DescTools::</w:t>
-      </w:r>
-      <w:proofErr w:type="gramEnd"/>
-      <w:r>
-        <w:rPr>
-          <w:rFonts w:ascii="Helvetica" w:hAnsi="Helvetica" w:cs="Helvetica"/>
-          <w:sz w:val="21"/>
-          <w:szCs w:val="21"/>
-        </w:rPr>
-        <w:t xml:space="preserve">CCC() (|difference| &lt; 0.001 across all test cases including Lin's original worked examples). Unlike Pearson's correlation, CCC penalises systematic bias - high CCC requires values to fall on the identity line (i.e., the 45° line where predicted = observed), not merely correlate. For each trial, the </w:t>
-      </w:r>
-      <w:proofErr w:type="gramStart"/>
-      <w:r>
-        <w:rPr>
-          <w:rFonts w:ascii="Helvetica" w:hAnsi="Helvetica" w:cs="Helvetica"/>
-          <w:sz w:val="21"/>
-          <w:szCs w:val="21"/>
-        </w:rPr>
-        <w:t>15</w:t>
-      </w:r>
-      <w:proofErr w:type="gramEnd"/>
-      <w:r>
-        <w:rPr>
-          <w:rFonts w:ascii="Helvetica" w:hAnsi="Helvetica" w:cs="Helvetica"/>
-          <w:sz w:val="21"/>
-          <w:szCs w:val="21"/>
-        </w:rPr>
-        <w:t xml:space="preserve"> predicted pairwise differences from the simulation form a vector; the 15 observed differences form a corresponding vector. CCC between these vectors tests whether simulation predictions accurately forecast empirical observations. Comparison of CCC with the Pearson correlation will reveal systematic bias.</w:t>
+        <w:t>Lin's Concordance Correlation Coefficient (CCC; Lin, 1989) represents our current implementation for quantifying agreement between constellations of predicted and observed pairwise differences, with validated MATLAB code tested against R's DescTools::CCC() (|difference| &lt; 0.001 across all test cases including Lin's original worked examples). Unlike Pearson's correlation, CCC penalises systematic bias - high CCC requires values to fall on the identity line (i.e., the 45° line where predicted = observed), not merely correlate. For each trial, the 15 predicted pairwise differences from the simulation form a vector; the 15 observed differences form a corresponding vector. CCC between these vectors tests whether simulation predictions accurately forecast empirical observations. Comparison of CCC with the Pearson correlation will reveal systematic bias.</w:t>
       </w:r>
     </w:p>
     <w:p>
@@ -21348,7 +20068,6 @@
         </w:rPr>
         <w:t>μ</w:t>
       </w:r>
-      <w:proofErr w:type="gramStart"/>
       <w:r>
         <w:rPr>
           <w:rFonts w:ascii="Helvetica" w:hAnsi="Helvetica" w:cs="Helvetica"/>
@@ -21364,16 +20083,7 @@
           <w:sz w:val="21"/>
           <w:szCs w:val="21"/>
         </w:rPr>
-        <w:t>)²</w:t>
-      </w:r>
-      <w:proofErr w:type="gramEnd"/>
-      <w:r>
-        <w:rPr>
-          <w:rFonts w:ascii="Helvetica" w:hAnsi="Helvetica" w:cs="Helvetica"/>
-          <w:sz w:val="21"/>
-          <w:szCs w:val="21"/>
-        </w:rPr>
-        <w:t>)</w:t>
+        <w:t>)²)</w:t>
       </w:r>
     </w:p>
     <w:p>
@@ -21490,44 +20200,363 @@
           <w:sz w:val="21"/>
           <w:szCs w:val="21"/>
         </w:rPr>
+        <w:t>However, CCC has known limitations for non-normally distributed data and with small sample sizes where asymptotic variance approximations may be unreliable (Lin, 1989 recommends n ≥ 20). We therefore anticipate exploring alternative or supplementary agreement metrics during analysis, potentially including: Lin's (2000) Total Deviation Index (TDI) which directly quantifies the boundary within which a specified proportion (e.g., 90%) of differences fall, Coverage Probability (CP) testing the proportion of predictions within ±0.03 of observed values (directly aligned with our MDC framework), or Intra-class Correlation variants for absolute agreement where repeated measures structure is appropriate. Bland-Altman limits of agreement plots will supplement whichever primary metric is selected, providing visual assessment of systematic bias and precision. The specific combination will be documented with justification in supplementary materials.</w:t>
+      </w:r>
+    </w:p>
+    <w:p>
+      <w:pPr>
+        <w:pStyle w:val="NormalWeb"/>
+        <w:rPr>
+          <w:rFonts w:ascii="Helvetica" w:hAnsi="Helvetica" w:cs="Helvetica"/>
+          <w:sz w:val="21"/>
+          <w:szCs w:val="21"/>
+        </w:rPr>
+      </w:pPr>
+      <w:r>
+        <w:rPr>
+          <w:rStyle w:val="Strong"/>
+          <w:rFonts w:ascii="Helvetica" w:hAnsi="Helvetica" w:cs="Helvetica"/>
+          <w:sz w:val="21"/>
+          <w:szCs w:val="21"/>
+        </w:rPr>
+        <w:t>Additional metrics:</w:t>
+      </w:r>
+      <w:r>
+        <w:rPr>
+          <w:rFonts w:ascii="Helvetica" w:hAnsi="Helvetica" w:cs="Helvetica"/>
+          <w:sz w:val="21"/>
+          <w:szCs w:val="21"/>
+        </w:rPr>
+        <w:t xml:space="preserve"> - </w:t>
+      </w:r>
+      <w:r>
+        <w:rPr>
+          <w:rStyle w:val="Strong"/>
+          <w:rFonts w:ascii="Helvetica" w:hAnsi="Helvetica" w:cs="Helvetica"/>
+          <w:sz w:val="21"/>
+          <w:szCs w:val="21"/>
+        </w:rPr>
+        <w:t>Mean absolute error</w:t>
+      </w:r>
+      <w:r>
+        <w:rPr>
+          <w:rFonts w:ascii="Helvetica" w:hAnsi="Helvetica" w:cs="Helvetica"/>
+          <w:sz w:val="21"/>
+          <w:szCs w:val="21"/>
+        </w:rPr>
+        <w:t>: MAE = mean(|Δ</w:t>
+      </w:r>
+      <w:r>
+        <w:rPr>
+          <w:rFonts w:ascii="Helvetica" w:hAnsi="Helvetica" w:cs="Helvetica"/>
+          <w:i/>
+          <w:sz w:val="21"/>
+          <w:szCs w:val="21"/>
+        </w:rPr>
+        <w:t>β</w:t>
+      </w:r>
+      <w:r>
+        <w:rPr>
+          <w:rFonts w:ascii="Helvetica" w:hAnsi="Helvetica" w:cs="Helvetica"/>
+          <w:sz w:val="21"/>
+          <w:szCs w:val="21"/>
+          <w:vertAlign w:val="subscript"/>
+        </w:rPr>
+        <w:t>predicted</w:t>
+      </w:r>
+      <w:r>
+        <w:rPr>
+          <w:rStyle w:val="Emphasis"/>
+          <w:rFonts w:ascii="Helvetica" w:hAnsi="Helvetica" w:cs="Helvetica"/>
+          <w:sz w:val="21"/>
+          <w:szCs w:val="21"/>
+        </w:rPr>
+        <w:t xml:space="preserve"> − Δβ</w:t>
+      </w:r>
+      <w:r>
+        <w:rPr>
+          <w:rFonts w:ascii="Helvetica" w:hAnsi="Helvetica" w:cs="Helvetica"/>
+          <w:sz w:val="21"/>
+          <w:szCs w:val="21"/>
+          <w:vertAlign w:val="subscript"/>
+        </w:rPr>
+        <w:t>observed</w:t>
+      </w:r>
+      <w:r>
+        <w:rPr>
+          <w:rFonts w:ascii="Helvetica" w:hAnsi="Helvetica" w:cs="Helvetica"/>
+          <w:sz w:val="21"/>
+          <w:szCs w:val="21"/>
+        </w:rPr>
+        <w:t xml:space="preserve">|) across all 15 pairs - </w:t>
+      </w:r>
+      <w:r>
+        <w:rPr>
+          <w:rStyle w:val="Strong"/>
+          <w:rFonts w:ascii="Helvetica" w:hAnsi="Helvetica" w:cs="Helvetica"/>
+          <w:sz w:val="21"/>
+          <w:szCs w:val="21"/>
+        </w:rPr>
+        <w:t>Pattern preservation</w:t>
+      </w:r>
+      <w:r>
+        <w:rPr>
+          <w:rFonts w:ascii="Helvetica" w:hAnsi="Helvetica" w:cs="Helvetica"/>
+          <w:sz w:val="21"/>
+          <w:szCs w:val="21"/>
+        </w:rPr>
+        <w:t xml:space="preserve">: Spearman rank correlation (are pipeline rankings preserved?) - </w:t>
+      </w:r>
+      <w:r>
+        <w:rPr>
+          <w:rStyle w:val="Strong"/>
+          <w:rFonts w:ascii="Helvetica" w:hAnsi="Helvetica" w:cs="Helvetica"/>
+          <w:sz w:val="21"/>
+          <w:szCs w:val="21"/>
+        </w:rPr>
+        <w:t>SEM agreement</w:t>
+      </w:r>
+      <w:r>
+        <w:rPr>
+          <w:rFonts w:ascii="Helvetica" w:hAnsi="Helvetica" w:cs="Helvetica"/>
+          <w:sz w:val="21"/>
+          <w:szCs w:val="21"/>
+        </w:rPr>
+        <w:t>: |SEM</w:t>
+      </w:r>
+      <w:r>
+        <w:rPr>
+          <w:rFonts w:ascii="Helvetica" w:hAnsi="Helvetica" w:cs="Helvetica"/>
+          <w:sz w:val="21"/>
+          <w:szCs w:val="21"/>
+          <w:vertAlign w:val="subscript"/>
+        </w:rPr>
+        <w:t>predicted</w:t>
+      </w:r>
+      <w:r>
+        <w:rPr>
+          <w:rFonts w:ascii="Helvetica" w:hAnsi="Helvetica" w:cs="Helvetica"/>
+          <w:sz w:val="21"/>
+          <w:szCs w:val="21"/>
+        </w:rPr>
+        <w:t>(P) − SEM</w:t>
+      </w:r>
+      <w:r>
+        <w:rPr>
+          <w:rFonts w:ascii="Helvetica" w:hAnsi="Helvetica" w:cs="Helvetica"/>
+          <w:sz w:val="21"/>
+          <w:szCs w:val="21"/>
+          <w:vertAlign w:val="subscript"/>
+        </w:rPr>
+        <w:t>observed</w:t>
+      </w:r>
+      <w:r>
+        <w:rPr>
+          <w:rFonts w:ascii="Helvetica" w:hAnsi="Helvetica" w:cs="Helvetica"/>
+          <w:sz w:val="21"/>
+          <w:szCs w:val="21"/>
+        </w:rPr>
+        <w:t xml:space="preserve">(P)| &lt; tolerance for each pipeline - </w:t>
+      </w:r>
+      <w:r>
+        <w:rPr>
+          <w:rStyle w:val="Strong"/>
+          <w:rFonts w:ascii="Helvetica" w:hAnsi="Helvetica" w:cs="Helvetica"/>
+          <w:sz w:val="21"/>
+          <w:szCs w:val="21"/>
+        </w:rPr>
+        <w:t>Scenario classification accuracy</w:t>
+      </w:r>
+      <w:r>
+        <w:rPr>
+          <w:rFonts w:ascii="Helvetica" w:hAnsi="Helvetica" w:cs="Helvetica"/>
+          <w:sz w:val="21"/>
+          <w:szCs w:val="21"/>
+        </w:rPr>
+        <w:t>: Does empirical behaviour match predicted scenario (A/B/C)?</w:t>
+      </w:r>
+    </w:p>
+    <w:p>
+      <w:pPr>
+        <w:pStyle w:val="NormalWeb"/>
+        <w:rPr>
+          <w:rFonts w:ascii="Helvetica" w:hAnsi="Helvetica" w:cs="Helvetica"/>
+          <w:sz w:val="21"/>
+          <w:szCs w:val="21"/>
+        </w:rPr>
+      </w:pPr>
+      <w:r>
+        <w:rPr>
+          <w:rStyle w:val="Strong"/>
+          <w:rFonts w:ascii="Helvetica" w:hAnsi="Helvetica" w:cs="Helvetica"/>
+          <w:sz w:val="21"/>
+          <w:szCs w:val="21"/>
+        </w:rPr>
+        <w:t>Second-order structural validation.</w:t>
+      </w:r>
+      <w:r>
+        <w:rPr>
+          <w:rFonts w:ascii="Helvetica" w:hAnsi="Helvetica" w:cs="Helvetica"/>
+          <w:sz w:val="21"/>
+          <w:szCs w:val="21"/>
+        </w:rPr>
+        <w:t xml:space="preserve"> The ‘first-order’ metrics above each evaluate a single trial in isolation. They cannot detect whether the </w:t>
+      </w:r>
+      <w:r>
+        <w:rPr>
+          <w:rStyle w:val="Emphasis"/>
+          <w:rFonts w:ascii="Helvetica" w:hAnsi="Helvetica" w:cs="Helvetica"/>
+          <w:sz w:val="21"/>
+          <w:szCs w:val="21"/>
+        </w:rPr>
+        <w:t>structure</w:t>
+      </w:r>
+      <w:r>
+        <w:rPr>
+          <w:rFonts w:ascii="Helvetica" w:hAnsi="Helvetica" w:cs="Helvetica"/>
+          <w:sz w:val="21"/>
+          <w:szCs w:val="21"/>
+        </w:rPr>
+        <w:t xml:space="preserve"> of pipeline behaviour across the parameter space is preserved, for instance whether the Scenario A/B transition boundary falls at the predicted (</w:t>
+      </w:r>
+      <w:r>
+        <w:rPr>
+          <w:rFonts w:ascii="Helvetica" w:hAnsi="Helvetica" w:cs="Helvetica"/>
+          <w:i/>
+          <w:sz w:val="21"/>
+          <w:szCs w:val="21"/>
+        </w:rPr>
+        <w:t>α</w:t>
+      </w:r>
+      <w:r>
+        <w:rPr>
+          <w:rFonts w:ascii="Helvetica" w:hAnsi="Helvetica" w:cs="Helvetica"/>
+          <w:sz w:val="21"/>
+          <w:szCs w:val="21"/>
+        </w:rPr>
+        <w:t xml:space="preserve">, </w:t>
+      </w:r>
+      <w:r>
+        <w:rPr>
+          <w:rFonts w:ascii="Helvetica" w:hAnsi="Helvetica" w:cs="Helvetica"/>
+          <w:i/>
+          <w:sz w:val="21"/>
+          <w:szCs w:val="21"/>
+        </w:rPr>
+        <w:t>σ</w:t>
+      </w:r>
+      <w:r>
+        <w:rPr>
+          <w:rFonts w:ascii="Helvetica" w:hAnsi="Helvetica" w:cs="Helvetica"/>
+          <w:sz w:val="21"/>
+          <w:szCs w:val="21"/>
+        </w:rPr>
+        <w:t>) coordinate. A simulation could achieve excellent per-trial CCC everywhere while mischaracterising which noise regimes produce similar constellations.</w:t>
+      </w:r>
+    </w:p>
+    <w:p>
+      <w:pPr>
+        <w:pStyle w:val="NormalWeb"/>
+        <w:rPr>
+          <w:rFonts w:ascii="Helvetica" w:hAnsi="Helvetica" w:cs="Helvetica"/>
+          <w:sz w:val="21"/>
+          <w:szCs w:val="21"/>
+        </w:rPr>
+      </w:pPr>
+      <w:r>
+        <w:rPr>
+          <w:rFonts w:ascii="Helvetica" w:hAnsi="Helvetica" w:cs="Helvetica"/>
+          <w:sz w:val="21"/>
+          <w:szCs w:val="21"/>
+        </w:rPr>
         <w:lastRenderedPageBreak/>
-        <w:t xml:space="preserve">However, CCC has known limitations for non-normally distributed data and with small sample sizes where asymptotic variance approximations may be unreliable (Lin, 1989 recommends n ≥ 20). We therefore anticipate exploring alternative or supplementary agreement metrics during analysis, potentially including: Lin's (2000) Total Deviation Index (TDI) which directly quantifies the boundary within which a specified proportion (e.g., 90%) of differences fall, Coverage Probability (CP) testing the proportion of predictions within ±0.03 of observed values (directly aligned with our MDC framework), or Intra-class Correlation variants for absolute agreement where repeated measures structure is appropriate. Bland-Altman limits of agreement plots will supplement whichever primary metric </w:t>
-      </w:r>
-      <w:proofErr w:type="gramStart"/>
-      <w:r>
-        <w:rPr>
-          <w:rFonts w:ascii="Helvetica" w:hAnsi="Helvetica" w:cs="Helvetica"/>
-          <w:sz w:val="21"/>
-          <w:szCs w:val="21"/>
-        </w:rPr>
-        <w:t>is selected</w:t>
-      </w:r>
-      <w:proofErr w:type="gramEnd"/>
-      <w:r>
-        <w:rPr>
-          <w:rFonts w:ascii="Helvetica" w:hAnsi="Helvetica" w:cs="Helvetica"/>
-          <w:sz w:val="21"/>
-          <w:szCs w:val="21"/>
-        </w:rPr>
-        <w:t xml:space="preserve">, providing visual assessment of systematic bias and precision. The specific combination will </w:t>
-      </w:r>
-      <w:proofErr w:type="gramStart"/>
-      <w:r>
-        <w:rPr>
-          <w:rFonts w:ascii="Helvetica" w:hAnsi="Helvetica" w:cs="Helvetica"/>
-          <w:sz w:val="21"/>
-          <w:szCs w:val="21"/>
-        </w:rPr>
-        <w:t>be documented</w:t>
-      </w:r>
-      <w:proofErr w:type="gramEnd"/>
-      <w:r>
-        <w:rPr>
-          <w:rFonts w:ascii="Helvetica" w:hAnsi="Helvetica" w:cs="Helvetica"/>
-          <w:sz w:val="21"/>
-          <w:szCs w:val="21"/>
-        </w:rPr>
-        <w:t xml:space="preserve"> with justification in supplementary materials.</w:t>
+        <w:t>Representational Similarity Analysis (RSA; Kriegeskorte et al., 2008) addresses this by comparing trial-to-trial dissimilarity structure rather than trial-level values. For each pair of trials (</w:t>
+      </w:r>
+      <w:r>
+        <w:rPr>
+          <w:rStyle w:val="Emphasis"/>
+          <w:rFonts w:ascii="Helvetica" w:hAnsi="Helvetica" w:cs="Helvetica"/>
+          <w:sz w:val="21"/>
+          <w:szCs w:val="21"/>
+        </w:rPr>
+        <w:t>i</w:t>
+      </w:r>
+      <w:r>
+        <w:rPr>
+          <w:rFonts w:ascii="Helvetica" w:hAnsi="Helvetica" w:cs="Helvetica"/>
+          <w:sz w:val="21"/>
+          <w:szCs w:val="21"/>
+        </w:rPr>
+        <w:t xml:space="preserve">, </w:t>
+      </w:r>
+      <w:r>
+        <w:rPr>
+          <w:rStyle w:val="Emphasis"/>
+          <w:rFonts w:ascii="Helvetica" w:hAnsi="Helvetica" w:cs="Helvetica"/>
+          <w:sz w:val="21"/>
+          <w:szCs w:val="21"/>
+        </w:rPr>
+        <w:t>j</w:t>
+      </w:r>
+      <w:r>
+        <w:rPr>
+          <w:rFonts w:ascii="Helvetica" w:hAnsi="Helvetica" w:cs="Helvetica"/>
+          <w:sz w:val="21"/>
+          <w:szCs w:val="21"/>
+        </w:rPr>
+        <w:t xml:space="preserve">), Euclidean distance between their 15-element constellation vectors yields a trial × trial Representational Dissimilarity Matrix (RDM) for both simulation and empirical data. The Mantel test (Mantel, 1967) then correlates the upper triangles of these RDMs via Spearman rank correlation with permutation-based inference (10,000 permutations). This approach is diagnostic at scenario transition boundaries: if pipelines shift their behaviour at a different noise coordinate than predicted, the block structure of the two RDMs will diverge. </w:t>
+      </w:r>
+    </w:p>
+    <w:p>
+      <w:pPr>
+        <w:pStyle w:val="NormalWeb"/>
+        <w:rPr>
+          <w:rFonts w:ascii="Helvetica" w:hAnsi="Helvetica" w:cs="Helvetica"/>
+          <w:sz w:val="21"/>
+          <w:szCs w:val="21"/>
+        </w:rPr>
+      </w:pPr>
+      <w:r>
+        <w:rPr>
+          <w:rFonts w:ascii="Helvetica" w:hAnsi="Helvetica" w:cs="Helvetica"/>
+          <w:sz w:val="21"/>
+          <w:szCs w:val="21"/>
+        </w:rPr>
+        <w:t>This application falls within the class of hypothesis for which Legendre et al. (2015) affirm the Mantel test remains appropriate, and Somers and Jackson (2022) confirm that earlier concerns about error rates are largely attributable to inappropriate distance metrics. A flat RDM, one in which constellations barely vary across noise coordinates, is itself a diagnostic signature of many-to-one compression, bearing directly on pipeline invertibility (Section 7.7).</w:t>
+      </w:r>
+    </w:p>
+    <w:p>
+      <w:pPr>
+        <w:pStyle w:val="NormalWeb"/>
+        <w:rPr>
+          <w:rFonts w:ascii="Helvetica" w:hAnsi="Helvetica" w:cs="Helvetica"/>
+          <w:sz w:val="21"/>
+          <w:szCs w:val="21"/>
+        </w:rPr>
+      </w:pPr>
+      <w:r>
+        <w:rPr>
+          <w:rFonts w:ascii="Helvetica" w:hAnsi="Helvetica" w:cs="Helvetica"/>
+          <w:sz w:val="21"/>
+          <w:szCs w:val="21"/>
+        </w:rPr>
+        <w:t xml:space="preserve">RSA is treated as exploratory supplementary analysis by default. Where first-order metrics leave scenario transition boundaries ambiguous, RSA may be recruited to carry interpretive weight with as </w:t>
+      </w:r>
+      <w:r>
+        <w:rPr>
+          <w:rFonts w:ascii="Helvetica" w:hAnsi="Helvetica" w:cs="Helvetica"/>
+          <w:sz w:val="21"/>
+          <w:szCs w:val="21"/>
+        </w:rPr>
+        <w:t>specified</w:t>
+      </w:r>
+      <w:r>
+        <w:rPr>
+          <w:rFonts w:ascii="Helvetica" w:hAnsi="Helvetica" w:cs="Helvetica"/>
+          <w:sz w:val="21"/>
+          <w:szCs w:val="21"/>
+        </w:rPr>
+        <w:t xml:space="preserve"> above. </w:t>
       </w:r>
     </w:p>
     <w:p>
@@ -21546,487 +20575,6 @@
           <w:sz w:val="21"/>
           <w:szCs w:val="21"/>
         </w:rPr>
-        <w:t>Additional metrics:</w:t>
-      </w:r>
-      <w:r>
-        <w:rPr>
-          <w:rFonts w:ascii="Helvetica" w:hAnsi="Helvetica" w:cs="Helvetica"/>
-          <w:sz w:val="21"/>
-          <w:szCs w:val="21"/>
-        </w:rPr>
-        <w:t xml:space="preserve"> - </w:t>
-      </w:r>
-      <w:r>
-        <w:rPr>
-          <w:rStyle w:val="Strong"/>
-          <w:rFonts w:ascii="Helvetica" w:hAnsi="Helvetica" w:cs="Helvetica"/>
-          <w:sz w:val="21"/>
-          <w:szCs w:val="21"/>
-        </w:rPr>
-        <w:t>Mean absolute error</w:t>
-      </w:r>
-      <w:r>
-        <w:rPr>
-          <w:rFonts w:ascii="Helvetica" w:hAnsi="Helvetica" w:cs="Helvetica"/>
-          <w:sz w:val="21"/>
-          <w:szCs w:val="21"/>
-        </w:rPr>
-        <w:t xml:space="preserve">: MAE = </w:t>
-      </w:r>
-      <w:proofErr w:type="gramStart"/>
-      <w:r>
-        <w:rPr>
-          <w:rFonts w:ascii="Helvetica" w:hAnsi="Helvetica" w:cs="Helvetica"/>
-          <w:sz w:val="21"/>
-          <w:szCs w:val="21"/>
-        </w:rPr>
-        <w:t>mean(</w:t>
-      </w:r>
-      <w:proofErr w:type="gramEnd"/>
-      <w:r>
-        <w:rPr>
-          <w:rFonts w:ascii="Helvetica" w:hAnsi="Helvetica" w:cs="Helvetica"/>
-          <w:sz w:val="21"/>
-          <w:szCs w:val="21"/>
-        </w:rPr>
-        <w:t>|Δ</w:t>
-      </w:r>
-      <w:r>
-        <w:rPr>
-          <w:rFonts w:ascii="Helvetica" w:hAnsi="Helvetica" w:cs="Helvetica"/>
-          <w:i/>
-          <w:sz w:val="21"/>
-          <w:szCs w:val="21"/>
-        </w:rPr>
-        <w:t>β</w:t>
-      </w:r>
-      <w:r>
-        <w:rPr>
-          <w:rFonts w:ascii="Helvetica" w:hAnsi="Helvetica" w:cs="Helvetica"/>
-          <w:sz w:val="21"/>
-          <w:szCs w:val="21"/>
-          <w:vertAlign w:val="subscript"/>
-        </w:rPr>
-        <w:t>predicted</w:t>
-      </w:r>
-      <w:r>
-        <w:rPr>
-          <w:rStyle w:val="Emphasis"/>
-          <w:rFonts w:ascii="Helvetica" w:hAnsi="Helvetica" w:cs="Helvetica"/>
-          <w:sz w:val="21"/>
-          <w:szCs w:val="21"/>
-        </w:rPr>
-        <w:t xml:space="preserve"> − Δβ</w:t>
-      </w:r>
-      <w:r>
-        <w:rPr>
-          <w:rFonts w:ascii="Helvetica" w:hAnsi="Helvetica" w:cs="Helvetica"/>
-          <w:sz w:val="21"/>
-          <w:szCs w:val="21"/>
-          <w:vertAlign w:val="subscript"/>
-        </w:rPr>
-        <w:t>observed</w:t>
-      </w:r>
-      <w:r>
-        <w:rPr>
-          <w:rFonts w:ascii="Helvetica" w:hAnsi="Helvetica" w:cs="Helvetica"/>
-          <w:sz w:val="21"/>
-          <w:szCs w:val="21"/>
-        </w:rPr>
-        <w:t xml:space="preserve">|) across all 15 pairs - </w:t>
-      </w:r>
-      <w:r>
-        <w:rPr>
-          <w:rStyle w:val="Strong"/>
-          <w:rFonts w:ascii="Helvetica" w:hAnsi="Helvetica" w:cs="Helvetica"/>
-          <w:sz w:val="21"/>
-          <w:szCs w:val="21"/>
-        </w:rPr>
-        <w:t>Pattern preservation</w:t>
-      </w:r>
-      <w:r>
-        <w:rPr>
-          <w:rFonts w:ascii="Helvetica" w:hAnsi="Helvetica" w:cs="Helvetica"/>
-          <w:sz w:val="21"/>
-          <w:szCs w:val="21"/>
-        </w:rPr>
-        <w:t xml:space="preserve">: Spearman rank correlation (are pipeline rankings preserved?) - </w:t>
-      </w:r>
-      <w:r>
-        <w:rPr>
-          <w:rStyle w:val="Strong"/>
-          <w:rFonts w:ascii="Helvetica" w:hAnsi="Helvetica" w:cs="Helvetica"/>
-          <w:sz w:val="21"/>
-          <w:szCs w:val="21"/>
-        </w:rPr>
-        <w:t>SEM agreement</w:t>
-      </w:r>
-      <w:r>
-        <w:rPr>
-          <w:rFonts w:ascii="Helvetica" w:hAnsi="Helvetica" w:cs="Helvetica"/>
-          <w:sz w:val="21"/>
-          <w:szCs w:val="21"/>
-        </w:rPr>
-        <w:t>: |SEM</w:t>
-      </w:r>
-      <w:r>
-        <w:rPr>
-          <w:rFonts w:ascii="Helvetica" w:hAnsi="Helvetica" w:cs="Helvetica"/>
-          <w:sz w:val="21"/>
-          <w:szCs w:val="21"/>
-          <w:vertAlign w:val="subscript"/>
-        </w:rPr>
-        <w:t>predicted</w:t>
-      </w:r>
-      <w:r>
-        <w:rPr>
-          <w:rFonts w:ascii="Helvetica" w:hAnsi="Helvetica" w:cs="Helvetica"/>
-          <w:sz w:val="21"/>
-          <w:szCs w:val="21"/>
-        </w:rPr>
-        <w:t>(P) − SEM</w:t>
-      </w:r>
-      <w:r>
-        <w:rPr>
-          <w:rFonts w:ascii="Helvetica" w:hAnsi="Helvetica" w:cs="Helvetica"/>
-          <w:sz w:val="21"/>
-          <w:szCs w:val="21"/>
-          <w:vertAlign w:val="subscript"/>
-        </w:rPr>
-        <w:t>observed</w:t>
-      </w:r>
-      <w:r>
-        <w:rPr>
-          <w:rFonts w:ascii="Helvetica" w:hAnsi="Helvetica" w:cs="Helvetica"/>
-          <w:sz w:val="21"/>
-          <w:szCs w:val="21"/>
-        </w:rPr>
-        <w:t xml:space="preserve">(P)| &lt; tolerance for each pipeline - </w:t>
-      </w:r>
-      <w:r>
-        <w:rPr>
-          <w:rStyle w:val="Strong"/>
-          <w:rFonts w:ascii="Helvetica" w:hAnsi="Helvetica" w:cs="Helvetica"/>
-          <w:sz w:val="21"/>
-          <w:szCs w:val="21"/>
-        </w:rPr>
-        <w:t>Scenario classification accuracy</w:t>
-      </w:r>
-      <w:r>
-        <w:rPr>
-          <w:rFonts w:ascii="Helvetica" w:hAnsi="Helvetica" w:cs="Helvetica"/>
-          <w:sz w:val="21"/>
-          <w:szCs w:val="21"/>
-        </w:rPr>
-        <w:t>: Does empirical behaviour match predicted scenario (A/B/C)?</w:t>
-      </w:r>
-    </w:p>
-    <w:p>
-      <w:pPr>
-        <w:pStyle w:val="NormalWeb"/>
-        <w:rPr>
-          <w:rFonts w:ascii="Helvetica" w:hAnsi="Helvetica" w:cs="Helvetica"/>
-          <w:sz w:val="21"/>
-          <w:szCs w:val="21"/>
-        </w:rPr>
-      </w:pPr>
-      <w:r>
-        <w:rPr>
-          <w:rStyle w:val="Strong"/>
-          <w:rFonts w:ascii="Helvetica" w:hAnsi="Helvetica" w:cs="Helvetica"/>
-          <w:sz w:val="21"/>
-          <w:szCs w:val="21"/>
-        </w:rPr>
-        <w:t>Second-order structural validation.</w:t>
-      </w:r>
-      <w:r>
-        <w:rPr>
-          <w:rFonts w:ascii="Helvetica" w:hAnsi="Helvetica" w:cs="Helvetica"/>
-          <w:sz w:val="21"/>
-          <w:szCs w:val="21"/>
-        </w:rPr>
-        <w:t xml:space="preserve"> The ‘</w:t>
-      </w:r>
-      <w:proofErr w:type="gramStart"/>
-      <w:r>
-        <w:rPr>
-          <w:rFonts w:ascii="Helvetica" w:hAnsi="Helvetica" w:cs="Helvetica"/>
-          <w:sz w:val="21"/>
-          <w:szCs w:val="21"/>
-        </w:rPr>
-        <w:t>first-order</w:t>
-      </w:r>
-      <w:proofErr w:type="gramEnd"/>
-      <w:r>
-        <w:rPr>
-          <w:rFonts w:ascii="Helvetica" w:hAnsi="Helvetica" w:cs="Helvetica"/>
-          <w:sz w:val="21"/>
-          <w:szCs w:val="21"/>
-        </w:rPr>
-        <w:t xml:space="preserve">’ metrics above each evaluate a single trial in isolation. They cannot detect whether the </w:t>
-      </w:r>
-      <w:r>
-        <w:rPr>
-          <w:rStyle w:val="Emphasis"/>
-          <w:rFonts w:ascii="Helvetica" w:hAnsi="Helvetica" w:cs="Helvetica"/>
-          <w:sz w:val="21"/>
-          <w:szCs w:val="21"/>
-        </w:rPr>
-        <w:t>structure</w:t>
-      </w:r>
-      <w:r>
-        <w:rPr>
-          <w:rFonts w:ascii="Helvetica" w:hAnsi="Helvetica" w:cs="Helvetica"/>
-          <w:sz w:val="21"/>
-          <w:szCs w:val="21"/>
-        </w:rPr>
-        <w:t xml:space="preserve"> of pipeline behaviour across the parameter space </w:t>
-      </w:r>
-      <w:proofErr w:type="gramStart"/>
-      <w:r>
-        <w:rPr>
-          <w:rFonts w:ascii="Helvetica" w:hAnsi="Helvetica" w:cs="Helvetica"/>
-          <w:sz w:val="21"/>
-          <w:szCs w:val="21"/>
-        </w:rPr>
-        <w:t>is preserved</w:t>
-      </w:r>
-      <w:proofErr w:type="gramEnd"/>
-      <w:r>
-        <w:rPr>
-          <w:rFonts w:ascii="Helvetica" w:hAnsi="Helvetica" w:cs="Helvetica"/>
-          <w:sz w:val="21"/>
-          <w:szCs w:val="21"/>
-        </w:rPr>
-        <w:t>, for instance whether the Scenario A/B transition boundary falls at the predicted (</w:t>
-      </w:r>
-      <w:r>
-        <w:rPr>
-          <w:rFonts w:ascii="Helvetica" w:hAnsi="Helvetica" w:cs="Helvetica"/>
-          <w:i/>
-          <w:sz w:val="21"/>
-          <w:szCs w:val="21"/>
-        </w:rPr>
-        <w:t>α</w:t>
-      </w:r>
-      <w:r>
-        <w:rPr>
-          <w:rFonts w:ascii="Helvetica" w:hAnsi="Helvetica" w:cs="Helvetica"/>
-          <w:sz w:val="21"/>
-          <w:szCs w:val="21"/>
-        </w:rPr>
-        <w:t xml:space="preserve">, </w:t>
-      </w:r>
-      <w:r>
-        <w:rPr>
-          <w:rFonts w:ascii="Helvetica" w:hAnsi="Helvetica" w:cs="Helvetica"/>
-          <w:i/>
-          <w:sz w:val="21"/>
-          <w:szCs w:val="21"/>
-        </w:rPr>
-        <w:t>σ</w:t>
-      </w:r>
-      <w:r>
-        <w:rPr>
-          <w:rFonts w:ascii="Helvetica" w:hAnsi="Helvetica" w:cs="Helvetica"/>
-          <w:sz w:val="21"/>
-          <w:szCs w:val="21"/>
-        </w:rPr>
-        <w:t>) coordinate. A simulation could achieve excellent per-trial CCC everywhere while mischaracterising which noise regimes produce similar constellations.</w:t>
-      </w:r>
-    </w:p>
-    <w:p>
-      <w:pPr>
-        <w:pStyle w:val="NormalWeb"/>
-        <w:rPr>
-          <w:rFonts w:ascii="Helvetica" w:hAnsi="Helvetica" w:cs="Helvetica"/>
-          <w:sz w:val="21"/>
-          <w:szCs w:val="21"/>
-        </w:rPr>
-      </w:pPr>
-      <w:r>
-        <w:rPr>
-          <w:rFonts w:ascii="Helvetica" w:hAnsi="Helvetica" w:cs="Helvetica"/>
-          <w:sz w:val="21"/>
-          <w:szCs w:val="21"/>
-        </w:rPr>
-        <w:t>Representational Similarity Analysis (RSA; Kriegeskorte et al., 2008) addresses this by comparing trial-to-trial dissimilarity structure rather than trial-level values. For each pair of trials (</w:t>
-      </w:r>
-      <w:r>
-        <w:rPr>
-          <w:rStyle w:val="Emphasis"/>
-          <w:rFonts w:ascii="Helvetica" w:hAnsi="Helvetica" w:cs="Helvetica"/>
-          <w:sz w:val="21"/>
-          <w:szCs w:val="21"/>
-        </w:rPr>
-        <w:t>i</w:t>
-      </w:r>
-      <w:r>
-        <w:rPr>
-          <w:rFonts w:ascii="Helvetica" w:hAnsi="Helvetica" w:cs="Helvetica"/>
-          <w:sz w:val="21"/>
-          <w:szCs w:val="21"/>
-        </w:rPr>
-        <w:t xml:space="preserve">, </w:t>
-      </w:r>
-      <w:r>
-        <w:rPr>
-          <w:rStyle w:val="Emphasis"/>
-          <w:rFonts w:ascii="Helvetica" w:hAnsi="Helvetica" w:cs="Helvetica"/>
-          <w:sz w:val="21"/>
-          <w:szCs w:val="21"/>
-        </w:rPr>
-        <w:t>j</w:t>
-      </w:r>
-      <w:r>
-        <w:rPr>
-          <w:rFonts w:ascii="Helvetica" w:hAnsi="Helvetica" w:cs="Helvetica"/>
-          <w:sz w:val="21"/>
-          <w:szCs w:val="21"/>
-        </w:rPr>
-        <w:t xml:space="preserve">), Euclidean distance between their 15-element constellation vectors yields a trial × trial Representational Dissimilarity Matrix (RDM) for both simulation and empirical data. The Mantel test (Mantel, 1967) then correlates the upper triangles of these RDMs via Spearman rank correlation with permutation-based inference (10,000 permutations). This approach is diagnostic at scenario transition boundaries: if pipelines shift their behaviour at a different noise coordinate than predicted, the block structure of the two RDMs will diverge. </w:t>
-      </w:r>
-    </w:p>
-    <w:p>
-      <w:pPr>
-        <w:pStyle w:val="NormalWeb"/>
-        <w:rPr>
-          <w:rFonts w:ascii="Helvetica" w:hAnsi="Helvetica" w:cs="Helvetica"/>
-          <w:sz w:val="21"/>
-          <w:szCs w:val="21"/>
-        </w:rPr>
-      </w:pPr>
-      <w:r>
-        <w:rPr>
-          <w:rFonts w:ascii="Helvetica" w:hAnsi="Helvetica" w:cs="Helvetica"/>
-          <w:sz w:val="21"/>
-          <w:szCs w:val="21"/>
-        </w:rPr>
-        <w:t xml:space="preserve">This application falls within the class of hypothesis for which Legendre et al. (2015) affirm the Mantel test remains appropriate, and Somers and Jackson (2022) confirm that earlier concerns about error rates are </w:t>
-      </w:r>
-      <w:proofErr w:type="gramStart"/>
-      <w:r>
-        <w:rPr>
-          <w:rFonts w:ascii="Helvetica" w:hAnsi="Helvetica" w:cs="Helvetica"/>
-          <w:sz w:val="21"/>
-          <w:szCs w:val="21"/>
-        </w:rPr>
-        <w:t>largely attributable</w:t>
-      </w:r>
-      <w:proofErr w:type="gramEnd"/>
-      <w:r>
-        <w:rPr>
-          <w:rFonts w:ascii="Helvetica" w:hAnsi="Helvetica" w:cs="Helvetica"/>
-          <w:sz w:val="21"/>
-          <w:szCs w:val="21"/>
-        </w:rPr>
-        <w:t xml:space="preserve"> to inappropriate distance metrics. A flat RDM, one in which constellations barely vary across noise coordinates, is itself a diagnostic signature of </w:t>
-      </w:r>
-      <w:proofErr w:type="gramStart"/>
-      <w:r>
-        <w:rPr>
-          <w:rFonts w:ascii="Helvetica" w:hAnsi="Helvetica" w:cs="Helvetica"/>
-          <w:sz w:val="21"/>
-          <w:szCs w:val="21"/>
-        </w:rPr>
-        <w:t>many-to-one</w:t>
-      </w:r>
-      <w:proofErr w:type="gramEnd"/>
-      <w:r>
-        <w:rPr>
-          <w:rFonts w:ascii="Helvetica" w:hAnsi="Helvetica" w:cs="Helvetica"/>
-          <w:sz w:val="21"/>
-          <w:szCs w:val="21"/>
-        </w:rPr>
-        <w:t xml:space="preserve"> compression, bearing directly on pipeline invertibility (Section 7.7).</w:t>
-      </w:r>
-    </w:p>
-    <w:p>
-      <w:pPr>
-        <w:pStyle w:val="NormalWeb"/>
-        <w:rPr>
-          <w:rFonts w:ascii="Helvetica" w:hAnsi="Helvetica" w:cs="Helvetica"/>
-          <w:sz w:val="21"/>
-          <w:szCs w:val="21"/>
-        </w:rPr>
-      </w:pPr>
-      <w:r>
-        <w:rPr>
-          <w:rFonts w:ascii="Helvetica" w:hAnsi="Helvetica" w:cs="Helvetica"/>
-          <w:sz w:val="21"/>
-          <w:szCs w:val="21"/>
-        </w:rPr>
-        <w:t xml:space="preserve">RSA </w:t>
-      </w:r>
-      <w:proofErr w:type="gramStart"/>
-      <w:r>
-        <w:rPr>
-          <w:rFonts w:ascii="Helvetica" w:hAnsi="Helvetica" w:cs="Helvetica"/>
-          <w:sz w:val="21"/>
-          <w:szCs w:val="21"/>
-        </w:rPr>
-        <w:t>is treated</w:t>
-      </w:r>
-      <w:proofErr w:type="gramEnd"/>
-      <w:r>
-        <w:rPr>
-          <w:rFonts w:ascii="Helvetica" w:hAnsi="Helvetica" w:cs="Helvetica"/>
-          <w:sz w:val="21"/>
-          <w:szCs w:val="21"/>
-        </w:rPr>
-        <w:t xml:space="preserve"> as exploratory supplementary analysis by default. Where first-order metrics leave scenario transition boundaries ambiguous, RSA may </w:t>
-      </w:r>
-      <w:proofErr w:type="gramStart"/>
-      <w:r>
-        <w:rPr>
-          <w:rFonts w:ascii="Helvetica" w:hAnsi="Helvetica" w:cs="Helvetica"/>
-          <w:sz w:val="21"/>
-          <w:szCs w:val="21"/>
-        </w:rPr>
-        <w:t>be recruited</w:t>
-      </w:r>
-      <w:proofErr w:type="gramEnd"/>
-      <w:r>
-        <w:rPr>
-          <w:rFonts w:ascii="Helvetica" w:hAnsi="Helvetica" w:cs="Helvetica"/>
-          <w:sz w:val="21"/>
-          <w:szCs w:val="21"/>
-        </w:rPr>
-        <w:t xml:space="preserve"> to carry interpretive weight with as </w:t>
-      </w:r>
-      <w:r>
-        <w:rPr>
-          <w:rFonts w:ascii="Helvetica" w:hAnsi="Helvetica" w:cs="Helvetica"/>
-          <w:sz w:val="21"/>
-          <w:szCs w:val="21"/>
-        </w:rPr>
-        <w:t>specified</w:t>
-      </w:r>
-      <w:r>
-        <w:rPr>
-          <w:rFonts w:ascii="Helvetica" w:hAnsi="Helvetica" w:cs="Helvetica"/>
-          <w:sz w:val="21"/>
-          <w:szCs w:val="21"/>
-        </w:rPr>
-        <w:t xml:space="preserve"> above. </w:t>
-      </w:r>
-    </w:p>
-    <w:p>
-      <w:pPr>
-        <w:pStyle w:val="NormalWeb"/>
-        <w:rPr>
-          <w:rFonts w:ascii="Helvetica" w:hAnsi="Helvetica" w:cs="Helvetica"/>
-          <w:sz w:val="21"/>
-          <w:szCs w:val="21"/>
-        </w:rPr>
-      </w:pPr>
-      <w:r>
-        <w:rPr>
-          <w:rStyle w:val="Strong"/>
-          <w:rFonts w:ascii="Helvetica" w:hAnsi="Helvetica" w:cs="Helvetica"/>
-          <w:sz w:val="21"/>
-          <w:szCs w:val="21"/>
-        </w:rPr>
         <w:t>Step 4: Framework Validation Assessment</w:t>
       </w:r>
     </w:p>
@@ -22061,25 +20609,7 @@
           <w:sz w:val="21"/>
           <w:szCs w:val="21"/>
         </w:rPr>
-        <w:t xml:space="preserve"> to </w:t>
-      </w:r>
-      <w:proofErr w:type="gramStart"/>
-      <w:r>
-        <w:rPr>
-          <w:rFonts w:ascii="Helvetica" w:hAnsi="Helvetica" w:cs="Helvetica"/>
-          <w:sz w:val="21"/>
-          <w:szCs w:val="21"/>
-        </w:rPr>
-        <w:t>be reported</w:t>
-      </w:r>
-      <w:proofErr w:type="gramEnd"/>
-      <w:r>
-        <w:rPr>
-          <w:rFonts w:ascii="Helvetica" w:hAnsi="Helvetica" w:cs="Helvetica"/>
-          <w:sz w:val="21"/>
-          <w:szCs w:val="21"/>
-        </w:rPr>
-        <w:t xml:space="preserve"> but do not gate this classification; they are supplementary </w:t>
+        <w:t xml:space="preserve"> to be reported but do not gate this classification; they are supplementary </w:t>
       </w:r>
       <w:r>
         <w:rPr>
@@ -22213,7 +20743,6 @@
           <w:sz w:val="21"/>
           <w:szCs w:val="21"/>
         </w:rPr>
-        <w:lastRenderedPageBreak/>
         <w:t>Framework refinement</w:t>
       </w:r>
       <w:r>
@@ -22432,6 +20961,7 @@
           <w:sz w:val="21"/>
           <w:szCs w:val="21"/>
         </w:rPr>
+        <w:lastRenderedPageBreak/>
         <w:t>Validation summary</w:t>
       </w:r>
       <w:r>
@@ -22472,25 +21002,7 @@
           <w:sz w:val="21"/>
           <w:szCs w:val="21"/>
         </w:rPr>
-        <w:t xml:space="preserve">When the simulation accurately characterises pipeline behaviour (validation metrics indicate good agreement), and a simulated pipeline exhibits systematic bias that is consistent across repetitions (i.e., |mean(bias)| </w:t>
-      </w:r>
-      <w:proofErr w:type="gramStart"/>
-      <w:r>
-        <w:rPr>
-          <w:rFonts w:ascii="Helvetica" w:hAnsi="Helvetica" w:cs="Helvetica"/>
-          <w:sz w:val="21"/>
-          <w:szCs w:val="21"/>
-        </w:rPr>
-        <w:t>substantially exceeds</w:t>
-      </w:r>
-      <w:proofErr w:type="gramEnd"/>
-      <w:r>
-        <w:rPr>
-          <w:rFonts w:ascii="Helvetica" w:hAnsi="Helvetica" w:cs="Helvetica"/>
-          <w:sz w:val="21"/>
-          <w:szCs w:val="21"/>
-        </w:rPr>
-        <w:t xml:space="preserve"> SEM), this creates a potential secondary application: employing simulation-derived bias estimates to adjust empirical </w:t>
+        <w:t xml:space="preserve">When the simulation accurately characterises pipeline behaviour (validation metrics indicate good agreement), and a simulated pipeline exhibits systematic bias that is consistent across repetitions (i.e., |mean(bias)| substantially exceeds SEM), this creates a potential secondary application: employing simulation-derived bias estimates to adjust empirical </w:t>
       </w:r>
       <w:r>
         <w:rPr>
@@ -22553,25 +21065,7 @@
           <w:sz w:val="21"/>
           <w:szCs w:val="21"/>
         </w:rPr>
-        <w:t xml:space="preserve">Correction will </w:t>
-      </w:r>
-      <w:proofErr w:type="gramStart"/>
-      <w:r>
-        <w:rPr>
-          <w:rFonts w:ascii="Helvetica" w:hAnsi="Helvetica" w:cs="Helvetica"/>
-          <w:sz w:val="21"/>
-          <w:szCs w:val="21"/>
-        </w:rPr>
-        <w:t>likely need</w:t>
-      </w:r>
-      <w:proofErr w:type="gramEnd"/>
-      <w:r>
-        <w:rPr>
-          <w:rFonts w:ascii="Helvetica" w:hAnsi="Helvetica" w:cs="Helvetica"/>
-          <w:sz w:val="21"/>
-          <w:szCs w:val="21"/>
-        </w:rPr>
-        <w:t xml:space="preserve"> to operate at the individual trial level rather than participant. The correction workflow would therefore proceed as follows:</w:t>
+        <w:t>Correction will likely need to operate at the individual trial level rather than participant. The correction workflow would therefore proceed as follows:</w:t>
       </w:r>
     </w:p>
     <w:p>
@@ -22965,7 +21459,6 @@
         </w:rPr>
         <w:t xml:space="preserve">The simulation constructs a forward mapping from generator to recovered values. Correction, however, requires the </w:t>
       </w:r>
-      <w:proofErr w:type="gramStart"/>
       <w:r>
         <w:rPr>
           <w:rStyle w:val="Emphasis"/>
@@ -22981,16 +21474,7 @@
           <w:sz w:val="21"/>
           <w:szCs w:val="21"/>
         </w:rPr>
-        <w:t>:</w:t>
-      </w:r>
-      <w:proofErr w:type="gramEnd"/>
-      <w:r>
-        <w:rPr>
-          <w:rFonts w:ascii="Helvetica" w:hAnsi="Helvetica" w:cs="Helvetica"/>
-          <w:sz w:val="21"/>
-          <w:szCs w:val="21"/>
-        </w:rPr>
-        <w:t xml:space="preserve"> given observable quantities (</w:t>
+        <w:t>: given observable quantities (</w:t>
       </w:r>
       <w:r>
         <w:rPr>
@@ -23077,7 +21561,6 @@
           <w:sz w:val="21"/>
           <w:szCs w:val="21"/>
         </w:rPr>
-        <w:lastRenderedPageBreak/>
         <w:t>β</w:t>
       </w:r>
       <w:r>
@@ -23213,36 +21696,12 @@
           <w:sz w:val="21"/>
           <w:szCs w:val="21"/>
         </w:rPr>
-        <w:t xml:space="preserve">values toward approximately 0.33 - may create </w:t>
-      </w:r>
-      <w:proofErr w:type="gramStart"/>
+        <w:t>values toward approximately 0.33 - may create many-to-one mappings that cannot be cleanly inverted. The same</w:t>
+      </w:r>
       <w:r>
         <w:rPr>
           <w:rStyle w:val="Emphasis"/>
           <w:rFonts w:ascii="Helvetica" w:hAnsi="Helvetica" w:cs="Helvetica"/>
-          <w:i w:val="0"/>
-          <w:iCs w:val="0"/>
-          <w:sz w:val="21"/>
-          <w:szCs w:val="21"/>
-        </w:rPr>
-        <w:t>many-to-one</w:t>
-      </w:r>
-      <w:proofErr w:type="gramEnd"/>
-      <w:r>
-        <w:rPr>
-          <w:rStyle w:val="Emphasis"/>
-          <w:rFonts w:ascii="Helvetica" w:hAnsi="Helvetica" w:cs="Helvetica"/>
-          <w:i w:val="0"/>
-          <w:iCs w:val="0"/>
-          <w:sz w:val="21"/>
-          <w:szCs w:val="21"/>
-        </w:rPr>
-        <w:t xml:space="preserve"> mappings that cannot be cleanly inverted. The same</w:t>
-      </w:r>
-      <w:r>
-        <w:rPr>
-          <w:rStyle w:val="Emphasis"/>
-          <w:rFonts w:ascii="Helvetica" w:hAnsi="Helvetica" w:cs="Helvetica"/>
           <w:sz w:val="21"/>
           <w:szCs w:val="21"/>
         </w:rPr>
@@ -23342,25 +21801,7 @@
           <w:sz w:val="21"/>
           <w:szCs w:val="21"/>
         </w:rPr>
-        <w:t xml:space="preserve">Pipeline utility therefore requires not merely low SEM but also invertibility. Cleanly invertible pipelines - those approaching identity mapping between generator and recovered values - confer </w:t>
-      </w:r>
-      <w:proofErr w:type="gramStart"/>
-      <w:r>
-        <w:rPr>
-          <w:rFonts w:ascii="Helvetica" w:hAnsi="Helvetica" w:cs="Helvetica"/>
-          <w:sz w:val="21"/>
-          <w:szCs w:val="21"/>
-        </w:rPr>
-        <w:t>several</w:t>
-      </w:r>
-      <w:proofErr w:type="gramEnd"/>
-      <w:r>
-        <w:rPr>
-          <w:rFonts w:ascii="Helvetica" w:hAnsi="Helvetica" w:cs="Helvetica"/>
-          <w:sz w:val="21"/>
-          <w:szCs w:val="21"/>
-        </w:rPr>
-        <w:t xml:space="preserve"> advantages:</w:t>
+        <w:t>Pipeline utility therefore requires not merely low SEM but also invertibility. Cleanly invertible pipelines - those approaching identity mapping between generator and recovered values - confer several advantages:</w:t>
       </w:r>
     </w:p>
     <w:p>
@@ -23485,25 +21926,7 @@
           <w:sz w:val="21"/>
           <w:szCs w:val="21"/>
         </w:rPr>
-        <w:t xml:space="preserve">| may </w:t>
-      </w:r>
-      <w:proofErr w:type="gramStart"/>
-      <w:r>
-        <w:rPr>
-          <w:rFonts w:ascii="Helvetica" w:hAnsi="Helvetica" w:cs="Helvetica"/>
-          <w:sz w:val="21"/>
-          <w:szCs w:val="21"/>
-        </w:rPr>
-        <w:t>substantially exceed</w:t>
-      </w:r>
-      <w:proofErr w:type="gramEnd"/>
-      <w:r>
-        <w:rPr>
-          <w:rFonts w:ascii="Helvetica" w:hAnsi="Helvetica" w:cs="Helvetica"/>
-          <w:sz w:val="21"/>
-          <w:szCs w:val="21"/>
-        </w:rPr>
-        <w:t xml:space="preserve"> 0.03</w:t>
+        <w:t>| may substantially exceed 0.03</w:t>
       </w:r>
     </w:p>
     <w:p>
@@ -23543,6 +21966,7 @@
           <w:sz w:val="21"/>
           <w:szCs w:val="21"/>
         </w:rPr>
+        <w:lastRenderedPageBreak/>
         <w:t>The simulation framework will have characterised mapping monotonicity for each pipeline across parameter space, identifying regions where inversion remains well-posed versus regions exhibiting degeneracy.</w:t>
       </w:r>
     </w:p>
@@ -23614,25 +22038,7 @@
           <w:sz w:val="21"/>
           <w:szCs w:val="21"/>
         </w:rPr>
-        <w:t xml:space="preserve">) may themselves require estimation from recovered (processed simulated) trajectories rather than referring to the known values added to the coordinates. Noise </w:t>
-      </w:r>
-      <w:proofErr w:type="gramStart"/>
-      <w:r>
-        <w:rPr>
-          <w:rFonts w:ascii="Helvetica" w:hAnsi="Helvetica" w:cs="Helvetica"/>
-          <w:sz w:val="21"/>
-          <w:szCs w:val="21"/>
-        </w:rPr>
-        <w:t>is added</w:t>
-      </w:r>
-      <w:proofErr w:type="gramEnd"/>
-      <w:r>
-        <w:rPr>
-          <w:rFonts w:ascii="Helvetica" w:hAnsi="Helvetica" w:cs="Helvetica"/>
-          <w:sz w:val="21"/>
-          <w:szCs w:val="21"/>
-        </w:rPr>
-        <w:t xml:space="preserve"> in x and y coordinates independently, the aggregate kinematic quantities (velocity, curvature) may transform this noise in pipeline-dependent fashion. This may necessitate applying pmtm to simulation outputs, thereby characterising </w:t>
+        <w:t xml:space="preserve">) may themselves require estimation from recovered (processed simulated) trajectories rather than referring to the known values added to the coordinates. Noise is added in x and y coordinates independently, the aggregate kinematic quantities (velocity, curvature) may transform this noise in pipeline-dependent fashion. This may necessitate applying pmtm to simulation outputs, thereby characterising </w:t>
       </w:r>
       <w:r>
         <w:rPr>
@@ -23649,25 +22055,7 @@
           <w:sz w:val="21"/>
           <w:szCs w:val="21"/>
         </w:rPr>
-        <w:t xml:space="preserve"> noise profiles and enabling lookup by quantities observable </w:t>
-      </w:r>
-      <w:proofErr w:type="gramStart"/>
-      <w:r>
-        <w:rPr>
-          <w:rFonts w:ascii="Helvetica" w:hAnsi="Helvetica" w:cs="Helvetica"/>
-          <w:sz w:val="21"/>
-          <w:szCs w:val="21"/>
-        </w:rPr>
-        <w:t>subsequent to</w:t>
-      </w:r>
-      <w:proofErr w:type="gramEnd"/>
-      <w:r>
-        <w:rPr>
-          <w:rFonts w:ascii="Helvetica" w:hAnsi="Helvetica" w:cs="Helvetica"/>
-          <w:sz w:val="21"/>
-          <w:szCs w:val="21"/>
-        </w:rPr>
-        <w:t xml:space="preserve"> pipeline application.</w:t>
+        <w:t xml:space="preserve"> noise profiles and enabling lookup by quantities observable subsequent to pipeline application.</w:t>
       </w:r>
     </w:p>
     <w:p>
@@ -23730,25 +22118,7 @@
           <w:sz w:val="21"/>
           <w:szCs w:val="21"/>
         </w:rPr>
-        <w:t xml:space="preserve">Pipeline exhibits invertible mapping (assessed via simulation; </w:t>
-      </w:r>
-      <w:proofErr w:type="gramStart"/>
-      <w:r>
-        <w:rPr>
-          <w:rFonts w:ascii="Helvetica" w:hAnsi="Helvetica" w:cs="Helvetica"/>
-          <w:sz w:val="21"/>
-          <w:szCs w:val="21"/>
-        </w:rPr>
-        <w:t>near-monotonic</w:t>
-      </w:r>
-      <w:proofErr w:type="gramEnd"/>
-      <w:r>
-        <w:rPr>
-          <w:rFonts w:ascii="Helvetica" w:hAnsi="Helvetica" w:cs="Helvetica"/>
-          <w:sz w:val="21"/>
-          <w:szCs w:val="21"/>
-        </w:rPr>
-        <w:t xml:space="preserve"> </w:t>
+        <w:t xml:space="preserve">Pipeline exhibits invertible mapping (assessed via simulation; near-monotonic </w:t>
       </w:r>
       <w:r>
         <w:rPr>
@@ -23814,25 +22184,7 @@
           <w:sz w:val="21"/>
           <w:szCs w:val="21"/>
         </w:rPr>
-        <w:t xml:space="preserve">Systematic bias </w:t>
-      </w:r>
-      <w:proofErr w:type="gramStart"/>
-      <w:r>
-        <w:rPr>
-          <w:rFonts w:ascii="Helvetica" w:hAnsi="Helvetica" w:cs="Helvetica"/>
-          <w:sz w:val="21"/>
-          <w:szCs w:val="21"/>
-        </w:rPr>
-        <w:t>substantially exceeds</w:t>
-      </w:r>
-      <w:proofErr w:type="gramEnd"/>
-      <w:r>
-        <w:rPr>
-          <w:rFonts w:ascii="Helvetica" w:hAnsi="Helvetica" w:cs="Helvetica"/>
-          <w:sz w:val="21"/>
-          <w:szCs w:val="21"/>
-        </w:rPr>
-        <w:t xml:space="preserve"> random error (SEM)</w:t>
+        <w:t>Systematic bias substantially exceeds random error (SEM)</w:t>
       </w:r>
     </w:p>
     <w:p>
@@ -24061,129 +22413,93 @@
           <w:sz w:val="21"/>
           <w:szCs w:val="21"/>
         </w:rPr>
+        <w:t>Clear contraindications where correction proves inappropriate (non-invertible pipelines, excessive SEM, heterogeneous noise within participant)</w:t>
+      </w:r>
+    </w:p>
+    <w:p>
+      <w:pPr>
+        <w:pStyle w:val="NormalWeb"/>
+        <w:rPr>
+          <w:rFonts w:ascii="Helvetica" w:hAnsi="Helvetica" w:cs="Helvetica"/>
+          <w:sz w:val="21"/>
+          <w:szCs w:val="21"/>
+        </w:rPr>
+      </w:pPr>
+      <w:r>
+        <w:rPr>
+          <w:rFonts w:ascii="Helvetica" w:hAnsi="Helvetica" w:cs="Helvetica"/>
+          <w:sz w:val="21"/>
+          <w:szCs w:val="21"/>
+        </w:rPr>
+        <w:t>This correction framework may enhance clinical sensitivity when detecting subtle kinematic differences between populations. Observed |Δ</w:t>
+      </w:r>
+      <w:r>
+        <w:rPr>
+          <w:rFonts w:ascii="Helvetica" w:hAnsi="Helvetica" w:cs="Helvetica"/>
+          <w:i/>
+          <w:sz w:val="21"/>
+          <w:szCs w:val="21"/>
+        </w:rPr>
+        <w:t>β</w:t>
+      </w:r>
+      <w:r>
+        <w:rPr>
+          <w:rFonts w:ascii="Helvetica" w:hAnsi="Helvetica" w:cs="Helvetica"/>
+          <w:sz w:val="21"/>
+          <w:szCs w:val="21"/>
+        </w:rPr>
+        <w:t>| = 0.03 between autistic and neurotypical groups may reflect compressed values; correction via invertible pipelines could reveal larger true population differences. However, corrections address systematic bias rather than improving fundamental measurement precision. If a pipeline exhibits high SEM (&gt; 0.011), correction cannot salvage inadequate measurement quality; if a pipeline proves non-invertible, correction remains indeterminate regardless of SEM.</w:t>
+      </w:r>
+    </w:p>
+    <w:p>
+      <w:pPr>
+        <w:pStyle w:val="NormalWeb"/>
+        <w:rPr>
+          <w:rFonts w:ascii="Helvetica" w:hAnsi="Helvetica" w:cs="Helvetica"/>
+          <w:sz w:val="21"/>
+          <w:szCs w:val="21"/>
+        </w:rPr>
+      </w:pPr>
+      <w:r>
+        <w:rPr>
+          <w:rStyle w:val="Strong"/>
+          <w:rFonts w:ascii="Helvetica" w:hAnsi="Helvetica" w:cs="Helvetica"/>
+          <w:sz w:val="21"/>
+          <w:szCs w:val="21"/>
+        </w:rPr>
+        <w:t>Relationship to structural validation (Section 7.5):</w:t>
+      </w:r>
+    </w:p>
+    <w:p>
+      <w:pPr>
+        <w:pStyle w:val="NormalWeb"/>
+        <w:rPr>
+          <w:rFonts w:ascii="Helvetica" w:hAnsi="Helvetica" w:cs="Helvetica"/>
+          <w:sz w:val="21"/>
+          <w:szCs w:val="21"/>
+        </w:rPr>
+      </w:pPr>
+      <w:r>
+        <w:rPr>
+          <w:rFonts w:ascii="Helvetica" w:hAnsi="Helvetica" w:cs="Helvetica"/>
+          <w:sz w:val="21"/>
+          <w:szCs w:val="21"/>
+        </w:rPr>
+        <w:t>Structural validation via RSA assesses whether the simulation's forward model faithfully captures the topology of pipeline behaviour across parameter space. This is necessary but insufficient for correction: accurately predicting many-to-one compression does not render it invertible. The validation framework therefore operates on two orthogonal axes: (i) forward model accuracy, assessed by first-order metrics (CCC, MAE) for magnitude fidelity and second-order metrics (Mantel test) for topological fidelity; and (ii) pipeline invertibility, assessed by mapping monotonicity. Both must be satisfied before bias correction can be applied.</w:t>
+      </w:r>
+    </w:p>
+    <w:p>
+      <w:pPr>
+        <w:pStyle w:val="Heading2"/>
+        <w:rPr>
+          <w:rFonts w:ascii="Helvetica" w:eastAsia="Times New Roman" w:hAnsi="Helvetica" w:cs="Helvetica"/>
+        </w:rPr>
+      </w:pPr>
+      <w:r>
+        <w:rPr>
+          <w:rFonts w:ascii="Helvetica" w:eastAsia="Times New Roman" w:hAnsi="Helvetica" w:cs="Helvetica"/>
+        </w:rPr>
         <w:lastRenderedPageBreak/>
-        <w:t>Clear contraindications where correction proves inappropriate (non-invertible pipelines, excessive SEM, heterogeneous noise within participant)</w:t>
-      </w:r>
-    </w:p>
-    <w:p>
-      <w:pPr>
-        <w:pStyle w:val="NormalWeb"/>
-        <w:rPr>
-          <w:rFonts w:ascii="Helvetica" w:hAnsi="Helvetica" w:cs="Helvetica"/>
-          <w:sz w:val="21"/>
-          <w:szCs w:val="21"/>
-        </w:rPr>
-      </w:pPr>
-      <w:r>
-        <w:rPr>
-          <w:rFonts w:ascii="Helvetica" w:hAnsi="Helvetica" w:cs="Helvetica"/>
-          <w:sz w:val="21"/>
-          <w:szCs w:val="21"/>
-        </w:rPr>
-        <w:t>This correction framework may enhance clinical sensitivity when detecting subtle kinematic differences between populations. Observed |Δ</w:t>
-      </w:r>
-      <w:r>
-        <w:rPr>
-          <w:rFonts w:ascii="Helvetica" w:hAnsi="Helvetica" w:cs="Helvetica"/>
-          <w:i/>
-          <w:sz w:val="21"/>
-          <w:szCs w:val="21"/>
-        </w:rPr>
-        <w:t>β</w:t>
-      </w:r>
-      <w:r>
-        <w:rPr>
-          <w:rFonts w:ascii="Helvetica" w:hAnsi="Helvetica" w:cs="Helvetica"/>
-          <w:sz w:val="21"/>
-          <w:szCs w:val="21"/>
-        </w:rPr>
-        <w:t>| = 0.03 between autistic and neurotypical groups may reflect compressed values; correction via invertible pipelines could reveal larger true population differences. However, corrections address systematic bias rather than improving fundamental measurement precision. If a pipeline exhibits high SEM (&gt; 0.011), correction cannot salvage inadequate measurement quality; if a pipeline proves non-invertible, correction remains indeterminate regardless of SEM.</w:t>
-      </w:r>
-    </w:p>
-    <w:p>
-      <w:pPr>
-        <w:pStyle w:val="NormalWeb"/>
-        <w:rPr>
-          <w:rFonts w:ascii="Helvetica" w:hAnsi="Helvetica" w:cs="Helvetica"/>
-          <w:sz w:val="21"/>
-          <w:szCs w:val="21"/>
-        </w:rPr>
-      </w:pPr>
-      <w:r>
-        <w:rPr>
-          <w:rStyle w:val="Strong"/>
-          <w:rFonts w:ascii="Helvetica" w:hAnsi="Helvetica" w:cs="Helvetica"/>
-          <w:sz w:val="21"/>
-          <w:szCs w:val="21"/>
-        </w:rPr>
-        <w:t>Relationship to structural validation (Section 7.5):</w:t>
-      </w:r>
-    </w:p>
-    <w:p>
-      <w:pPr>
-        <w:pStyle w:val="NormalWeb"/>
-        <w:rPr>
-          <w:rFonts w:ascii="Helvetica" w:hAnsi="Helvetica" w:cs="Helvetica"/>
-          <w:sz w:val="21"/>
-          <w:szCs w:val="21"/>
-        </w:rPr>
-      </w:pPr>
-      <w:r>
-        <w:rPr>
-          <w:rFonts w:ascii="Helvetica" w:hAnsi="Helvetica" w:cs="Helvetica"/>
-          <w:sz w:val="21"/>
-          <w:szCs w:val="21"/>
-        </w:rPr>
-        <w:t xml:space="preserve">Structural validation via RSA assesses whether the simulation's forward model faithfully captures the topology of pipeline behaviour across parameter space. This is necessary but insufficient for correction: accurately predicting </w:t>
-      </w:r>
-      <w:proofErr w:type="gramStart"/>
-      <w:r>
-        <w:rPr>
-          <w:rFonts w:ascii="Helvetica" w:hAnsi="Helvetica" w:cs="Helvetica"/>
-          <w:sz w:val="21"/>
-          <w:szCs w:val="21"/>
-        </w:rPr>
-        <w:t>many-to-one</w:t>
-      </w:r>
-      <w:proofErr w:type="gramEnd"/>
-      <w:r>
-        <w:rPr>
-          <w:rFonts w:ascii="Helvetica" w:hAnsi="Helvetica" w:cs="Helvetica"/>
-          <w:sz w:val="21"/>
-          <w:szCs w:val="21"/>
-        </w:rPr>
-        <w:t xml:space="preserve"> compression does not render it invertible. The validation framework therefore operates on two orthogonal axes: (i) forward model accuracy, assessed by first-order metrics (CCC, MAE) for magnitude fidelity and second-order metrics (Mantel test) for topological fidelity; and (ii) pipeline invertibility, assessed by mapping monotonicity. Both must be satisfied before bias correction can </w:t>
-      </w:r>
-      <w:proofErr w:type="gramStart"/>
-      <w:r>
-        <w:rPr>
-          <w:rFonts w:ascii="Helvetica" w:hAnsi="Helvetica" w:cs="Helvetica"/>
-          <w:sz w:val="21"/>
-          <w:szCs w:val="21"/>
-        </w:rPr>
-        <w:t>be applied</w:t>
-      </w:r>
-      <w:proofErr w:type="gramEnd"/>
-      <w:r>
-        <w:rPr>
-          <w:rFonts w:ascii="Helvetica" w:hAnsi="Helvetica" w:cs="Helvetica"/>
-          <w:sz w:val="21"/>
-          <w:szCs w:val="21"/>
-        </w:rPr>
-        <w:t>.</w:t>
-      </w:r>
-    </w:p>
-    <w:p>
-      <w:pPr>
-        <w:pStyle w:val="Heading2"/>
-        <w:rPr>
-          <w:rFonts w:ascii="Helvetica" w:eastAsia="Times New Roman" w:hAnsi="Helvetica" w:cs="Helvetica"/>
-        </w:rPr>
-      </w:pPr>
-      <w:r>
-        <w:rPr>
-          <w:rFonts w:ascii="Helvetica" w:eastAsia="Times New Roman" w:hAnsi="Helvetica" w:cs="Helvetica"/>
-        </w:rPr>
         <w:t>8. Expected Outcomes and Deliverables</w:t>
       </w:r>
     </w:p>
@@ -24714,25 +23030,7 @@
                 <w:sz w:val="21"/>
                 <w:szCs w:val="21"/>
               </w:rPr>
-              <w:t xml:space="preserve">Robust regression may </w:t>
-            </w:r>
-            <w:proofErr w:type="gramStart"/>
-            <w:r>
-              <w:rPr>
-                <w:rFonts w:ascii="Helvetica" w:eastAsia="Times New Roman" w:hAnsi="Helvetica" w:cs="Helvetica"/>
-                <w:sz w:val="21"/>
-                <w:szCs w:val="21"/>
-              </w:rPr>
-              <w:t>substantially compensate</w:t>
-            </w:r>
-            <w:proofErr w:type="gramEnd"/>
-            <w:r>
-              <w:rPr>
-                <w:rFonts w:ascii="Helvetica" w:eastAsia="Times New Roman" w:hAnsi="Helvetica" w:cs="Helvetica"/>
-                <w:sz w:val="21"/>
-                <w:szCs w:val="21"/>
-              </w:rPr>
-              <w:t xml:space="preserve"> for BWFD artefacts</w:t>
+              <w:t>Robust regression may substantially compensate for BWFD artefacts</w:t>
             </w:r>
           </w:p>
         </w:tc>
@@ -25064,7 +23362,6 @@
                 <w:sz w:val="21"/>
                 <w:szCs w:val="21"/>
               </w:rPr>
-              <w:lastRenderedPageBreak/>
               <w:t>Within SG methods</w:t>
             </w:r>
           </w:p>
@@ -25241,25 +23538,7 @@
           <w:sz w:val="21"/>
           <w:szCs w:val="21"/>
         </w:rPr>
-        <w:t xml:space="preserve"> Does IRLS provide meaningful advantage over LMLS when kinematic derivation is already optimal? If SG-LMLS ≈ SG-IRLS, the simpler (faster) LMLS may </w:t>
-      </w:r>
-      <w:proofErr w:type="gramStart"/>
-      <w:r>
-        <w:rPr>
-          <w:rFonts w:ascii="Helvetica" w:hAnsi="Helvetica" w:cs="Helvetica"/>
-          <w:sz w:val="21"/>
-          <w:szCs w:val="21"/>
-        </w:rPr>
-        <w:t>be preferred</w:t>
-      </w:r>
-      <w:proofErr w:type="gramEnd"/>
-      <w:r>
-        <w:rPr>
-          <w:rFonts w:ascii="Helvetica" w:hAnsi="Helvetica" w:cs="Helvetica"/>
-          <w:sz w:val="21"/>
-          <w:szCs w:val="21"/>
-        </w:rPr>
-        <w:t xml:space="preserve"> with SG.</w:t>
+        <w:t xml:space="preserve"> Does IRLS provide meaningful advantage over LMLS when kinematic derivation is already optimal? If SG-LMLS ≈ SG-IRLS, the simpler (faster) LMLS may be preferred with SG.</w:t>
       </w:r>
     </w:p>
     <w:p>
@@ -25347,6 +23626,7 @@
           <w:sz w:val="21"/>
           <w:szCs w:val="21"/>
         </w:rPr>
+        <w:lastRenderedPageBreak/>
         <w:t>Noise-Specific Expectations:</w:t>
       </w:r>
     </w:p>
@@ -25601,25 +23881,7 @@
           <w:sz w:val="21"/>
           <w:szCs w:val="21"/>
         </w:rPr>
-        <w:t xml:space="preserve">SG-based pipelines </w:t>
-      </w:r>
-      <w:proofErr w:type="gramStart"/>
-      <w:r>
-        <w:rPr>
-          <w:rFonts w:ascii="Helvetica" w:hAnsi="Helvetica" w:cs="Helvetica"/>
-          <w:sz w:val="21"/>
-          <w:szCs w:val="21"/>
-        </w:rPr>
-        <w:t>are expected</w:t>
-      </w:r>
-      <w:proofErr w:type="gramEnd"/>
-      <w:r>
-        <w:rPr>
-          <w:rFonts w:ascii="Helvetica" w:hAnsi="Helvetica" w:cs="Helvetica"/>
-          <w:sz w:val="21"/>
-          <w:szCs w:val="21"/>
-        </w:rPr>
-        <w:t xml:space="preserve"> to maintain better VGF consistency (lower SEM) across measurement repetitions</w:t>
+        <w:t>SG-based pipelines are expected to maintain better VGF consistency (lower SEM) across measurement repetitions</w:t>
       </w:r>
     </w:p>
     <w:p>
@@ -25651,25 +23913,7 @@
           <w:sz w:val="21"/>
           <w:szCs w:val="21"/>
         </w:rPr>
-        <w:t xml:space="preserve">The component-wise framework enables pipeline selection mix and match, which will allow prior work to </w:t>
-      </w:r>
-      <w:proofErr w:type="gramStart"/>
-      <w:r>
-        <w:rPr>
-          <w:rFonts w:ascii="Helvetica" w:hAnsi="Helvetica" w:cs="Helvetica"/>
-          <w:sz w:val="21"/>
-          <w:szCs w:val="21"/>
-        </w:rPr>
-        <w:t>be evaluated</w:t>
-      </w:r>
-      <w:proofErr w:type="gramEnd"/>
-      <w:r>
-        <w:rPr>
-          <w:rFonts w:ascii="Helvetica" w:hAnsi="Helvetica" w:cs="Helvetica"/>
-          <w:sz w:val="21"/>
-          <w:szCs w:val="21"/>
-        </w:rPr>
-        <w:t xml:space="preserve"> against the characterised parameter space.</w:t>
+        <w:t>The component-wise framework enables pipeline selection mix and match, which will allow prior work to be evaluated against the characterised parameter space.</w:t>
       </w:r>
     </w:p>
     <w:p>
@@ -25711,7 +23955,6 @@
           <w:sz w:val="21"/>
           <w:szCs w:val="21"/>
         </w:rPr>
-        <w:lastRenderedPageBreak/>
         <w:t>Pipeline selection matrix:</w:t>
       </w:r>
       <w:r>
@@ -25874,25 +24117,7 @@
           <w:sz w:val="21"/>
           <w:szCs w:val="21"/>
         </w:rPr>
-        <w:t xml:space="preserve"> SEM contours for each of </w:t>
-      </w:r>
-      <w:proofErr w:type="gramStart"/>
-      <w:r>
-        <w:rPr>
-          <w:rFonts w:ascii="Helvetica" w:hAnsi="Helvetica" w:cs="Helvetica"/>
-          <w:sz w:val="21"/>
-          <w:szCs w:val="21"/>
-        </w:rPr>
-        <w:t>6</w:t>
-      </w:r>
-      <w:proofErr w:type="gramEnd"/>
-      <w:r>
-        <w:rPr>
-          <w:rFonts w:ascii="Helvetica" w:hAnsi="Helvetica" w:cs="Helvetica"/>
-          <w:sz w:val="21"/>
-          <w:szCs w:val="21"/>
-        </w:rPr>
-        <w:t xml:space="preserve"> pipelines across parameter space</w:t>
+        <w:t xml:space="preserve"> SEM contours for each of 6 pipelines across parameter space</w:t>
       </w:r>
     </w:p>
     <w:p>
@@ -26011,6 +24236,7 @@
           <w:sz w:val="21"/>
           <w:szCs w:val="21"/>
         </w:rPr>
+        <w:lastRenderedPageBreak/>
         <w:t>Invertibility maps:</w:t>
       </w:r>
       <w:r>
@@ -26296,11 +24522,11 @@
         <w:tblLook w:val="04A0" w:firstRow="1" w:lastRow="0" w:firstColumn="1" w:lastColumn="0" w:noHBand="0" w:noVBand="1"/>
       </w:tblPr>
       <w:tblGrid>
-        <w:gridCol w:w="2274"/>
+        <w:gridCol w:w="2278"/>
         <w:gridCol w:w="1896"/>
         <w:gridCol w:w="916"/>
         <w:gridCol w:w="1039"/>
-        <w:gridCol w:w="2885"/>
+        <w:gridCol w:w="2881"/>
       </w:tblGrid>
       <w:tr>
         <w:trPr>
@@ -27394,7 +25620,6 @@
           <w:sz w:val="21"/>
           <w:szCs w:val="21"/>
         </w:rPr>
-        <w:lastRenderedPageBreak/>
         <w:t>This investigation provides the first systematic, component-wise characterisation of velocity-curvature power law analytical approaches across comprehensive parameter space for both primary (</w:t>
       </w:r>
       <w:r>
@@ -27412,25 +25637,7 @@
           <w:sz w:val="21"/>
           <w:szCs w:val="21"/>
         </w:rPr>
-        <w:t xml:space="preserve">) and secondary (VGF) parameter recovery. By decomposing bundled protocols into their constituent components and </w:t>
-      </w:r>
-      <w:proofErr w:type="gramStart"/>
-      <w:r>
-        <w:rPr>
-          <w:rFonts w:ascii="Helvetica" w:hAnsi="Helvetica" w:cs="Helvetica"/>
-          <w:sz w:val="21"/>
-          <w:szCs w:val="21"/>
-        </w:rPr>
-        <w:t>testing</w:t>
-      </w:r>
-      <w:proofErr w:type="gramEnd"/>
-      <w:r>
-        <w:rPr>
-          <w:rFonts w:ascii="Helvetica" w:hAnsi="Helvetica" w:cs="Helvetica"/>
-          <w:sz w:val="21"/>
-          <w:szCs w:val="21"/>
-        </w:rPr>
-        <w:t xml:space="preserve"> all combinations, we enable:</w:t>
+        <w:t>) and secondary (VGF) parameter recovery. By decomposing bundled protocols into their constituent components and testing all combinations, we enable:</w:t>
       </w:r>
     </w:p>
     <w:p>
@@ -27590,6 +25797,7 @@
           <w:sz w:val="21"/>
           <w:szCs w:val="21"/>
         </w:rPr>
+        <w:lastRenderedPageBreak/>
         <w:t>The optional bias correction framework (Section 7.7) provides a methodological pathway for improving measurement accuracy when simulation accurately predicts empirical pipeline behaviour. However, correction can only address systematic bias, not inadequate measurement precision (high SEM). Pipelines must first achieve SEM &lt; 0.011 in their uncorrected form to be suitable for clinical applications.</w:t>
       </w:r>
     </w:p>
@@ -27608,25 +25816,7 @@
           <w:sz w:val="21"/>
           <w:szCs w:val="21"/>
         </w:rPr>
-        <w:t xml:space="preserve">The framework extends beyond autism applications to any research requiring </w:t>
-      </w:r>
-      <w:proofErr w:type="gramStart"/>
-      <w:r>
-        <w:rPr>
-          <w:rFonts w:ascii="Helvetica" w:hAnsi="Helvetica" w:cs="Helvetica"/>
-          <w:sz w:val="21"/>
-          <w:szCs w:val="21"/>
-        </w:rPr>
-        <w:t>reliable</w:t>
-      </w:r>
-      <w:proofErr w:type="gramEnd"/>
-      <w:r>
-        <w:rPr>
-          <w:rFonts w:ascii="Helvetica" w:hAnsi="Helvetica" w:cs="Helvetica"/>
-          <w:sz w:val="21"/>
-          <w:szCs w:val="21"/>
-        </w:rPr>
-        <w:t xml:space="preserve"> </w:t>
+        <w:t xml:space="preserve">The framework extends beyond autism applications to any research requiring reliable </w:t>
       </w:r>
       <w:r>
         <w:rPr>
@@ -27925,7 +26115,6 @@
           <w:sz w:val="21"/>
           <w:szCs w:val="21"/>
         </w:rPr>
-        <w:lastRenderedPageBreak/>
         <w:t>Week 10:</w:t>
       </w:r>
       <w:r>
@@ -27934,25 +26123,7 @@
           <w:sz w:val="21"/>
           <w:szCs w:val="21"/>
         </w:rPr>
-        <w:t xml:space="preserve"> Stage 5 empirical validation - Noise characterisation across </w:t>
-      </w:r>
-      <w:proofErr w:type="gramStart"/>
-      <w:r>
-        <w:rPr>
-          <w:rFonts w:ascii="Helvetica" w:hAnsi="Helvetica" w:cs="Helvetica"/>
-          <w:sz w:val="21"/>
-          <w:szCs w:val="21"/>
-        </w:rPr>
-        <w:t>7</w:t>
-      </w:r>
-      <w:proofErr w:type="gramEnd"/>
-      <w:r>
-        <w:rPr>
-          <w:rFonts w:ascii="Helvetica" w:hAnsi="Helvetica" w:cs="Helvetica"/>
-          <w:sz w:val="21"/>
-          <w:szCs w:val="21"/>
-        </w:rPr>
-        <w:t xml:space="preserve"> databases (pmtm spectral analysis) - Pipeline application (all 6 pipelines to all databases) - SEM calculation and scenario classification - Constellation comparison using appropriate validation metrics - Bias correction applicability assessment</w:t>
+        <w:t xml:space="preserve"> Stage 5 empirical validation - Noise characterisation across 7 databases (pmtm spectral analysis) - Pipeline application (all 6 pipelines to all databases) - SEM calculation and scenario classification - Constellation comparison using appropriate validation metrics - Bias correction applicability assessment</w:t>
       </w:r>
     </w:p>
     <w:p>
@@ -28055,25 +26226,7 @@
           <w:sz w:val="21"/>
           <w:szCs w:val="21"/>
         </w:rPr>
-        <w:t xml:space="preserve">Full factorial results database (all </w:t>
-      </w:r>
-      <w:proofErr w:type="gramStart"/>
-      <w:r>
-        <w:rPr>
-          <w:rFonts w:ascii="Helvetica" w:hAnsi="Helvetica" w:cs="Helvetica"/>
-          <w:sz w:val="21"/>
-          <w:szCs w:val="21"/>
-        </w:rPr>
-        <w:t>6</w:t>
-      </w:r>
-      <w:proofErr w:type="gramEnd"/>
-      <w:r>
-        <w:rPr>
-          <w:rFonts w:ascii="Helvetica" w:hAnsi="Helvetica" w:cs="Helvetica"/>
-          <w:sz w:val="21"/>
-          <w:szCs w:val="21"/>
-        </w:rPr>
-        <w:t xml:space="preserve"> pipelines)</w:t>
+        <w:t>Full factorial results database (all 6 pipelines)</w:t>
       </w:r>
     </w:p>
     <w:p>
@@ -28095,6 +26248,7 @@
           <w:sz w:val="21"/>
           <w:szCs w:val="21"/>
         </w:rPr>
+        <w:lastRenderedPageBreak/>
         <w:t>Component-wise analysis scripts</w:t>
       </w:r>
     </w:p>
@@ -28523,7 +26677,7 @@
         </w:rPr>
         <w:t xml:space="preserve">, 10(7), 571–578. </w:t>
       </w:r>
-      <w:hyperlink r:id="rId10" w:history="1">
+      <w:hyperlink r:id="rId11" w:history="1">
         <w:r>
           <w:rPr>
             <w:rStyle w:val="Hyperlink"/>
@@ -28577,7 +26731,7 @@
         </w:rPr>
         <w:t xml:space="preserve">, 136(9), 2816–2824. </w:t>
       </w:r>
-      <w:hyperlink r:id="rId11" w:history="1">
+      <w:hyperlink r:id="rId12" w:history="1">
         <w:r>
           <w:rPr>
             <w:rStyle w:val="Hyperlink"/>
@@ -28612,7 +26766,6 @@
           <w:sz w:val="21"/>
           <w:szCs w:val="21"/>
         </w:rPr>
-        <w:lastRenderedPageBreak/>
         <w:t xml:space="preserve">Cook, J. L., Fraser, D. S., Hickman, L. J., Brewer, R., &amp; Huh, D. (2026). The relationship between speed and curvature differs in autistic and non-autistic tracing movements. </w:t>
       </w:r>
       <w:r>
@@ -28632,7 +26785,7 @@
         </w:rPr>
         <w:t xml:space="preserve">. </w:t>
       </w:r>
-      <w:hyperlink r:id="rId12" w:history="1">
+      <w:hyperlink r:id="rId13" w:history="1">
         <w:r>
           <w:rPr>
             <w:rStyle w:val="Hyperlink"/>
@@ -28686,7 +26839,7 @@
         </w:rPr>
         <w:t xml:space="preserve">, 31(21), 4727–4737. </w:t>
       </w:r>
-      <w:hyperlink r:id="rId13" w:history="1">
+      <w:hyperlink r:id="rId14" w:history="1">
         <w:r>
           <w:rPr>
             <w:rStyle w:val="Hyperlink"/>
@@ -28740,7 +26893,7 @@
         </w:rPr>
         <w:t xml:space="preserve">, 25(7), 783–793. </w:t>
       </w:r>
-      <w:hyperlink r:id="rId14" w:history="1">
+      <w:hyperlink r:id="rId15" w:history="1">
         <w:r>
           <w:rPr>
             <w:rStyle w:val="Hyperlink"/>
@@ -28794,7 +26947,7 @@
         </w:rPr>
         <w:t xml:space="preserve">, 26(2), 105–109. </w:t>
       </w:r>
-      <w:hyperlink r:id="rId15" w:history="1">
+      <w:hyperlink r:id="rId16" w:history="1">
         <w:r>
           <w:rPr>
             <w:rStyle w:val="Hyperlink"/>
@@ -28838,7 +26991,17 @@
           <w:sz w:val="21"/>
           <w:szCs w:val="21"/>
         </w:rPr>
-        <w:t>Space-time geometries for motion and perception in the brain and the arts</w:t>
+        <w:t xml:space="preserve">Space-time geometries for motion and </w:t>
+      </w:r>
+      <w:r>
+        <w:rPr>
+          <w:rStyle w:val="Emphasis"/>
+          <w:rFonts w:ascii="Helvetica" w:hAnsi="Helvetica" w:cs="Helvetica"/>
+          <w:sz w:val="21"/>
+          <w:szCs w:val="21"/>
+        </w:rPr>
+        <w:lastRenderedPageBreak/>
+        <w:t>perception in the brain and the arts</w:t>
       </w:r>
       <w:r>
         <w:rPr>
@@ -28848,7 +27011,7 @@
         </w:rPr>
         <w:t xml:space="preserve"> (pp. 3–34). Springer. </w:t>
       </w:r>
-      <w:hyperlink r:id="rId16" w:history="1">
+      <w:hyperlink r:id="rId17" w:history="1">
         <w:r>
           <w:rPr>
             <w:rStyle w:val="Hyperlink"/>
@@ -28902,7 +27065,7 @@
         </w:rPr>
         <w:t xml:space="preserve">. </w:t>
       </w:r>
-      <w:hyperlink r:id="rId17" w:history="1">
+      <w:hyperlink r:id="rId18" w:history="1">
         <w:r>
           <w:rPr>
             <w:rStyle w:val="Hyperlink"/>
@@ -28956,7 +27119,7 @@
         </w:rPr>
         <w:t xml:space="preserve">, 243, 107. </w:t>
       </w:r>
-      <w:hyperlink r:id="rId18" w:history="1">
+      <w:hyperlink r:id="rId19" w:history="1">
         <w:r>
           <w:rPr>
             <w:rStyle w:val="Hyperlink"/>
@@ -29010,7 +27173,7 @@
         </w:rPr>
         <w:t xml:space="preserve">, 22, 261–271. </w:t>
       </w:r>
-      <w:hyperlink r:id="rId19" w:history="1">
+      <w:hyperlink r:id="rId20" w:history="1">
         <w:r>
           <w:rPr>
             <w:rStyle w:val="Hyperlink"/>
@@ -29064,7 +27227,7 @@
         </w:rPr>
         <w:t xml:space="preserve">, 86(5), 735–743. </w:t>
       </w:r>
-      <w:hyperlink r:id="rId20" w:history="1">
+      <w:hyperlink r:id="rId21" w:history="1">
         <w:r>
           <w:rPr>
             <w:rStyle w:val="Hyperlink"/>
@@ -29118,7 +27281,7 @@
         </w:rPr>
         <w:t xml:space="preserve">, 474, 115213. </w:t>
       </w:r>
-      <w:hyperlink r:id="rId21" w:history="1">
+      <w:hyperlink r:id="rId22" w:history="1">
         <w:r>
           <w:rPr>
             <w:rStyle w:val="Hyperlink"/>
@@ -29172,7 +27335,7 @@
         </w:rPr>
         <w:t xml:space="preserve">, 18, 8. </w:t>
       </w:r>
-      <w:hyperlink r:id="rId22" w:history="1">
+      <w:hyperlink r:id="rId23" w:history="1">
         <w:r>
           <w:rPr>
             <w:rStyle w:val="Hyperlink"/>
@@ -29226,7 +27389,7 @@
         </w:rPr>
         <w:t xml:space="preserve">, 112(29), E3950–E3958. </w:t>
       </w:r>
-      <w:hyperlink r:id="rId23" w:history="1">
+      <w:hyperlink r:id="rId24" w:history="1">
         <w:r>
           <w:rPr>
             <w:rStyle w:val="Hyperlink"/>
@@ -29297,7 +27460,7 @@
         </w:rPr>
         <w:t xml:space="preserve">, 15(1), e0226393. </w:t>
       </w:r>
-      <w:hyperlink r:id="rId24" w:history="1">
+      <w:hyperlink r:id="rId25" w:history="1">
         <w:r>
           <w:rPr>
             <w:rStyle w:val="Hyperlink"/>
@@ -29351,7 +27514,7 @@
         </w:rPr>
         <w:t xml:space="preserve">, 2, 4. </w:t>
       </w:r>
-      <w:hyperlink r:id="rId25" w:history="1">
+      <w:hyperlink r:id="rId26" w:history="1">
         <w:r>
           <w:rPr>
             <w:rStyle w:val="Hyperlink"/>
@@ -29386,7 +27549,6 @@
           <w:sz w:val="21"/>
           <w:szCs w:val="21"/>
         </w:rPr>
-        <w:lastRenderedPageBreak/>
         <w:t xml:space="preserve">Lacquaniti, F., Terzuolo, C., &amp; Viviani, P. (1983). The law relating the kinematic and figural aspects of drawing movements. </w:t>
       </w:r>
       <w:r>
@@ -29406,7 +27568,7 @@
         </w:rPr>
         <w:t xml:space="preserve">, 54(1–3), 115–130. </w:t>
       </w:r>
-      <w:hyperlink r:id="rId26" w:history="1">
+      <w:hyperlink r:id="rId27" w:history="1">
         <w:r>
           <w:rPr>
             <w:rStyle w:val="Hyperlink"/>
@@ -29476,25 +27638,7 @@
           <w:sz w:val="21"/>
           <w:szCs w:val="21"/>
         </w:rPr>
-        <w:t xml:space="preserve">Legendre, P., Fortin, M.-J., &amp; Borcard, D. (2015). Should the Mantel test </w:t>
-      </w:r>
-      <w:proofErr w:type="gramStart"/>
-      <w:r>
-        <w:rPr>
-          <w:rFonts w:ascii="Helvetica" w:hAnsi="Helvetica" w:cs="Helvetica"/>
-          <w:sz w:val="21"/>
-          <w:szCs w:val="21"/>
-        </w:rPr>
-        <w:t>be used</w:t>
-      </w:r>
-      <w:proofErr w:type="gramEnd"/>
-      <w:r>
-        <w:rPr>
-          <w:rFonts w:ascii="Helvetica" w:hAnsi="Helvetica" w:cs="Helvetica"/>
-          <w:sz w:val="21"/>
-          <w:szCs w:val="21"/>
-        </w:rPr>
-        <w:t xml:space="preserve"> in spatial analysis? </w:t>
+        <w:t xml:space="preserve">Legendre, P., Fortin, M.-J., &amp; Borcard, D. (2015). Should the Mantel test be used in spatial analysis? </w:t>
       </w:r>
       <w:r>
         <w:rPr>
@@ -29513,7 +27657,7 @@
         </w:rPr>
         <w:t xml:space="preserve">, 6(11), 1239–1247. </w:t>
       </w:r>
-      <w:hyperlink r:id="rId27" w:history="1">
+      <w:hyperlink r:id="rId28" w:history="1">
         <w:r>
           <w:rPr>
             <w:rStyle w:val="Hyperlink"/>
@@ -29550,7 +27694,7 @@
         </w:rPr>
         <w:t xml:space="preserve">Lenth, R. V. (2023). emmeans: Estimated Marginal Means, aka Least-Squares Means. R package version 1.8.9. </w:t>
       </w:r>
-      <w:hyperlink r:id="rId28" w:history="1">
+      <w:hyperlink r:id="rId29" w:history="1">
         <w:r>
           <w:rPr>
             <w:rStyle w:val="Hyperlink"/>
@@ -29585,6 +27729,7 @@
           <w:sz w:val="21"/>
           <w:szCs w:val="21"/>
         </w:rPr>
+        <w:lastRenderedPageBreak/>
         <w:t xml:space="preserve">Lin, L. I. (1989). A concordance correlation coefficient to evaluate reproducibility. </w:t>
       </w:r>
       <w:r>
@@ -29604,7 +27749,7 @@
         </w:rPr>
         <w:t xml:space="preserve">, 45(1), 255–268. </w:t>
       </w:r>
-      <w:hyperlink r:id="rId29" w:history="1">
+      <w:hyperlink r:id="rId30" w:history="1">
         <w:r>
           <w:rPr>
             <w:rStyle w:val="Hyperlink"/>
@@ -29639,25 +27784,7 @@
           <w:sz w:val="21"/>
           <w:szCs w:val="21"/>
         </w:rPr>
-        <w:t>Lin, L. I. (</w:t>
-      </w:r>
-      <w:proofErr w:type="gramStart"/>
-      <w:r>
-        <w:rPr>
-          <w:rFonts w:ascii="Helvetica" w:hAnsi="Helvetica" w:cs="Helvetica"/>
-          <w:sz w:val="21"/>
-          <w:szCs w:val="21"/>
-        </w:rPr>
-        <w:t>2000</w:t>
-      </w:r>
-      <w:proofErr w:type="gramEnd"/>
-      <w:r>
-        <w:rPr>
-          <w:rFonts w:ascii="Helvetica" w:hAnsi="Helvetica" w:cs="Helvetica"/>
-          <w:sz w:val="21"/>
-          <w:szCs w:val="21"/>
-        </w:rPr>
-        <w:t xml:space="preserve">). Total deviation index for measuring individual agreement with applications in laboratory performance and bioequivalence. </w:t>
+        <w:t xml:space="preserve">Lin, L. I. (2000). Total deviation index for measuring individual agreement with applications in laboratory performance and bioequivalence. </w:t>
       </w:r>
       <w:r>
         <w:rPr>
@@ -29676,7 +27803,7 @@
         </w:rPr>
         <w:t xml:space="preserve">, 19(2), 255–270. </w:t>
       </w:r>
-      <w:hyperlink r:id="rId30" w:history="1">
+      <w:hyperlink r:id="rId31" w:history="1">
         <w:r>
           <w:rPr>
             <w:rStyle w:val="Hyperlink"/>
@@ -29730,7 +27857,7 @@
         </w:rPr>
         <w:t xml:space="preserve">, 6, 8. </w:t>
       </w:r>
-      <w:hyperlink r:id="rId31" w:history="1">
+      <w:hyperlink r:id="rId32" w:history="1">
         <w:r>
           <w:rPr>
             <w:rStyle w:val="Hyperlink"/>
@@ -29784,7 +27911,7 @@
         </w:rPr>
         <w:t xml:space="preserve">, 19(195), 20220480. </w:t>
       </w:r>
-      <w:hyperlink r:id="rId32" w:history="1">
+      <w:hyperlink r:id="rId33" w:history="1">
         <w:r>
           <w:rPr>
             <w:rStyle w:val="Hyperlink"/>
@@ -29838,7 +27965,7 @@
         </w:rPr>
         <w:t xml:space="preserve">, 18, 851–858. </w:t>
       </w:r>
-      <w:hyperlink r:id="rId33" w:history="1">
+      <w:hyperlink r:id="rId34" w:history="1">
         <w:r>
           <w:rPr>
             <w:rStyle w:val="Hyperlink"/>
@@ -29873,25 +28000,7 @@
           <w:sz w:val="21"/>
           <w:szCs w:val="21"/>
         </w:rPr>
-        <w:t xml:space="preserve">Matić, A. (2022). Angular speed should </w:t>
-      </w:r>
-      <w:proofErr w:type="gramStart"/>
-      <w:r>
-        <w:rPr>
-          <w:rFonts w:ascii="Helvetica" w:hAnsi="Helvetica" w:cs="Helvetica"/>
-          <w:sz w:val="21"/>
-          <w:szCs w:val="21"/>
-        </w:rPr>
-        <w:t>be avoided</w:t>
-      </w:r>
-      <w:proofErr w:type="gramEnd"/>
-      <w:r>
-        <w:rPr>
-          <w:rFonts w:ascii="Helvetica" w:hAnsi="Helvetica" w:cs="Helvetica"/>
-          <w:sz w:val="21"/>
-          <w:szCs w:val="21"/>
-        </w:rPr>
-        <w:t xml:space="preserve"> when assessing the speed-curvature power law of movement. </w:t>
+        <w:t xml:space="preserve">Matić, A. (2022). Angular speed should be avoided when assessing the speed-curvature power law of movement. </w:t>
       </w:r>
       <w:r>
         <w:rPr>
@@ -29910,7 +28019,7 @@
         </w:rPr>
         <w:t xml:space="preserve">. </w:t>
       </w:r>
-      <w:hyperlink r:id="rId34" w:history="1">
+      <w:hyperlink r:id="rId35" w:history="1">
         <w:r>
           <w:rPr>
             <w:rStyle w:val="Hyperlink"/>
@@ -29999,7 +28108,7 @@
         </w:rPr>
         <w:t xml:space="preserve">, 4(2), 133–142. </w:t>
       </w:r>
-      <w:hyperlink r:id="rId35" w:history="1">
+      <w:hyperlink r:id="rId36" w:history="1">
         <w:r>
           <w:rPr>
             <w:rStyle w:val="Hyperlink"/>
@@ -30053,7 +28162,7 @@
         </w:rPr>
         <w:t xml:space="preserve">, 14(134), 20170213. </w:t>
       </w:r>
-      <w:hyperlink r:id="rId36" w:history="1">
+      <w:hyperlink r:id="rId37" w:history="1">
         <w:r>
           <w:rPr>
             <w:rStyle w:val="Hyperlink"/>
@@ -30142,7 +28251,7 @@
         </w:rPr>
         <w:t xml:space="preserve">, 112, 104092. </w:t>
       </w:r>
-      <w:hyperlink r:id="rId37" w:history="1">
+      <w:hyperlink r:id="rId38" w:history="1">
         <w:r>
           <w:rPr>
             <w:rStyle w:val="Hyperlink"/>
@@ -30177,7 +28286,6 @@
           <w:sz w:val="21"/>
           <w:szCs w:val="21"/>
         </w:rPr>
-        <w:lastRenderedPageBreak/>
         <w:t xml:space="preserve">McCoy, E. J., Walden, A. T., &amp; Percival, D. B. (1998). Multitaper spectral estimation of power law processes. </w:t>
       </w:r>
       <w:r>
@@ -30197,7 +28305,7 @@
         </w:rPr>
         <w:t xml:space="preserve">, 46(3), 655–668. </w:t>
       </w:r>
-      <w:hyperlink r:id="rId38" w:history="1">
+      <w:hyperlink r:id="rId39" w:history="1">
         <w:r>
           <w:rPr>
             <w:rStyle w:val="Hyperlink"/>
@@ -30232,25 +28340,7 @@
           <w:sz w:val="21"/>
           <w:szCs w:val="21"/>
         </w:rPr>
-        <w:t xml:space="preserve">Schaal, S., &amp; Sternad, D. (2001). Origins and violations of the </w:t>
-      </w:r>
-      <w:proofErr w:type="gramStart"/>
-      <w:r>
-        <w:rPr>
-          <w:rFonts w:ascii="Helvetica" w:hAnsi="Helvetica" w:cs="Helvetica"/>
-          <w:sz w:val="21"/>
-          <w:szCs w:val="21"/>
-        </w:rPr>
-        <w:t>2/3</w:t>
-      </w:r>
-      <w:proofErr w:type="gramEnd"/>
-      <w:r>
-        <w:rPr>
-          <w:rFonts w:ascii="Helvetica" w:hAnsi="Helvetica" w:cs="Helvetica"/>
-          <w:sz w:val="21"/>
-          <w:szCs w:val="21"/>
-        </w:rPr>
-        <w:t xml:space="preserve"> power law in rhythmic three-dimensional arm movements. </w:t>
+        <w:t xml:space="preserve">Schaal, S., &amp; Sternad, D. (2001). Origins and violations of the 2/3 power law in rhythmic three-dimensional arm movements. </w:t>
       </w:r>
       <w:r>
         <w:rPr>
@@ -30269,7 +28359,7 @@
         </w:rPr>
         <w:t xml:space="preserve">, 136(1), 60–72. </w:t>
       </w:r>
-      <w:hyperlink r:id="rId39" w:history="1">
+      <w:hyperlink r:id="rId40" w:history="1">
         <w:r>
           <w:rPr>
             <w:rStyle w:val="Hyperlink"/>
@@ -30323,7 +28413,7 @@
         </w:rPr>
         <w:t xml:space="preserve">, 103(10), e3780. </w:t>
       </w:r>
-      <w:hyperlink r:id="rId40" w:history="1">
+      <w:hyperlink r:id="rId41" w:history="1">
         <w:r>
           <w:rPr>
             <w:rStyle w:val="Hyperlink"/>
@@ -30377,7 +28467,7 @@
         </w:rPr>
         <w:t xml:space="preserve">, 70(9), 1055–1096. </w:t>
       </w:r>
-      <w:hyperlink r:id="rId41" w:history="1">
+      <w:hyperlink r:id="rId42" w:history="1">
         <w:r>
           <w:rPr>
             <w:rStyle w:val="Hyperlink"/>
@@ -30412,6 +28502,7 @@
           <w:sz w:val="21"/>
           <w:szCs w:val="21"/>
         </w:rPr>
+        <w:lastRenderedPageBreak/>
         <w:t xml:space="preserve">Xu, C. (2019). An easy algorithm to generate colored noise sequences. </w:t>
       </w:r>
       <w:r>
@@ -30431,7 +28522,7 @@
         </w:rPr>
         <w:t xml:space="preserve">, 157(3), 127. </w:t>
       </w:r>
-      <w:hyperlink r:id="rId42" w:history="1">
+      <w:hyperlink r:id="rId43" w:history="1">
         <w:r>
           <w:rPr>
             <w:rStyle w:val="Hyperlink"/>
@@ -30485,7 +28576,7 @@
         </w:rPr>
         <w:t xml:space="preserve">, 92(10), 1887–1894. </w:t>
       </w:r>
-      <w:hyperlink r:id="rId43" w:history="1">
+      <w:hyperlink r:id="rId44" w:history="1">
         <w:r>
           <w:rPr>
             <w:rStyle w:val="Hyperlink"/>
@@ -30539,7 +28630,7 @@
         </w:rPr>
         <w:t xml:space="preserve">, 13, 8264. </w:t>
       </w:r>
-      <w:hyperlink r:id="rId44" w:history="1">
+      <w:hyperlink r:id="rId45" w:history="1">
         <w:r>
           <w:rPr>
             <w:rStyle w:val="Hyperlink"/>
@@ -30560,12 +28651,12 @@
       </w:r>
     </w:p>
     <w:sectPr>
-      <w:headerReference w:type="even" r:id="rId45"/>
-      <w:headerReference w:type="default" r:id="rId46"/>
-      <w:footerReference w:type="even" r:id="rId47"/>
-      <w:footerReference w:type="default" r:id="rId48"/>
-      <w:headerReference w:type="first" r:id="rId49"/>
-      <w:footerReference w:type="first" r:id="rId50"/>
+      <w:headerReference w:type="even" r:id="rId46"/>
+      <w:headerReference w:type="default" r:id="rId47"/>
+      <w:footerReference w:type="even" r:id="rId48"/>
+      <w:footerReference w:type="default" r:id="rId49"/>
+      <w:headerReference w:type="first" r:id="rId50"/>
+      <w:footerReference w:type="first" r:id="rId51"/>
       <w:pgSz w:w="11906" w:h="16838"/>
       <w:pgMar w:top="1440" w:right="1440" w:bottom="1440" w:left="1440" w:header="708" w:footer="708" w:gutter="0"/>
       <w:cols w:space="708"/>
@@ -30576,7 +28667,7 @@
 </file>
 
 <file path=word/endnotes.xml><?xml version="1.0" encoding="utf-8"?>
-<w:endnotes xmlns:wpc="http://schemas.microsoft.com/office/word/2010/wordprocessingCanvas" xmlns:cx="http://schemas.microsoft.com/office/drawing/2014/chartex" xmlns:cx1="http://schemas.microsoft.com/office/drawing/2015/9/8/chartex" xmlns:cx2="http://schemas.microsoft.com/office/drawing/2015/10/21/chartex" xmlns:cx3="http://schemas.microsoft.com/office/drawing/2016/5/9/chartex" xmlns:cx4="http://schemas.microsoft.com/office/drawing/2016/5/10/chartex" xmlns:cx5="http://schemas.microsoft.com/office/drawing/2016/5/11/chartex" xmlns:cx6="http://schemas.microsoft.com/office/drawing/2016/5/12/chartex" xmlns:cx7="http://schemas.microsoft.com/office/drawing/2016/5/13/chartex" xmlns:cx8="http://schemas.microsoft.com/office/drawing/2016/5/14/chartex" xmlns:mc="http://schemas.openxmlformats.org/markup-compatibility/2006" xmlns:aink="http://schemas.microsoft.com/office/drawing/2016/ink" xmlns:am3d="http://schemas.microsoft.com/office/drawing/2017/model3d" xmlns:o="urn:schemas-microsoft-com:office:office" xmlns:oel="http://schemas.microsoft.com/office/2019/extlst" xmlns:r="http://schemas.openxmlformats.org/officeDocument/2006/relationships" xmlns:m="http://schemas.openxmlformats.org/officeDocument/2006/math" xmlns:v="urn:schemas-microsoft-com:vml" xmlns:wp14="http://schemas.microsoft.com/office/word/2010/wordprocessingDrawing" xmlns:wp="http://schemas.openxmlformats.org/drawingml/2006/wordprocessingDrawing" xmlns:w10="urn:schemas-microsoft-com:office:word" xmlns:w="http://schemas.openxmlformats.org/wordprocessingml/2006/main" xmlns:w14="http://schemas.microsoft.com/office/word/2010/wordml" xmlns:w15="http://schemas.microsoft.com/office/word/2012/wordml" xmlns:w16cex="http://schemas.microsoft.com/office/word/2018/wordml/cex" xmlns:w16cid="http://schemas.microsoft.com/office/word/2016/wordml/cid" xmlns:w16="http://schemas.microsoft.com/office/word/2018/wordml" xmlns:w16du="http://schemas.microsoft.com/office/word/2023/wordml/word16du" xmlns:w16sdtdh="http://schemas.microsoft.com/office/word/2020/wordml/sdtdatahash" xmlns:w16se="http://schemas.microsoft.com/office/word/2015/wordml/symex" xmlns:wpg="http://schemas.microsoft.com/office/word/2010/wordprocessingGroup" xmlns:wpi="http://schemas.microsoft.com/office/word/2010/wordprocessingInk" xmlns:wne="http://schemas.microsoft.com/office/word/2006/wordml" xmlns:wps="http://schemas.microsoft.com/office/word/2010/wordprocessingShape" mc:Ignorable="w14 w15 w16se w16cid w16 w16cex w16sdtdh w16du wp14">
+<w:endnotes xmlns:wpc="http://schemas.microsoft.com/office/word/2010/wordprocessingCanvas" xmlns:cx="http://schemas.microsoft.com/office/drawing/2014/chartex" xmlns:cx1="http://schemas.microsoft.com/office/drawing/2015/9/8/chartex" xmlns:cx2="http://schemas.microsoft.com/office/drawing/2015/10/21/chartex" xmlns:cx3="http://schemas.microsoft.com/office/drawing/2016/5/9/chartex" xmlns:cx4="http://schemas.microsoft.com/office/drawing/2016/5/10/chartex" xmlns:cx5="http://schemas.microsoft.com/office/drawing/2016/5/11/chartex" xmlns:cx6="http://schemas.microsoft.com/office/drawing/2016/5/12/chartex" xmlns:cx7="http://schemas.microsoft.com/office/drawing/2016/5/13/chartex" xmlns:cx8="http://schemas.microsoft.com/office/drawing/2016/5/14/chartex" xmlns:mc="http://schemas.openxmlformats.org/markup-compatibility/2006" xmlns:aink="http://schemas.microsoft.com/office/drawing/2016/ink" xmlns:am3d="http://schemas.microsoft.com/office/drawing/2017/model3d" xmlns:o="urn:schemas-microsoft-com:office:office" xmlns:oel="http://schemas.microsoft.com/office/2019/extlst" xmlns:r="http://schemas.openxmlformats.org/officeDocument/2006/relationships" xmlns:m="http://schemas.openxmlformats.org/officeDocument/2006/math" xmlns:v="urn:schemas-microsoft-com:vml" xmlns:wp14="http://schemas.microsoft.com/office/word/2010/wordprocessingDrawing" xmlns:wp="http://schemas.openxmlformats.org/drawingml/2006/wordprocessingDrawing" xmlns:w10="urn:schemas-microsoft-com:office:word" xmlns:w="http://schemas.openxmlformats.org/wordprocessingml/2006/main" xmlns:w14="http://schemas.microsoft.com/office/word/2010/wordml" xmlns:w15="http://schemas.microsoft.com/office/word/2012/wordml" xmlns:w16cex="http://schemas.microsoft.com/office/word/2018/wordml/cex" xmlns:w16cid="http://schemas.microsoft.com/office/word/2016/wordml/cid" xmlns:w16="http://schemas.microsoft.com/office/word/2018/wordml" xmlns:w16du="http://schemas.microsoft.com/office/word/2023/wordml/word16du" xmlns:w16sdtdh="http://schemas.microsoft.com/office/word/2020/wordml/sdtdatahash" xmlns:w16sdtfl="http://schemas.microsoft.com/office/word/2024/wordml/sdtformatlock" xmlns:w16se="http://schemas.microsoft.com/office/word/2015/wordml/symex" xmlns:wpg="http://schemas.microsoft.com/office/word/2010/wordprocessingGroup" xmlns:wpi="http://schemas.microsoft.com/office/word/2010/wordprocessingInk" xmlns:wne="http://schemas.microsoft.com/office/word/2006/wordml" xmlns:wps="http://schemas.microsoft.com/office/word/2010/wordprocessingShape" mc:Ignorable="w14 w15 w16se w16cid w16 w16cex w16sdtdh w16sdtfl w16du wp14">
   <w:endnote w:type="separator" w:id="-1">
     <w:p>
       <w:r>
@@ -30595,7 +28686,7 @@
 </file>
 
 <file path=word/footer1.xml><?xml version="1.0" encoding="utf-8"?>
-<w:ftr xmlns:wpc="http://schemas.microsoft.com/office/word/2010/wordprocessingCanvas" xmlns:cx="http://schemas.microsoft.com/office/drawing/2014/chartex" xmlns:cx1="http://schemas.microsoft.com/office/drawing/2015/9/8/chartex" xmlns:cx2="http://schemas.microsoft.com/office/drawing/2015/10/21/chartex" xmlns:cx3="http://schemas.microsoft.com/office/drawing/2016/5/9/chartex" xmlns:cx4="http://schemas.microsoft.com/office/drawing/2016/5/10/chartex" xmlns:cx5="http://schemas.microsoft.com/office/drawing/2016/5/11/chartex" xmlns:cx6="http://schemas.microsoft.com/office/drawing/2016/5/12/chartex" xmlns:cx7="http://schemas.microsoft.com/office/drawing/2016/5/13/chartex" xmlns:cx8="http://schemas.microsoft.com/office/drawing/2016/5/14/chartex" xmlns:mc="http://schemas.openxmlformats.org/markup-compatibility/2006" xmlns:aink="http://schemas.microsoft.com/office/drawing/2016/ink" xmlns:am3d="http://schemas.microsoft.com/office/drawing/2017/model3d" xmlns:o="urn:schemas-microsoft-com:office:office" xmlns:oel="http://schemas.microsoft.com/office/2019/extlst" xmlns:r="http://schemas.openxmlformats.org/officeDocument/2006/relationships" xmlns:m="http://schemas.openxmlformats.org/officeDocument/2006/math" xmlns:v="urn:schemas-microsoft-com:vml" xmlns:wp14="http://schemas.microsoft.com/office/word/2010/wordprocessingDrawing" xmlns:wp="http://schemas.openxmlformats.org/drawingml/2006/wordprocessingDrawing" xmlns:w10="urn:schemas-microsoft-com:office:word" xmlns:w="http://schemas.openxmlformats.org/wordprocessingml/2006/main" xmlns:w14="http://schemas.microsoft.com/office/word/2010/wordml" xmlns:w15="http://schemas.microsoft.com/office/word/2012/wordml" xmlns:w16cex="http://schemas.microsoft.com/office/word/2018/wordml/cex" xmlns:w16cid="http://schemas.microsoft.com/office/word/2016/wordml/cid" xmlns:w16="http://schemas.microsoft.com/office/word/2018/wordml" xmlns:w16du="http://schemas.microsoft.com/office/word/2023/wordml/word16du" xmlns:w16sdtdh="http://schemas.microsoft.com/office/word/2020/wordml/sdtdatahash" xmlns:w16se="http://schemas.microsoft.com/office/word/2015/wordml/symex" xmlns:wpg="http://schemas.microsoft.com/office/word/2010/wordprocessingGroup" xmlns:wpi="http://schemas.microsoft.com/office/word/2010/wordprocessingInk" xmlns:wne="http://schemas.microsoft.com/office/word/2006/wordml" xmlns:wps="http://schemas.microsoft.com/office/word/2010/wordprocessingShape" mc:Ignorable="w14 w15 w16se w16cid w16 w16cex w16sdtdh w16du wp14">
+<w:ftr xmlns:wpc="http://schemas.microsoft.com/office/word/2010/wordprocessingCanvas" xmlns:cx="http://schemas.microsoft.com/office/drawing/2014/chartex" xmlns:cx1="http://schemas.microsoft.com/office/drawing/2015/9/8/chartex" xmlns:cx2="http://schemas.microsoft.com/office/drawing/2015/10/21/chartex" xmlns:cx3="http://schemas.microsoft.com/office/drawing/2016/5/9/chartex" xmlns:cx4="http://schemas.microsoft.com/office/drawing/2016/5/10/chartex" xmlns:cx5="http://schemas.microsoft.com/office/drawing/2016/5/11/chartex" xmlns:cx6="http://schemas.microsoft.com/office/drawing/2016/5/12/chartex" xmlns:cx7="http://schemas.microsoft.com/office/drawing/2016/5/13/chartex" xmlns:cx8="http://schemas.microsoft.com/office/drawing/2016/5/14/chartex" xmlns:mc="http://schemas.openxmlformats.org/markup-compatibility/2006" xmlns:aink="http://schemas.microsoft.com/office/drawing/2016/ink" xmlns:am3d="http://schemas.microsoft.com/office/drawing/2017/model3d" xmlns:o="urn:schemas-microsoft-com:office:office" xmlns:oel="http://schemas.microsoft.com/office/2019/extlst" xmlns:r="http://schemas.openxmlformats.org/officeDocument/2006/relationships" xmlns:m="http://schemas.openxmlformats.org/officeDocument/2006/math" xmlns:v="urn:schemas-microsoft-com:vml" xmlns:wp14="http://schemas.microsoft.com/office/word/2010/wordprocessingDrawing" xmlns:wp="http://schemas.openxmlformats.org/drawingml/2006/wordprocessingDrawing" xmlns:w10="urn:schemas-microsoft-com:office:word" xmlns:w="http://schemas.openxmlformats.org/wordprocessingml/2006/main" xmlns:w14="http://schemas.microsoft.com/office/word/2010/wordml" xmlns:w15="http://schemas.microsoft.com/office/word/2012/wordml" xmlns:w16cex="http://schemas.microsoft.com/office/word/2018/wordml/cex" xmlns:w16cid="http://schemas.microsoft.com/office/word/2016/wordml/cid" xmlns:w16="http://schemas.microsoft.com/office/word/2018/wordml" xmlns:w16du="http://schemas.microsoft.com/office/word/2023/wordml/word16du" xmlns:w16sdtdh="http://schemas.microsoft.com/office/word/2020/wordml/sdtdatahash" xmlns:w16sdtfl="http://schemas.microsoft.com/office/word/2024/wordml/sdtformatlock" xmlns:w16se="http://schemas.microsoft.com/office/word/2015/wordml/symex" xmlns:wpg="http://schemas.microsoft.com/office/word/2010/wordprocessingGroup" xmlns:wpi="http://schemas.microsoft.com/office/word/2010/wordprocessingInk" xmlns:wne="http://schemas.microsoft.com/office/word/2006/wordml" xmlns:wps="http://schemas.microsoft.com/office/word/2010/wordprocessingShape" mc:Ignorable="w14 w15 w16se w16cid w16 w16cex w16sdtdh w16sdtfl w16du wp14">
   <w:p>
     <w:pPr>
       <w:pStyle w:val="Footer"/>
@@ -30605,7 +28696,7 @@
 </file>
 
 <file path=word/footer2.xml><?xml version="1.0" encoding="utf-8"?>
-<w:ftr xmlns:wpc="http://schemas.microsoft.com/office/word/2010/wordprocessingCanvas" xmlns:cx="http://schemas.microsoft.com/office/drawing/2014/chartex" xmlns:cx1="http://schemas.microsoft.com/office/drawing/2015/9/8/chartex" xmlns:cx2="http://schemas.microsoft.com/office/drawing/2015/10/21/chartex" xmlns:cx3="http://schemas.microsoft.com/office/drawing/2016/5/9/chartex" xmlns:cx4="http://schemas.microsoft.com/office/drawing/2016/5/10/chartex" xmlns:cx5="http://schemas.microsoft.com/office/drawing/2016/5/11/chartex" xmlns:cx6="http://schemas.microsoft.com/office/drawing/2016/5/12/chartex" xmlns:cx7="http://schemas.microsoft.com/office/drawing/2016/5/13/chartex" xmlns:cx8="http://schemas.microsoft.com/office/drawing/2016/5/14/chartex" xmlns:mc="http://schemas.openxmlformats.org/markup-compatibility/2006" xmlns:aink="http://schemas.microsoft.com/office/drawing/2016/ink" xmlns:am3d="http://schemas.microsoft.com/office/drawing/2017/model3d" xmlns:o="urn:schemas-microsoft-com:office:office" xmlns:oel="http://schemas.microsoft.com/office/2019/extlst" xmlns:r="http://schemas.openxmlformats.org/officeDocument/2006/relationships" xmlns:m="http://schemas.openxmlformats.org/officeDocument/2006/math" xmlns:v="urn:schemas-microsoft-com:vml" xmlns:wp14="http://schemas.microsoft.com/office/word/2010/wordprocessingDrawing" xmlns:wp="http://schemas.openxmlformats.org/drawingml/2006/wordprocessingDrawing" xmlns:w10="urn:schemas-microsoft-com:office:word" xmlns:w="http://schemas.openxmlformats.org/wordprocessingml/2006/main" xmlns:w14="http://schemas.microsoft.com/office/word/2010/wordml" xmlns:w15="http://schemas.microsoft.com/office/word/2012/wordml" xmlns:w16cex="http://schemas.microsoft.com/office/word/2018/wordml/cex" xmlns:w16cid="http://schemas.microsoft.com/office/word/2016/wordml/cid" xmlns:w16="http://schemas.microsoft.com/office/word/2018/wordml" xmlns:w16du="http://schemas.microsoft.com/office/word/2023/wordml/word16du" xmlns:w16sdtdh="http://schemas.microsoft.com/office/word/2020/wordml/sdtdatahash" xmlns:w16se="http://schemas.microsoft.com/office/word/2015/wordml/symex" xmlns:wpg="http://schemas.microsoft.com/office/word/2010/wordprocessingGroup" xmlns:wpi="http://schemas.microsoft.com/office/word/2010/wordprocessingInk" xmlns:wne="http://schemas.microsoft.com/office/word/2006/wordml" xmlns:wps="http://schemas.microsoft.com/office/word/2010/wordprocessingShape" mc:Ignorable="w14 w15 w16se w16cid w16 w16cex w16sdtdh w16du wp14">
+<w:ftr xmlns:wpc="http://schemas.microsoft.com/office/word/2010/wordprocessingCanvas" xmlns:cx="http://schemas.microsoft.com/office/drawing/2014/chartex" xmlns:cx1="http://schemas.microsoft.com/office/drawing/2015/9/8/chartex" xmlns:cx2="http://schemas.microsoft.com/office/drawing/2015/10/21/chartex" xmlns:cx3="http://schemas.microsoft.com/office/drawing/2016/5/9/chartex" xmlns:cx4="http://schemas.microsoft.com/office/drawing/2016/5/10/chartex" xmlns:cx5="http://schemas.microsoft.com/office/drawing/2016/5/11/chartex" xmlns:cx6="http://schemas.microsoft.com/office/drawing/2016/5/12/chartex" xmlns:cx7="http://schemas.microsoft.com/office/drawing/2016/5/13/chartex" xmlns:cx8="http://schemas.microsoft.com/office/drawing/2016/5/14/chartex" xmlns:mc="http://schemas.openxmlformats.org/markup-compatibility/2006" xmlns:aink="http://schemas.microsoft.com/office/drawing/2016/ink" xmlns:am3d="http://schemas.microsoft.com/office/drawing/2017/model3d" xmlns:o="urn:schemas-microsoft-com:office:office" xmlns:oel="http://schemas.microsoft.com/office/2019/extlst" xmlns:r="http://schemas.openxmlformats.org/officeDocument/2006/relationships" xmlns:m="http://schemas.openxmlformats.org/officeDocument/2006/math" xmlns:v="urn:schemas-microsoft-com:vml" xmlns:wp14="http://schemas.microsoft.com/office/word/2010/wordprocessingDrawing" xmlns:wp="http://schemas.openxmlformats.org/drawingml/2006/wordprocessingDrawing" xmlns:w10="urn:schemas-microsoft-com:office:word" xmlns:w="http://schemas.openxmlformats.org/wordprocessingml/2006/main" xmlns:w14="http://schemas.microsoft.com/office/word/2010/wordml" xmlns:w15="http://schemas.microsoft.com/office/word/2012/wordml" xmlns:w16cex="http://schemas.microsoft.com/office/word/2018/wordml/cex" xmlns:w16cid="http://schemas.microsoft.com/office/word/2016/wordml/cid" xmlns:w16="http://schemas.microsoft.com/office/word/2018/wordml" xmlns:w16du="http://schemas.microsoft.com/office/word/2023/wordml/word16du" xmlns:w16sdtdh="http://schemas.microsoft.com/office/word/2020/wordml/sdtdatahash" xmlns:w16sdtfl="http://schemas.microsoft.com/office/word/2024/wordml/sdtformatlock" xmlns:w16se="http://schemas.microsoft.com/office/word/2015/wordml/symex" xmlns:wpg="http://schemas.microsoft.com/office/word/2010/wordprocessingGroup" xmlns:wpi="http://schemas.microsoft.com/office/word/2010/wordprocessingInk" xmlns:wne="http://schemas.microsoft.com/office/word/2006/wordml" xmlns:wps="http://schemas.microsoft.com/office/word/2010/wordprocessingShape" mc:Ignorable="w14 w15 w16se w16cid w16 w16cex w16sdtdh w16sdtfl w16du wp14">
   <w:p>
     <w:pPr>
       <w:pStyle w:val="Footer"/>
@@ -30615,7 +28706,7 @@
 </file>
 
 <file path=word/footer3.xml><?xml version="1.0" encoding="utf-8"?>
-<w:ftr xmlns:wpc="http://schemas.microsoft.com/office/word/2010/wordprocessingCanvas" xmlns:cx="http://schemas.microsoft.com/office/drawing/2014/chartex" xmlns:cx1="http://schemas.microsoft.com/office/drawing/2015/9/8/chartex" xmlns:cx2="http://schemas.microsoft.com/office/drawing/2015/10/21/chartex" xmlns:cx3="http://schemas.microsoft.com/office/drawing/2016/5/9/chartex" xmlns:cx4="http://schemas.microsoft.com/office/drawing/2016/5/10/chartex" xmlns:cx5="http://schemas.microsoft.com/office/drawing/2016/5/11/chartex" xmlns:cx6="http://schemas.microsoft.com/office/drawing/2016/5/12/chartex" xmlns:cx7="http://schemas.microsoft.com/office/drawing/2016/5/13/chartex" xmlns:cx8="http://schemas.microsoft.com/office/drawing/2016/5/14/chartex" xmlns:mc="http://schemas.openxmlformats.org/markup-compatibility/2006" xmlns:aink="http://schemas.microsoft.com/office/drawing/2016/ink" xmlns:am3d="http://schemas.microsoft.com/office/drawing/2017/model3d" xmlns:o="urn:schemas-microsoft-com:office:office" xmlns:oel="http://schemas.microsoft.com/office/2019/extlst" xmlns:r="http://schemas.openxmlformats.org/officeDocument/2006/relationships" xmlns:m="http://schemas.openxmlformats.org/officeDocument/2006/math" xmlns:v="urn:schemas-microsoft-com:vml" xmlns:wp14="http://schemas.microsoft.com/office/word/2010/wordprocessingDrawing" xmlns:wp="http://schemas.openxmlformats.org/drawingml/2006/wordprocessingDrawing" xmlns:w10="urn:schemas-microsoft-com:office:word" xmlns:w="http://schemas.openxmlformats.org/wordprocessingml/2006/main" xmlns:w14="http://schemas.microsoft.com/office/word/2010/wordml" xmlns:w15="http://schemas.microsoft.com/office/word/2012/wordml" xmlns:w16cex="http://schemas.microsoft.com/office/word/2018/wordml/cex" xmlns:w16cid="http://schemas.microsoft.com/office/word/2016/wordml/cid" xmlns:w16="http://schemas.microsoft.com/office/word/2018/wordml" xmlns:w16du="http://schemas.microsoft.com/office/word/2023/wordml/word16du" xmlns:w16sdtdh="http://schemas.microsoft.com/office/word/2020/wordml/sdtdatahash" xmlns:w16se="http://schemas.microsoft.com/office/word/2015/wordml/symex" xmlns:wpg="http://schemas.microsoft.com/office/word/2010/wordprocessingGroup" xmlns:wpi="http://schemas.microsoft.com/office/word/2010/wordprocessingInk" xmlns:wne="http://schemas.microsoft.com/office/word/2006/wordml" xmlns:wps="http://schemas.microsoft.com/office/word/2010/wordprocessingShape" mc:Ignorable="w14 w15 w16se w16cid w16 w16cex w16sdtdh w16du wp14">
+<w:ftr xmlns:wpc="http://schemas.microsoft.com/office/word/2010/wordprocessingCanvas" xmlns:cx="http://schemas.microsoft.com/office/drawing/2014/chartex" xmlns:cx1="http://schemas.microsoft.com/office/drawing/2015/9/8/chartex" xmlns:cx2="http://schemas.microsoft.com/office/drawing/2015/10/21/chartex" xmlns:cx3="http://schemas.microsoft.com/office/drawing/2016/5/9/chartex" xmlns:cx4="http://schemas.microsoft.com/office/drawing/2016/5/10/chartex" xmlns:cx5="http://schemas.microsoft.com/office/drawing/2016/5/11/chartex" xmlns:cx6="http://schemas.microsoft.com/office/drawing/2016/5/12/chartex" xmlns:cx7="http://schemas.microsoft.com/office/drawing/2016/5/13/chartex" xmlns:cx8="http://schemas.microsoft.com/office/drawing/2016/5/14/chartex" xmlns:mc="http://schemas.openxmlformats.org/markup-compatibility/2006" xmlns:aink="http://schemas.microsoft.com/office/drawing/2016/ink" xmlns:am3d="http://schemas.microsoft.com/office/drawing/2017/model3d" xmlns:o="urn:schemas-microsoft-com:office:office" xmlns:oel="http://schemas.microsoft.com/office/2019/extlst" xmlns:r="http://schemas.openxmlformats.org/officeDocument/2006/relationships" xmlns:m="http://schemas.openxmlformats.org/officeDocument/2006/math" xmlns:v="urn:schemas-microsoft-com:vml" xmlns:wp14="http://schemas.microsoft.com/office/word/2010/wordprocessingDrawing" xmlns:wp="http://schemas.openxmlformats.org/drawingml/2006/wordprocessingDrawing" xmlns:w10="urn:schemas-microsoft-com:office:word" xmlns:w="http://schemas.openxmlformats.org/wordprocessingml/2006/main" xmlns:w14="http://schemas.microsoft.com/office/word/2010/wordml" xmlns:w15="http://schemas.microsoft.com/office/word/2012/wordml" xmlns:w16cex="http://schemas.microsoft.com/office/word/2018/wordml/cex" xmlns:w16cid="http://schemas.microsoft.com/office/word/2016/wordml/cid" xmlns:w16="http://schemas.microsoft.com/office/word/2018/wordml" xmlns:w16du="http://schemas.microsoft.com/office/word/2023/wordml/word16du" xmlns:w16sdtdh="http://schemas.microsoft.com/office/word/2020/wordml/sdtdatahash" xmlns:w16sdtfl="http://schemas.microsoft.com/office/word/2024/wordml/sdtformatlock" xmlns:w16se="http://schemas.microsoft.com/office/word/2015/wordml/symex" xmlns:wpg="http://schemas.microsoft.com/office/word/2010/wordprocessingGroup" xmlns:wpi="http://schemas.microsoft.com/office/word/2010/wordprocessingInk" xmlns:wne="http://schemas.microsoft.com/office/word/2006/wordml" xmlns:wps="http://schemas.microsoft.com/office/word/2010/wordprocessingShape" mc:Ignorable="w14 w15 w16se w16cid w16 w16cex w16sdtdh w16sdtfl w16du wp14">
   <w:p>
     <w:pPr>
       <w:pStyle w:val="Footer"/>
@@ -30625,7 +28716,7 @@
 </file>
 
 <file path=word/footnotes.xml><?xml version="1.0" encoding="utf-8"?>
-<w:footnotes xmlns:wpc="http://schemas.microsoft.com/office/word/2010/wordprocessingCanvas" xmlns:cx="http://schemas.microsoft.com/office/drawing/2014/chartex" xmlns:cx1="http://schemas.microsoft.com/office/drawing/2015/9/8/chartex" xmlns:cx2="http://schemas.microsoft.com/office/drawing/2015/10/21/chartex" xmlns:cx3="http://schemas.microsoft.com/office/drawing/2016/5/9/chartex" xmlns:cx4="http://schemas.microsoft.com/office/drawing/2016/5/10/chartex" xmlns:cx5="http://schemas.microsoft.com/office/drawing/2016/5/11/chartex" xmlns:cx6="http://schemas.microsoft.com/office/drawing/2016/5/12/chartex" xmlns:cx7="http://schemas.microsoft.com/office/drawing/2016/5/13/chartex" xmlns:cx8="http://schemas.microsoft.com/office/drawing/2016/5/14/chartex" xmlns:mc="http://schemas.openxmlformats.org/markup-compatibility/2006" xmlns:aink="http://schemas.microsoft.com/office/drawing/2016/ink" xmlns:am3d="http://schemas.microsoft.com/office/drawing/2017/model3d" xmlns:o="urn:schemas-microsoft-com:office:office" xmlns:oel="http://schemas.microsoft.com/office/2019/extlst" xmlns:r="http://schemas.openxmlformats.org/officeDocument/2006/relationships" xmlns:m="http://schemas.openxmlformats.org/officeDocument/2006/math" xmlns:v="urn:schemas-microsoft-com:vml" xmlns:wp14="http://schemas.microsoft.com/office/word/2010/wordprocessingDrawing" xmlns:wp="http://schemas.openxmlformats.org/drawingml/2006/wordprocessingDrawing" xmlns:w10="urn:schemas-microsoft-com:office:word" xmlns:w="http://schemas.openxmlformats.org/wordprocessingml/2006/main" xmlns:w14="http://schemas.microsoft.com/office/word/2010/wordml" xmlns:w15="http://schemas.microsoft.com/office/word/2012/wordml" xmlns:w16cex="http://schemas.microsoft.com/office/word/2018/wordml/cex" xmlns:w16cid="http://schemas.microsoft.com/office/word/2016/wordml/cid" xmlns:w16="http://schemas.microsoft.com/office/word/2018/wordml" xmlns:w16du="http://schemas.microsoft.com/office/word/2023/wordml/word16du" xmlns:w16sdtdh="http://schemas.microsoft.com/office/word/2020/wordml/sdtdatahash" xmlns:w16se="http://schemas.microsoft.com/office/word/2015/wordml/symex" xmlns:wpg="http://schemas.microsoft.com/office/word/2010/wordprocessingGroup" xmlns:wpi="http://schemas.microsoft.com/office/word/2010/wordprocessingInk" xmlns:wne="http://schemas.microsoft.com/office/word/2006/wordml" xmlns:wps="http://schemas.microsoft.com/office/word/2010/wordprocessingShape" mc:Ignorable="w14 w15 w16se w16cid w16 w16cex w16sdtdh w16du wp14">
+<w:footnotes xmlns:wpc="http://schemas.microsoft.com/office/word/2010/wordprocessingCanvas" xmlns:cx="http://schemas.microsoft.com/office/drawing/2014/chartex" xmlns:cx1="http://schemas.microsoft.com/office/drawing/2015/9/8/chartex" xmlns:cx2="http://schemas.microsoft.com/office/drawing/2015/10/21/chartex" xmlns:cx3="http://schemas.microsoft.com/office/drawing/2016/5/9/chartex" xmlns:cx4="http://schemas.microsoft.com/office/drawing/2016/5/10/chartex" xmlns:cx5="http://schemas.microsoft.com/office/drawing/2016/5/11/chartex" xmlns:cx6="http://schemas.microsoft.com/office/drawing/2016/5/12/chartex" xmlns:cx7="http://schemas.microsoft.com/office/drawing/2016/5/13/chartex" xmlns:cx8="http://schemas.microsoft.com/office/drawing/2016/5/14/chartex" xmlns:mc="http://schemas.openxmlformats.org/markup-compatibility/2006" xmlns:aink="http://schemas.microsoft.com/office/drawing/2016/ink" xmlns:am3d="http://schemas.microsoft.com/office/drawing/2017/model3d" xmlns:o="urn:schemas-microsoft-com:office:office" xmlns:oel="http://schemas.microsoft.com/office/2019/extlst" xmlns:r="http://schemas.openxmlformats.org/officeDocument/2006/relationships" xmlns:m="http://schemas.openxmlformats.org/officeDocument/2006/math" xmlns:v="urn:schemas-microsoft-com:vml" xmlns:wp14="http://schemas.microsoft.com/office/word/2010/wordprocessingDrawing" xmlns:wp="http://schemas.openxmlformats.org/drawingml/2006/wordprocessingDrawing" xmlns:w10="urn:schemas-microsoft-com:office:word" xmlns:w="http://schemas.openxmlformats.org/wordprocessingml/2006/main" xmlns:w14="http://schemas.microsoft.com/office/word/2010/wordml" xmlns:w15="http://schemas.microsoft.com/office/word/2012/wordml" xmlns:w16cex="http://schemas.microsoft.com/office/word/2018/wordml/cex" xmlns:w16cid="http://schemas.microsoft.com/office/word/2016/wordml/cid" xmlns:w16="http://schemas.microsoft.com/office/word/2018/wordml" xmlns:w16du="http://schemas.microsoft.com/office/word/2023/wordml/word16du" xmlns:w16sdtdh="http://schemas.microsoft.com/office/word/2020/wordml/sdtdatahash" xmlns:w16sdtfl="http://schemas.microsoft.com/office/word/2024/wordml/sdtformatlock" xmlns:w16se="http://schemas.microsoft.com/office/word/2015/wordml/symex" xmlns:wpg="http://schemas.microsoft.com/office/word/2010/wordprocessingGroup" xmlns:wpi="http://schemas.microsoft.com/office/word/2010/wordprocessingInk" xmlns:wne="http://schemas.microsoft.com/office/word/2006/wordml" xmlns:wps="http://schemas.microsoft.com/office/word/2010/wordprocessingShape" mc:Ignorable="w14 w15 w16se w16cid w16 w16cex w16sdtdh w16sdtfl w16du wp14">
   <w:footnote w:type="separator" w:id="-1">
     <w:p>
       <w:r>
@@ -30644,7 +28735,7 @@
 </file>
 
 <file path=word/header1.xml><?xml version="1.0" encoding="utf-8"?>
-<w:hdr xmlns:wpc="http://schemas.microsoft.com/office/word/2010/wordprocessingCanvas" xmlns:cx="http://schemas.microsoft.com/office/drawing/2014/chartex" xmlns:cx1="http://schemas.microsoft.com/office/drawing/2015/9/8/chartex" xmlns:cx2="http://schemas.microsoft.com/office/drawing/2015/10/21/chartex" xmlns:cx3="http://schemas.microsoft.com/office/drawing/2016/5/9/chartex" xmlns:cx4="http://schemas.microsoft.com/office/drawing/2016/5/10/chartex" xmlns:cx5="http://schemas.microsoft.com/office/drawing/2016/5/11/chartex" xmlns:cx6="http://schemas.microsoft.com/office/drawing/2016/5/12/chartex" xmlns:cx7="http://schemas.microsoft.com/office/drawing/2016/5/13/chartex" xmlns:cx8="http://schemas.microsoft.com/office/drawing/2016/5/14/chartex" xmlns:mc="http://schemas.openxmlformats.org/markup-compatibility/2006" xmlns:aink="http://schemas.microsoft.com/office/drawing/2016/ink" xmlns:am3d="http://schemas.microsoft.com/office/drawing/2017/model3d" xmlns:o="urn:schemas-microsoft-com:office:office" xmlns:oel="http://schemas.microsoft.com/office/2019/extlst" xmlns:r="http://schemas.openxmlformats.org/officeDocument/2006/relationships" xmlns:m="http://schemas.openxmlformats.org/officeDocument/2006/math" xmlns:v="urn:schemas-microsoft-com:vml" xmlns:wp14="http://schemas.microsoft.com/office/word/2010/wordprocessingDrawing" xmlns:wp="http://schemas.openxmlformats.org/drawingml/2006/wordprocessingDrawing" xmlns:w10="urn:schemas-microsoft-com:office:word" xmlns:w="http://schemas.openxmlformats.org/wordprocessingml/2006/main" xmlns:w14="http://schemas.microsoft.com/office/word/2010/wordml" xmlns:w15="http://schemas.microsoft.com/office/word/2012/wordml" xmlns:w16cex="http://schemas.microsoft.com/office/word/2018/wordml/cex" xmlns:w16cid="http://schemas.microsoft.com/office/word/2016/wordml/cid" xmlns:w16="http://schemas.microsoft.com/office/word/2018/wordml" xmlns:w16du="http://schemas.microsoft.com/office/word/2023/wordml/word16du" xmlns:w16sdtdh="http://schemas.microsoft.com/office/word/2020/wordml/sdtdatahash" xmlns:w16se="http://schemas.microsoft.com/office/word/2015/wordml/symex" xmlns:wpg="http://schemas.microsoft.com/office/word/2010/wordprocessingGroup" xmlns:wpi="http://schemas.microsoft.com/office/word/2010/wordprocessingInk" xmlns:wne="http://schemas.microsoft.com/office/word/2006/wordml" xmlns:wps="http://schemas.microsoft.com/office/word/2010/wordprocessingShape" mc:Ignorable="w14 w15 w16se w16cid w16 w16cex w16sdtdh w16du wp14">
+<w:hdr xmlns:wpc="http://schemas.microsoft.com/office/word/2010/wordprocessingCanvas" xmlns:cx="http://schemas.microsoft.com/office/drawing/2014/chartex" xmlns:cx1="http://schemas.microsoft.com/office/drawing/2015/9/8/chartex" xmlns:cx2="http://schemas.microsoft.com/office/drawing/2015/10/21/chartex" xmlns:cx3="http://schemas.microsoft.com/office/drawing/2016/5/9/chartex" xmlns:cx4="http://schemas.microsoft.com/office/drawing/2016/5/10/chartex" xmlns:cx5="http://schemas.microsoft.com/office/drawing/2016/5/11/chartex" xmlns:cx6="http://schemas.microsoft.com/office/drawing/2016/5/12/chartex" xmlns:cx7="http://schemas.microsoft.com/office/drawing/2016/5/13/chartex" xmlns:cx8="http://schemas.microsoft.com/office/drawing/2016/5/14/chartex" xmlns:mc="http://schemas.openxmlformats.org/markup-compatibility/2006" xmlns:aink="http://schemas.microsoft.com/office/drawing/2016/ink" xmlns:am3d="http://schemas.microsoft.com/office/drawing/2017/model3d" xmlns:o="urn:schemas-microsoft-com:office:office" xmlns:oel="http://schemas.microsoft.com/office/2019/extlst" xmlns:r="http://schemas.openxmlformats.org/officeDocument/2006/relationships" xmlns:m="http://schemas.openxmlformats.org/officeDocument/2006/math" xmlns:v="urn:schemas-microsoft-com:vml" xmlns:wp14="http://schemas.microsoft.com/office/word/2010/wordprocessingDrawing" xmlns:wp="http://schemas.openxmlformats.org/drawingml/2006/wordprocessingDrawing" xmlns:w10="urn:schemas-microsoft-com:office:word" xmlns:w="http://schemas.openxmlformats.org/wordprocessingml/2006/main" xmlns:w14="http://schemas.microsoft.com/office/word/2010/wordml" xmlns:w15="http://schemas.microsoft.com/office/word/2012/wordml" xmlns:w16cex="http://schemas.microsoft.com/office/word/2018/wordml/cex" xmlns:w16cid="http://schemas.microsoft.com/office/word/2016/wordml/cid" xmlns:w16="http://schemas.microsoft.com/office/word/2018/wordml" xmlns:w16du="http://schemas.microsoft.com/office/word/2023/wordml/word16du" xmlns:w16sdtdh="http://schemas.microsoft.com/office/word/2020/wordml/sdtdatahash" xmlns:w16sdtfl="http://schemas.microsoft.com/office/word/2024/wordml/sdtformatlock" xmlns:w16se="http://schemas.microsoft.com/office/word/2015/wordml/symex" xmlns:wpg="http://schemas.microsoft.com/office/word/2010/wordprocessingGroup" xmlns:wpi="http://schemas.microsoft.com/office/word/2010/wordprocessingInk" xmlns:wne="http://schemas.microsoft.com/office/word/2006/wordml" xmlns:wps="http://schemas.microsoft.com/office/word/2010/wordprocessingShape" mc:Ignorable="w14 w15 w16se w16cid w16 w16cex w16sdtdh w16sdtfl w16du wp14">
   <w:p>
     <w:pPr>
       <w:pStyle w:val="Header"/>
@@ -30654,7 +28745,7 @@
 </file>
 
 <file path=word/header2.xml><?xml version="1.0" encoding="utf-8"?>
-<w:hdr xmlns:wpc="http://schemas.microsoft.com/office/word/2010/wordprocessingCanvas" xmlns:cx="http://schemas.microsoft.com/office/drawing/2014/chartex" xmlns:cx1="http://schemas.microsoft.com/office/drawing/2015/9/8/chartex" xmlns:cx2="http://schemas.microsoft.com/office/drawing/2015/10/21/chartex" xmlns:cx3="http://schemas.microsoft.com/office/drawing/2016/5/9/chartex" xmlns:cx4="http://schemas.microsoft.com/office/drawing/2016/5/10/chartex" xmlns:cx5="http://schemas.microsoft.com/office/drawing/2016/5/11/chartex" xmlns:cx6="http://schemas.microsoft.com/office/drawing/2016/5/12/chartex" xmlns:cx7="http://schemas.microsoft.com/office/drawing/2016/5/13/chartex" xmlns:cx8="http://schemas.microsoft.com/office/drawing/2016/5/14/chartex" xmlns:mc="http://schemas.openxmlformats.org/markup-compatibility/2006" xmlns:aink="http://schemas.microsoft.com/office/drawing/2016/ink" xmlns:am3d="http://schemas.microsoft.com/office/drawing/2017/model3d" xmlns:o="urn:schemas-microsoft-com:office:office" xmlns:oel="http://schemas.microsoft.com/office/2019/extlst" xmlns:r="http://schemas.openxmlformats.org/officeDocument/2006/relationships" xmlns:m="http://schemas.openxmlformats.org/officeDocument/2006/math" xmlns:v="urn:schemas-microsoft-com:vml" xmlns:wp14="http://schemas.microsoft.com/office/word/2010/wordprocessingDrawing" xmlns:wp="http://schemas.openxmlformats.org/drawingml/2006/wordprocessingDrawing" xmlns:w10="urn:schemas-microsoft-com:office:word" xmlns:w="http://schemas.openxmlformats.org/wordprocessingml/2006/main" xmlns:w14="http://schemas.microsoft.com/office/word/2010/wordml" xmlns:w15="http://schemas.microsoft.com/office/word/2012/wordml" xmlns:w16cex="http://schemas.microsoft.com/office/word/2018/wordml/cex" xmlns:w16cid="http://schemas.microsoft.com/office/word/2016/wordml/cid" xmlns:w16="http://schemas.microsoft.com/office/word/2018/wordml" xmlns:w16du="http://schemas.microsoft.com/office/word/2023/wordml/word16du" xmlns:w16sdtdh="http://schemas.microsoft.com/office/word/2020/wordml/sdtdatahash" xmlns:w16se="http://schemas.microsoft.com/office/word/2015/wordml/symex" xmlns:wpg="http://schemas.microsoft.com/office/word/2010/wordprocessingGroup" xmlns:wpi="http://schemas.microsoft.com/office/word/2010/wordprocessingInk" xmlns:wne="http://schemas.microsoft.com/office/word/2006/wordml" xmlns:wps="http://schemas.microsoft.com/office/word/2010/wordprocessingShape" mc:Ignorable="w14 w15 w16se w16cid w16 w16cex w16sdtdh w16du wp14">
+<w:hdr xmlns:wpc="http://schemas.microsoft.com/office/word/2010/wordprocessingCanvas" xmlns:cx="http://schemas.microsoft.com/office/drawing/2014/chartex" xmlns:cx1="http://schemas.microsoft.com/office/drawing/2015/9/8/chartex" xmlns:cx2="http://schemas.microsoft.com/office/drawing/2015/10/21/chartex" xmlns:cx3="http://schemas.microsoft.com/office/drawing/2016/5/9/chartex" xmlns:cx4="http://schemas.microsoft.com/office/drawing/2016/5/10/chartex" xmlns:cx5="http://schemas.microsoft.com/office/drawing/2016/5/11/chartex" xmlns:cx6="http://schemas.microsoft.com/office/drawing/2016/5/12/chartex" xmlns:cx7="http://schemas.microsoft.com/office/drawing/2016/5/13/chartex" xmlns:cx8="http://schemas.microsoft.com/office/drawing/2016/5/14/chartex" xmlns:mc="http://schemas.openxmlformats.org/markup-compatibility/2006" xmlns:aink="http://schemas.microsoft.com/office/drawing/2016/ink" xmlns:am3d="http://schemas.microsoft.com/office/drawing/2017/model3d" xmlns:o="urn:schemas-microsoft-com:office:office" xmlns:oel="http://schemas.microsoft.com/office/2019/extlst" xmlns:r="http://schemas.openxmlformats.org/officeDocument/2006/relationships" xmlns:m="http://schemas.openxmlformats.org/officeDocument/2006/math" xmlns:v="urn:schemas-microsoft-com:vml" xmlns:wp14="http://schemas.microsoft.com/office/word/2010/wordprocessingDrawing" xmlns:wp="http://schemas.openxmlformats.org/drawingml/2006/wordprocessingDrawing" xmlns:w10="urn:schemas-microsoft-com:office:word" xmlns:w="http://schemas.openxmlformats.org/wordprocessingml/2006/main" xmlns:w14="http://schemas.microsoft.com/office/word/2010/wordml" xmlns:w15="http://schemas.microsoft.com/office/word/2012/wordml" xmlns:w16cex="http://schemas.microsoft.com/office/word/2018/wordml/cex" xmlns:w16cid="http://schemas.microsoft.com/office/word/2016/wordml/cid" xmlns:w16="http://schemas.microsoft.com/office/word/2018/wordml" xmlns:w16du="http://schemas.microsoft.com/office/word/2023/wordml/word16du" xmlns:w16sdtdh="http://schemas.microsoft.com/office/word/2020/wordml/sdtdatahash" xmlns:w16sdtfl="http://schemas.microsoft.com/office/word/2024/wordml/sdtformatlock" xmlns:w16se="http://schemas.microsoft.com/office/word/2015/wordml/symex" xmlns:wpg="http://schemas.microsoft.com/office/word/2010/wordprocessingGroup" xmlns:wpi="http://schemas.microsoft.com/office/word/2010/wordprocessingInk" xmlns:wne="http://schemas.microsoft.com/office/word/2006/wordml" xmlns:wps="http://schemas.microsoft.com/office/word/2010/wordprocessingShape" mc:Ignorable="w14 w15 w16se w16cid w16 w16cex w16sdtdh w16sdtfl w16du wp14">
   <w:p>
     <w:pPr>
       <w:pStyle w:val="Header"/>
@@ -30664,7 +28755,7 @@
 </file>
 
 <file path=word/header3.xml><?xml version="1.0" encoding="utf-8"?>
-<w:hdr xmlns:wpc="http://schemas.microsoft.com/office/word/2010/wordprocessingCanvas" xmlns:cx="http://schemas.microsoft.com/office/drawing/2014/chartex" xmlns:cx1="http://schemas.microsoft.com/office/drawing/2015/9/8/chartex" xmlns:cx2="http://schemas.microsoft.com/office/drawing/2015/10/21/chartex" xmlns:cx3="http://schemas.microsoft.com/office/drawing/2016/5/9/chartex" xmlns:cx4="http://schemas.microsoft.com/office/drawing/2016/5/10/chartex" xmlns:cx5="http://schemas.microsoft.com/office/drawing/2016/5/11/chartex" xmlns:cx6="http://schemas.microsoft.com/office/drawing/2016/5/12/chartex" xmlns:cx7="http://schemas.microsoft.com/office/drawing/2016/5/13/chartex" xmlns:cx8="http://schemas.microsoft.com/office/drawing/2016/5/14/chartex" xmlns:mc="http://schemas.openxmlformats.org/markup-compatibility/2006" xmlns:aink="http://schemas.microsoft.com/office/drawing/2016/ink" xmlns:am3d="http://schemas.microsoft.com/office/drawing/2017/model3d" xmlns:o="urn:schemas-microsoft-com:office:office" xmlns:oel="http://schemas.microsoft.com/office/2019/extlst" xmlns:r="http://schemas.openxmlformats.org/officeDocument/2006/relationships" xmlns:m="http://schemas.openxmlformats.org/officeDocument/2006/math" xmlns:v="urn:schemas-microsoft-com:vml" xmlns:wp14="http://schemas.microsoft.com/office/word/2010/wordprocessingDrawing" xmlns:wp="http://schemas.openxmlformats.org/drawingml/2006/wordprocessingDrawing" xmlns:w10="urn:schemas-microsoft-com:office:word" xmlns:w="http://schemas.openxmlformats.org/wordprocessingml/2006/main" xmlns:w14="http://schemas.microsoft.com/office/word/2010/wordml" xmlns:w15="http://schemas.microsoft.com/office/word/2012/wordml" xmlns:w16cex="http://schemas.microsoft.com/office/word/2018/wordml/cex" xmlns:w16cid="http://schemas.microsoft.com/office/word/2016/wordml/cid" xmlns:w16="http://schemas.microsoft.com/office/word/2018/wordml" xmlns:w16du="http://schemas.microsoft.com/office/word/2023/wordml/word16du" xmlns:w16sdtdh="http://schemas.microsoft.com/office/word/2020/wordml/sdtdatahash" xmlns:w16se="http://schemas.microsoft.com/office/word/2015/wordml/symex" xmlns:wpg="http://schemas.microsoft.com/office/word/2010/wordprocessingGroup" xmlns:wpi="http://schemas.microsoft.com/office/word/2010/wordprocessingInk" xmlns:wne="http://schemas.microsoft.com/office/word/2006/wordml" xmlns:wps="http://schemas.microsoft.com/office/word/2010/wordprocessingShape" mc:Ignorable="w14 w15 w16se w16cid w16 w16cex w16sdtdh w16du wp14">
+<w:hdr xmlns:wpc="http://schemas.microsoft.com/office/word/2010/wordprocessingCanvas" xmlns:cx="http://schemas.microsoft.com/office/drawing/2014/chartex" xmlns:cx1="http://schemas.microsoft.com/office/drawing/2015/9/8/chartex" xmlns:cx2="http://schemas.microsoft.com/office/drawing/2015/10/21/chartex" xmlns:cx3="http://schemas.microsoft.com/office/drawing/2016/5/9/chartex" xmlns:cx4="http://schemas.microsoft.com/office/drawing/2016/5/10/chartex" xmlns:cx5="http://schemas.microsoft.com/office/drawing/2016/5/11/chartex" xmlns:cx6="http://schemas.microsoft.com/office/drawing/2016/5/12/chartex" xmlns:cx7="http://schemas.microsoft.com/office/drawing/2016/5/13/chartex" xmlns:cx8="http://schemas.microsoft.com/office/drawing/2016/5/14/chartex" xmlns:mc="http://schemas.openxmlformats.org/markup-compatibility/2006" xmlns:aink="http://schemas.microsoft.com/office/drawing/2016/ink" xmlns:am3d="http://schemas.microsoft.com/office/drawing/2017/model3d" xmlns:o="urn:schemas-microsoft-com:office:office" xmlns:oel="http://schemas.microsoft.com/office/2019/extlst" xmlns:r="http://schemas.openxmlformats.org/officeDocument/2006/relationships" xmlns:m="http://schemas.openxmlformats.org/officeDocument/2006/math" xmlns:v="urn:schemas-microsoft-com:vml" xmlns:wp14="http://schemas.microsoft.com/office/word/2010/wordprocessingDrawing" xmlns:wp="http://schemas.openxmlformats.org/drawingml/2006/wordprocessingDrawing" xmlns:w10="urn:schemas-microsoft-com:office:word" xmlns:w="http://schemas.openxmlformats.org/wordprocessingml/2006/main" xmlns:w14="http://schemas.microsoft.com/office/word/2010/wordml" xmlns:w15="http://schemas.microsoft.com/office/word/2012/wordml" xmlns:w16cex="http://schemas.microsoft.com/office/word/2018/wordml/cex" xmlns:w16cid="http://schemas.microsoft.com/office/word/2016/wordml/cid" xmlns:w16="http://schemas.microsoft.com/office/word/2018/wordml" xmlns:w16du="http://schemas.microsoft.com/office/word/2023/wordml/word16du" xmlns:w16sdtdh="http://schemas.microsoft.com/office/word/2020/wordml/sdtdatahash" xmlns:w16sdtfl="http://schemas.microsoft.com/office/word/2024/wordml/sdtformatlock" xmlns:w16se="http://schemas.microsoft.com/office/word/2015/wordml/symex" xmlns:wpg="http://schemas.microsoft.com/office/word/2010/wordprocessingGroup" xmlns:wpi="http://schemas.microsoft.com/office/word/2010/wordprocessingInk" xmlns:wne="http://schemas.microsoft.com/office/word/2006/wordml" xmlns:wps="http://schemas.microsoft.com/office/word/2010/wordprocessingShape" mc:Ignorable="w14 w15 w16se w16cid w16 w16cex w16sdtdh w16sdtfl w16du wp14">
   <w:p>
     <w:pPr>
       <w:pStyle w:val="Header"/>
@@ -30674,7 +28765,7 @@
 </file>
 
 <file path=word/numbering.xml><?xml version="1.0" encoding="utf-8"?>
-<w:numbering xmlns:wpc="http://schemas.microsoft.com/office/word/2010/wordprocessingCanvas" xmlns:cx="http://schemas.microsoft.com/office/drawing/2014/chartex" xmlns:cx1="http://schemas.microsoft.com/office/drawing/2015/9/8/chartex" xmlns:cx2="http://schemas.microsoft.com/office/drawing/2015/10/21/chartex" xmlns:cx3="http://schemas.microsoft.com/office/drawing/2016/5/9/chartex" xmlns:cx4="http://schemas.microsoft.com/office/drawing/2016/5/10/chartex" xmlns:cx5="http://schemas.microsoft.com/office/drawing/2016/5/11/chartex" xmlns:cx6="http://schemas.microsoft.com/office/drawing/2016/5/12/chartex" xmlns:cx7="http://schemas.microsoft.com/office/drawing/2016/5/13/chartex" xmlns:cx8="http://schemas.microsoft.com/office/drawing/2016/5/14/chartex" xmlns:mc="http://schemas.openxmlformats.org/markup-compatibility/2006" xmlns:aink="http://schemas.microsoft.com/office/drawing/2016/ink" xmlns:am3d="http://schemas.microsoft.com/office/drawing/2017/model3d" xmlns:o="urn:schemas-microsoft-com:office:office" xmlns:oel="http://schemas.microsoft.com/office/2019/extlst" xmlns:r="http://schemas.openxmlformats.org/officeDocument/2006/relationships" xmlns:m="http://schemas.openxmlformats.org/officeDocument/2006/math" xmlns:v="urn:schemas-microsoft-com:vml" xmlns:wp14="http://schemas.microsoft.com/office/word/2010/wordprocessingDrawing" xmlns:wp="http://schemas.openxmlformats.org/drawingml/2006/wordprocessingDrawing" xmlns:w10="urn:schemas-microsoft-com:office:word" xmlns:w="http://schemas.openxmlformats.org/wordprocessingml/2006/main" xmlns:w14="http://schemas.microsoft.com/office/word/2010/wordml" xmlns:w15="http://schemas.microsoft.com/office/word/2012/wordml" xmlns:w16cex="http://schemas.microsoft.com/office/word/2018/wordml/cex" xmlns:w16cid="http://schemas.microsoft.com/office/word/2016/wordml/cid" xmlns:w16="http://schemas.microsoft.com/office/word/2018/wordml" xmlns:w16du="http://schemas.microsoft.com/office/word/2023/wordml/word16du" xmlns:w16sdtdh="http://schemas.microsoft.com/office/word/2020/wordml/sdtdatahash" xmlns:w16se="http://schemas.microsoft.com/office/word/2015/wordml/symex" xmlns:wpg="http://schemas.microsoft.com/office/word/2010/wordprocessingGroup" xmlns:wpi="http://schemas.microsoft.com/office/word/2010/wordprocessingInk" xmlns:wne="http://schemas.microsoft.com/office/word/2006/wordml" xmlns:wps="http://schemas.microsoft.com/office/word/2010/wordprocessingShape" mc:Ignorable="w14 w15 w16se w16cid w16 w16cex w16sdtdh w16du wp14">
+<w:numbering xmlns:wpc="http://schemas.microsoft.com/office/word/2010/wordprocessingCanvas" xmlns:cx="http://schemas.microsoft.com/office/drawing/2014/chartex" xmlns:cx1="http://schemas.microsoft.com/office/drawing/2015/9/8/chartex" xmlns:cx2="http://schemas.microsoft.com/office/drawing/2015/10/21/chartex" xmlns:cx3="http://schemas.microsoft.com/office/drawing/2016/5/9/chartex" xmlns:cx4="http://schemas.microsoft.com/office/drawing/2016/5/10/chartex" xmlns:cx5="http://schemas.microsoft.com/office/drawing/2016/5/11/chartex" xmlns:cx6="http://schemas.microsoft.com/office/drawing/2016/5/12/chartex" xmlns:cx7="http://schemas.microsoft.com/office/drawing/2016/5/13/chartex" xmlns:cx8="http://schemas.microsoft.com/office/drawing/2016/5/14/chartex" xmlns:mc="http://schemas.openxmlformats.org/markup-compatibility/2006" xmlns:aink="http://schemas.microsoft.com/office/drawing/2016/ink" xmlns:am3d="http://schemas.microsoft.com/office/drawing/2017/model3d" xmlns:o="urn:schemas-microsoft-com:office:office" xmlns:oel="http://schemas.microsoft.com/office/2019/extlst" xmlns:r="http://schemas.openxmlformats.org/officeDocument/2006/relationships" xmlns:m="http://schemas.openxmlformats.org/officeDocument/2006/math" xmlns:v="urn:schemas-microsoft-com:vml" xmlns:wp14="http://schemas.microsoft.com/office/word/2010/wordprocessingDrawing" xmlns:wp="http://schemas.openxmlformats.org/drawingml/2006/wordprocessingDrawing" xmlns:w10="urn:schemas-microsoft-com:office:word" xmlns:w="http://schemas.openxmlformats.org/wordprocessingml/2006/main" xmlns:w14="http://schemas.microsoft.com/office/word/2010/wordml" xmlns:w15="http://schemas.microsoft.com/office/word/2012/wordml" xmlns:w16cex="http://schemas.microsoft.com/office/word/2018/wordml/cex" xmlns:w16cid="http://schemas.microsoft.com/office/word/2016/wordml/cid" xmlns:w16="http://schemas.microsoft.com/office/word/2018/wordml" xmlns:w16du="http://schemas.microsoft.com/office/word/2023/wordml/word16du" xmlns:w16sdtdh="http://schemas.microsoft.com/office/word/2020/wordml/sdtdatahash" xmlns:w16sdtfl="http://schemas.microsoft.com/office/word/2024/wordml/sdtformatlock" xmlns:w16se="http://schemas.microsoft.com/office/word/2015/wordml/symex" xmlns:wpg="http://schemas.microsoft.com/office/word/2010/wordprocessingGroup" xmlns:wpi="http://schemas.microsoft.com/office/word/2010/wordprocessingInk" xmlns:wne="http://schemas.microsoft.com/office/word/2006/wordml" xmlns:wps="http://schemas.microsoft.com/office/word/2010/wordprocessingShape" mc:Ignorable="w14 w15 w16se w16cid w16 w16cex w16sdtdh w16sdtfl w16du wp14">
   <w:abstractNum w:abstractNumId="0" w15:restartNumberingAfterBreak="0">
     <w:nsid w:val="01385F38"/>
     <w:multiLevelType w:val="multilevel"/>
@@ -35951,7 +34042,7 @@
 </file>
 
 <file path=word/styles.xml><?xml version="1.0" encoding="utf-8"?>
-<w:styles xmlns:mc="http://schemas.openxmlformats.org/markup-compatibility/2006" xmlns:r="http://schemas.openxmlformats.org/officeDocument/2006/relationships" xmlns:w="http://schemas.openxmlformats.org/wordprocessingml/2006/main" xmlns:w14="http://schemas.microsoft.com/office/word/2010/wordml" xmlns:w15="http://schemas.microsoft.com/office/word/2012/wordml" xmlns:w16cex="http://schemas.microsoft.com/office/word/2018/wordml/cex" xmlns:w16cid="http://schemas.microsoft.com/office/word/2016/wordml/cid" xmlns:w16="http://schemas.microsoft.com/office/word/2018/wordml" xmlns:w16du="http://schemas.microsoft.com/office/word/2023/wordml/word16du" xmlns:w16sdtdh="http://schemas.microsoft.com/office/word/2020/wordml/sdtdatahash" xmlns:w16se="http://schemas.microsoft.com/office/word/2015/wordml/symex" mc:Ignorable="w14 w15 w16se w16cid w16 w16cex w16sdtdh w16du">
+<w:styles xmlns:mc="http://schemas.openxmlformats.org/markup-compatibility/2006" xmlns:r="http://schemas.openxmlformats.org/officeDocument/2006/relationships" xmlns:w="http://schemas.openxmlformats.org/wordprocessingml/2006/main" xmlns:w14="http://schemas.microsoft.com/office/word/2010/wordml" xmlns:w15="http://schemas.microsoft.com/office/word/2012/wordml" xmlns:w16cex="http://schemas.microsoft.com/office/word/2018/wordml/cex" xmlns:w16cid="http://schemas.microsoft.com/office/word/2016/wordml/cid" xmlns:w16="http://schemas.microsoft.com/office/word/2018/wordml" xmlns:w16du="http://schemas.microsoft.com/office/word/2023/wordml/word16du" xmlns:w16sdtdh="http://schemas.microsoft.com/office/word/2020/wordml/sdtdatahash" xmlns:w16sdtfl="http://schemas.microsoft.com/office/word/2024/wordml/sdtformatlock" xmlns:w16se="http://schemas.microsoft.com/office/word/2015/wordml/symex" mc:Ignorable="w14 w15 w16se w16cid w16 w16cex w16sdtdh w16sdtfl w16du">
   <w:docDefaults>
     <w:rPrDefault>
       <w:rPr>

</xml_diff>